<commit_message>
feat: deepen Unit II explanations and plain-language clarity for M.Phil. readers
</commit_message>
<xml_diff>
--- a/Biological_Foundations_Unit2_Structure_and_Functions_of_Cells.docx
+++ b/Biological_Foundations_Unit2_Structure_and_Functions_of_Cells.docx
@@ -194,7 +194,7 @@
         <w:rPr>
           <w:i/>
         </w:rPr>
-        <w:t>Neurons are the signalling cells that receive, process and pass on information across the whole nervous system.</w:t>
+        <w:t>Neurons are the signalling cells that receive, process and pass on information across the whole nervous system, and because every thought, feeling and behaviour ultimately rests on how these cells fire and connect, they are the natural starting point for a clinical psychologist studying the biology of behaviour.</w:t>
       </w:r>
     </w:p>
     <w:p>
@@ -403,7 +403,7 @@
         <w:t>axon</w:t>
       </w:r>
       <w:r>
-        <w:t xml:space="preserve"> behaves like the wire of an electrical cable, starting at the </w:t>
+        <w:t xml:space="preserve"> behaves like the insulated wire of an electrical cable, starting at the </w:t>
       </w:r>
       <w:r>
         <w:rPr>
@@ -421,7 +421,7 @@
           <w:color w:val="6B4E00"/>
           <w:shd w:val="clear" w:color="auto" w:fill="FFF3D6"/>
         </w:rPr>
-        <w:t>(the cone-shaped base where the axon leaves the soma)</w:t>
+        <w:t>(the cone-shaped base where the axon leaves the soma, which acts as the cell's decision point for whether to fire)</w:t>
       </w:r>
       <w:r>
         <w:t xml:space="preserve"> and carrying the signal away toward another neuron, a muscle or a gland.</w:t>
@@ -450,7 +450,7 @@
           <w:color w:val="6B4E00"/>
           <w:shd w:val="clear" w:color="auto" w:fill="FFF3D6"/>
         </w:rPr>
-        <w:t>(an insulating fatty wrapping around the axon)</w:t>
+        <w:t>(an insulating fatty wrapping around the axon, much like the plastic coating on an electrical wire)</w:t>
       </w:r>
       <w:r>
         <w:t xml:space="preserve"> encloses many axons in segments, and this insulation sharply increases the speed at which nerve impulses travel along the fibre.</w:t>
@@ -737,14 +737,32 @@
           <w:color w:val="6B4E00"/>
           <w:shd w:val="clear" w:color="auto" w:fill="FFF3D6"/>
         </w:rPr>
-        <w:t>(the thin outer skin of the cell)</w:t>
-      </w:r>
-      <w:r>
-        <w:t xml:space="preserve"> and, because they rarely divide once mature, damage to them tends to be long-lasting, which is why neuronal health matters so much for behaviour.</w:t>
+        <w:t>(the thin oily outer skin of the cell that controls what passes in and out)</w:t>
+      </w:r>
+      <w:r>
+        <w:t xml:space="preserve"> and, because they rarely divide once mature, damage to them tends to be long-lasting, which is why neuronal loss in injury or dementia produces such enduring changes in behaviour.</w:t>
       </w:r>
     </w:p>
     <w:p>
       <w:pPr>
+        <w:pStyle w:val="ListNumber"/>
+      </w:pPr>
+      <w:r>
+        <w:t xml:space="preserve">Taken together, a neuron is best understood as an </w:t>
+      </w:r>
+      <w:r>
+        <w:rPr>
+          <w:b/>
+          <w:color w:val="0F2744"/>
+        </w:rPr>
+        <w:t>input-integrate-output device</w:t>
+      </w:r>
+      <w:r>
+        <w:t>: dendrites gather signals, the soma and axon hillock weigh them up, and the axon delivers a single decision onward, so disruption at any one stage can reshape how a person senses, moves, thinks or feels.</w:t>
+      </w:r>
+    </w:p>
+    <w:p>
+      <w:pPr>
         <w:spacing w:after="80"/>
       </w:pPr>
       <w:r>
@@ -988,7 +1006,7 @@
         <w:rPr>
           <w:i/>
         </w:rPr>
-        <w:t>Glial cells are the non-signalling support cells that feed, insulate, defend and hold the nervous system together.</w:t>
+        <w:t>Glial cells are the support cells that feed, insulate, defend and hold the nervous system together, and far from being mere packing, they shape how well neurons signal, which is why glial dysfunction now sits at the centre of our understanding of demyelinating and neurodegenerative disorders a clinical psychologist will meet.</w:t>
       </w:r>
     </w:p>
     <w:p>
@@ -1239,29 +1257,14 @@
         <w:t>(gaps in the insulation)</w:t>
       </w:r>
       <w:r>
-        <w:t>, so myelinated axons conduct far faster than unmyelinated ones and myelin loss impairs reasoning and performance.</w:t>
-      </w:r>
-    </w:p>
-    <w:p>
-      <w:pPr>
-        <w:pStyle w:val="ListNumber"/>
-      </w:pPr>
+        <w:t xml:space="preserve">, so myelinated axons conduct far faster than unmyelinated ones, and when this insulation is stripped away, as in </w:t>
+      </w:r>
       <w:r>
         <w:rPr>
           <w:b/>
           <w:color w:val="0F2744"/>
         </w:rPr>
-        <w:t>Microglia</w:t>
-      </w:r>
-      <w:r>
-        <w:t xml:space="preserve"> are the resident immune cells of the CNS and act as specialised </w:t>
-      </w:r>
-      <w:r>
-        <w:rPr>
-          <w:b/>
-          <w:color w:val="0F2744"/>
-        </w:rPr>
-        <w:t>macrophages</w:t>
+        <w:t>demyelination</w:t>
       </w:r>
       <w:r>
         <w:t xml:space="preserve"> </w:t>
@@ -1272,10 +1275,10 @@
           <w:color w:val="6B4E00"/>
           <w:shd w:val="clear" w:color="auto" w:fill="FFF3D6"/>
         </w:rPr>
-        <w:t>(cells that engulf and digest debris)</w:t>
-      </w:r>
-      <w:r>
-        <w:t>, guarding and supporting neurons throughout the brain and spinal cord.</w:t>
+        <w:t>(loss of the myelin coating, as seen in multiple sclerosis)</w:t>
+      </w:r>
+      <w:r>
+        <w:t>, reasoning, speed of processing and motor performance all decline.</w:t>
       </w:r>
     </w:p>
     <w:p>
@@ -1283,14 +1286,21 @@
         <w:pStyle w:val="ListNumber"/>
       </w:pPr>
       <w:r>
-        <w:t xml:space="preserve">Microglia carry out </w:t>
-      </w:r>
-      <w:r>
         <w:rPr>
           <w:b/>
           <w:color w:val="0F2744"/>
         </w:rPr>
-        <w:t>phagocytosis</w:t>
+        <w:t>Microglia</w:t>
+      </w:r>
+      <w:r>
+        <w:t xml:space="preserve"> are the resident immune cells of the CNS and act as specialised </w:t>
+      </w:r>
+      <w:r>
+        <w:rPr>
+          <w:b/>
+          <w:color w:val="0F2744"/>
+        </w:rPr>
+        <w:t>macrophages</w:t>
       </w:r>
       <w:r>
         <w:t xml:space="preserve"> </w:t>
@@ -1301,10 +1311,10 @@
           <w:color w:val="6B4E00"/>
           <w:shd w:val="clear" w:color="auto" w:fill="FFF3D6"/>
         </w:rPr>
-        <w:t>(swallowing and clearing waste)</w:t>
-      </w:r>
-      <w:r>
-        <w:t>, make up roughly fifteen to seventeen percent of CNS cells, and multiply in response to brain injury to contain the damage.</w:t>
+        <w:t>(cells that engulf and digest debris)</w:t>
+      </w:r>
+      <w:r>
+        <w:t>, guarding and supporting neurons throughout the brain and spinal cord.</w:t>
       </w:r>
     </w:p>
     <w:p>
@@ -1312,39 +1322,14 @@
         <w:pStyle w:val="ListNumber"/>
       </w:pPr>
       <w:r>
-        <w:t xml:space="preserve">Microglia drive the </w:t>
+        <w:t xml:space="preserve">Microglia carry out </w:t>
       </w:r>
       <w:r>
         <w:rPr>
           <w:b/>
           <w:color w:val="0F2744"/>
         </w:rPr>
-        <w:t>inflammatory response</w:t>
-      </w:r>
-      <w:r>
-        <w:t xml:space="preserve"> to brain trauma and are implicated in neurodegenerative disorders such as multiple sclerosis, motor neurone disease and Alzheimer's disease, and are key targets of HIV-1 in the CNS.</w:t>
-      </w:r>
-    </w:p>
-    <w:p>
-      <w:pPr>
-        <w:pStyle w:val="ListNumber"/>
-      </w:pPr>
-      <w:r>
-        <w:rPr>
-          <w:b/>
-          <w:color w:val="0F2744"/>
-        </w:rPr>
-        <w:t>Radial glial cells</w:t>
-      </w:r>
-      <w:r>
-        <w:t xml:space="preserve"> are a temporary population in the developing CNS that act both as precursor cells and as a </w:t>
-      </w:r>
-      <w:r>
-        <w:rPr>
-          <w:b/>
-          <w:color w:val="0F2744"/>
-        </w:rPr>
-        <w:t>scaffold</w:t>
+        <w:t>phagocytosis</w:t>
       </w:r>
       <w:r>
         <w:t xml:space="preserve"> </w:t>
@@ -1355,10 +1340,10 @@
           <w:color w:val="6B4E00"/>
           <w:shd w:val="clear" w:color="auto" w:fill="FFF3D6"/>
         </w:rPr>
-        <w:t>(a guiding framework)</w:t>
-      </w:r>
-      <w:r>
-        <w:t xml:space="preserve"> along which young neurons migrate to their correct positions.</w:t>
+        <w:t>(swallowing and clearing waste)</w:t>
+      </w:r>
+      <w:r>
+        <w:t>, make up roughly fifteen to seventeen percent of CNS cells, and multiply in response to brain injury to contain the damage.</w:t>
       </w:r>
     </w:p>
     <w:p>
@@ -1366,341 +1351,14 @@
         <w:pStyle w:val="ListNumber"/>
       </w:pPr>
       <w:r>
+        <w:t xml:space="preserve">Microglia drive the </w:t>
+      </w:r>
+      <w:r>
         <w:rPr>
           <w:b/>
           <w:color w:val="0F2744"/>
         </w:rPr>
-        <w:t>Schwann cells</w:t>
-      </w:r>
-      <w:r>
-        <w:t xml:space="preserve"> are the PNS counterpart of oligodendrocytes, and each Schwann cell insulates one single stretch of a peripheral axon with myelin to speed conduction outside the brain and spinal cord.</w:t>
-      </w:r>
-    </w:p>
-    <w:p>
-      <w:pPr>
-        <w:pStyle w:val="ListNumber"/>
-      </w:pPr>
-      <w:r>
-        <w:rPr>
-          <w:b/>
-          <w:color w:val="0F2744"/>
-        </w:rPr>
-        <w:t>Non-myelinating Schwann cells</w:t>
-      </w:r>
-      <w:r>
-        <w:t xml:space="preserve"> are important for the survival and maintenance of peripheral axons, showing that even glia which do not insulate still keep neurons alive and functioning healthily.</w:t>
-      </w:r>
-    </w:p>
-    <w:p>
-      <w:pPr>
-        <w:pStyle w:val="ListNumber"/>
-      </w:pPr>
-      <w:r>
-        <w:t xml:space="preserve">A newly recognised glial type, the </w:t>
-      </w:r>
-      <w:r>
-        <w:rPr>
-          <w:b/>
-          <w:color w:val="0F2744"/>
-        </w:rPr>
-        <w:t>oligodendrocyte precursor cell</w:t>
-      </w:r>
-      <w:r>
-        <w:t>, takes part in synaptic signalling in the hippocampus, revising the older idea that glia only ever served passive supporting roles.</w:t>
-      </w:r>
-    </w:p>
-    <w:p>
-      <w:pPr>
-        <w:spacing w:after="80"/>
-      </w:pPr>
-      <w:r>
-        <w:rPr>
-          <w:b/>
-          <w:color w:val="5A6A7E"/>
-          <w:sz w:val="20"/>
-        </w:rPr>
-        <w:t>FLOWCHART · MATCHING EACH GLIAL CELL TO ITS MAIN JOB</w:t>
-      </w:r>
-    </w:p>
-    <w:p>
-      <w:r>
-        <w:rPr>
-          <w:b/>
-          <w:color w:val="1D5FA6"/>
-          <w:sz w:val="20"/>
-        </w:rPr>
-        <w:t>[ Astrocyte — feeds + balances ions ]</w:t>
-      </w:r>
-      <w:r>
-        <w:rPr>
-          <w:b/>
-          <w:color w:val="1D5FA6"/>
-        </w:rPr>
-        <w:t xml:space="preserve">  →  </w:t>
-      </w:r>
-      <w:r>
-        <w:rPr>
-          <w:b/>
-          <w:color w:val="1D5FA6"/>
-          <w:sz w:val="20"/>
-        </w:rPr>
-        <w:t>[ Oligodendrocyte — myelin in CNS ]</w:t>
-      </w:r>
-      <w:r>
-        <w:rPr>
-          <w:b/>
-          <w:color w:val="1D5FA6"/>
-        </w:rPr>
-        <w:t xml:space="preserve">  →  </w:t>
-      </w:r>
-      <w:r>
-        <w:rPr>
-          <w:b/>
-          <w:color w:val="1D5FA6"/>
-          <w:sz w:val="20"/>
-        </w:rPr>
-        <w:t>[ Schwann cell — myelin in PNS ]</w:t>
-      </w:r>
-      <w:r>
-        <w:rPr>
-          <w:b/>
-          <w:color w:val="1D5FA6"/>
-        </w:rPr>
-        <w:t xml:space="preserve">  →  </w:t>
-      </w:r>
-      <w:r>
-        <w:rPr>
-          <w:b/>
-          <w:color w:val="1D5FA6"/>
-          <w:sz w:val="20"/>
-        </w:rPr>
-        <w:t>[ Microglia — immune defence ]</w:t>
-      </w:r>
-      <w:r>
-        <w:rPr>
-          <w:b/>
-          <w:color w:val="1D5FA6"/>
-        </w:rPr>
-        <w:t xml:space="preserve">  →  </w:t>
-      </w:r>
-      <w:r>
-        <w:rPr>
-          <w:b/>
-          <w:color w:val="0F2744"/>
-          <w:sz w:val="20"/>
-        </w:rPr>
-        <w:t>[ Radial glia — migration scaffold ]</w:t>
-      </w:r>
-    </w:p>
-    <w:p>
-      <w:pPr>
-        <w:spacing w:after="80"/>
-      </w:pPr>
-      <w:r>
-        <w:rPr>
-          <w:b/>
-          <w:color w:val="5A6A7E"/>
-          <w:sz w:val="20"/>
-        </w:rPr>
-        <w:t>MNEMONIC</w:t>
-      </w:r>
-    </w:p>
-    <w:p>
-      <w:r>
-        <w:rPr>
-          <w:b/>
-          <w:color w:val="0E7C6B"/>
-          <w:sz w:val="30"/>
-        </w:rPr>
-        <w:t>AOMRS</w:t>
-      </w:r>
-    </w:p>
-    <w:p>
-      <w:r>
-        <w:rPr>
-          <w:i/>
-        </w:rPr>
-        <w:t>Say "A Old Monk Rarely Sleeps" (A-O-M-R-S) for the five glial cells.</w:t>
-      </w:r>
-    </w:p>
-    <w:p>
-      <w:pPr>
-        <w:pStyle w:val="ListBullet"/>
-      </w:pPr>
-      <w:r>
-        <w:rPr>
-          <w:b/>
-          <w:color w:val="0E7C6B"/>
-        </w:rPr>
-        <w:t xml:space="preserve">A: </w:t>
-      </w:r>
-      <w:r>
-        <w:rPr>
-          <w:b/>
-          <w:color w:val="0F2744"/>
-        </w:rPr>
-        <w:t>Astrocytes</w:t>
-      </w:r>
-      <w:r>
-        <w:t xml:space="preserve"> nourish neurons and balance ions.</w:t>
-      </w:r>
-    </w:p>
-    <w:p>
-      <w:pPr>
-        <w:pStyle w:val="ListBullet"/>
-      </w:pPr>
-      <w:r>
-        <w:rPr>
-          <w:b/>
-          <w:color w:val="0E7C6B"/>
-        </w:rPr>
-        <w:t xml:space="preserve">O: </w:t>
-      </w:r>
-      <w:r>
-        <w:rPr>
-          <w:b/>
-          <w:color w:val="0F2744"/>
-        </w:rPr>
-        <w:t>Oligodendrocytes</w:t>
-      </w:r>
-      <w:r>
-        <w:t xml:space="preserve"> make myelin in the CNS.</w:t>
-      </w:r>
-    </w:p>
-    <w:p>
-      <w:pPr>
-        <w:pStyle w:val="ListBullet"/>
-      </w:pPr>
-      <w:r>
-        <w:rPr>
-          <w:b/>
-          <w:color w:val="0E7C6B"/>
-        </w:rPr>
-        <w:t xml:space="preserve">M: </w:t>
-      </w:r>
-      <w:r>
-        <w:rPr>
-          <w:b/>
-          <w:color w:val="0F2744"/>
-        </w:rPr>
-        <w:t>Microglia</w:t>
-      </w:r>
-      <w:r>
-        <w:t xml:space="preserve"> are the immune defenders.</w:t>
-      </w:r>
-    </w:p>
-    <w:p>
-      <w:pPr>
-        <w:pStyle w:val="ListBullet"/>
-      </w:pPr>
-      <w:r>
-        <w:rPr>
-          <w:b/>
-          <w:color w:val="0E7C6B"/>
-        </w:rPr>
-        <w:t xml:space="preserve">R: </w:t>
-      </w:r>
-      <w:r>
-        <w:rPr>
-          <w:b/>
-          <w:color w:val="0F2744"/>
-        </w:rPr>
-        <w:t>Radial glia</w:t>
-      </w:r>
-      <w:r>
-        <w:t xml:space="preserve"> guide neuron migration.</w:t>
-      </w:r>
-    </w:p>
-    <w:p>
-      <w:pPr>
-        <w:pStyle w:val="ListBullet"/>
-      </w:pPr>
-      <w:r>
-        <w:rPr>
-          <w:b/>
-          <w:color w:val="0E7C6B"/>
-        </w:rPr>
-        <w:t xml:space="preserve">S: </w:t>
-      </w:r>
-      <w:r>
-        <w:rPr>
-          <w:b/>
-          <w:color w:val="0F2744"/>
-        </w:rPr>
-        <w:t>Schwann cells</w:t>
-      </w:r>
-      <w:r>
-        <w:t xml:space="preserve"> make myelin in the PNS.</w:t>
-      </w:r>
-    </w:p>
-    <w:p>
-      <w:r>
-        <w:br w:type="page"/>
-      </w:r>
-    </w:p>
-    <w:p>
-      <w:pPr>
-        <w:pStyle w:val="Heading1"/>
-      </w:pPr>
-      <w:r>
-        <w:rPr>
-          <w:color w:val="0F2744"/>
-        </w:rPr>
-        <w:t>3. The Blood–Brain Barrier</w:t>
-      </w:r>
-    </w:p>
-    <w:p>
-      <w:r>
-        <w:rPr>
-          <w:i/>
-        </w:rPr>
-        <w:t>The blood-brain barrier is the selective gate that protects the brain while still letting essential nutrients pass.</w:t>
-      </w:r>
-    </w:p>
-    <w:p>
-      <w:pPr>
-        <w:spacing w:after="80"/>
-      </w:pPr>
-      <w:r>
-        <w:rPr>
-          <w:b/>
-          <w:color w:val="5A6A7E"/>
-          <w:sz w:val="20"/>
-        </w:rPr>
-        <w:t>KEY POINTS (EXAM-READY, ONE FULL SENTENCE EACH)</w:t>
-      </w:r>
-    </w:p>
-    <w:p>
-      <w:pPr>
-        <w:pStyle w:val="ListNumber"/>
-      </w:pPr>
-      <w:r>
-        <w:t xml:space="preserve">The </w:t>
-      </w:r>
-      <w:r>
-        <w:rPr>
-          <w:b/>
-          <w:color w:val="0F2744"/>
-        </w:rPr>
-        <w:t>blood-brain barrier</w:t>
-      </w:r>
-      <w:r>
-        <w:t xml:space="preserve"> is a protective mechanism that keeps a stable environment for the brain by shielding it from harmful substances carried in the circulating blood.</w:t>
-      </w:r>
-    </w:p>
-    <w:p>
-      <w:pPr>
-        <w:pStyle w:val="ListNumber"/>
-      </w:pPr>
-      <w:r>
-        <w:t xml:space="preserve">It works by </w:t>
-      </w:r>
-      <w:r>
-        <w:rPr>
-          <w:b/>
-          <w:color w:val="0F2744"/>
-        </w:rPr>
-        <w:t>differential permeability</w:t>
+        <w:t>inflammatory response</w:t>
       </w:r>
       <w:r>
         <w:t xml:space="preserve"> </w:t>
@@ -1711,10 +1369,10 @@
           <w:color w:val="6B4E00"/>
           <w:shd w:val="clear" w:color="auto" w:fill="FFF3D6"/>
         </w:rPr>
-        <w:t>(letting some things through but not others)</w:t>
-      </w:r>
-      <w:r>
-        <w:t>, so blood-borne toxins and many drugs are kept out while the brain's normal metabolism continues undisturbed.</w:t>
+        <w:t>(the brain's reaction of swelling and immune activity to injury)</w:t>
+      </w:r>
+      <w:r>
+        <w:t xml:space="preserve"> to brain trauma and are implicated in neurodegenerative disorders such as multiple sclerosis, motor neurone disease and Alzheimer's disease, and are key targets of HIV-1 in the CNS, which is why chronic brain inflammation is now linked to cognitive and mood changes.</w:t>
       </w:r>
     </w:p>
     <w:p>
@@ -1722,14 +1380,21 @@
         <w:pStyle w:val="ListNumber"/>
       </w:pPr>
       <w:r>
-        <w:t xml:space="preserve">The barrier is built mainly from the tightly joined </w:t>
-      </w:r>
-      <w:r>
         <w:rPr>
           <w:b/>
           <w:color w:val="0F2744"/>
         </w:rPr>
-        <w:t>endothelial cells</w:t>
+        <w:t>Radial glial cells</w:t>
+      </w:r>
+      <w:r>
+        <w:t xml:space="preserve"> are a temporary population in the developing CNS that act both as precursor cells and as a </w:t>
+      </w:r>
+      <w:r>
+        <w:rPr>
+          <w:b/>
+          <w:color w:val="0F2744"/>
+        </w:rPr>
+        <w:t>scaffold</w:t>
       </w:r>
       <w:r>
         <w:t xml:space="preserve"> </w:t>
@@ -1740,10 +1405,10 @@
           <w:color w:val="6B4E00"/>
           <w:shd w:val="clear" w:color="auto" w:fill="FFF3D6"/>
         </w:rPr>
-        <w:t>(the cells lining the blood vessels)</w:t>
-      </w:r>
-      <w:r>
-        <w:t xml:space="preserve"> of brain capillaries, whose close seals stop substances from leaking freely between the blood and brain tissue.</w:t>
+        <w:t>(a guiding framework)</w:t>
+      </w:r>
+      <w:r>
+        <w:t xml:space="preserve"> along which young neurons migrate to their correct positions.</w:t>
       </w:r>
     </w:p>
     <w:p>
@@ -1751,17 +1416,14 @@
         <w:pStyle w:val="ListNumber"/>
       </w:pPr>
       <w:r>
-        <w:t xml:space="preserve">Astrocyte </w:t>
-      </w:r>
-      <w:r>
         <w:rPr>
           <w:b/>
           <w:color w:val="0F2744"/>
         </w:rPr>
-        <w:t>end-feet</w:t>
-      </w:r>
-      <w:r>
-        <w:t xml:space="preserve"> wrap around these capillary walls and help form and support the barrier, which is why the barrier is described as a partnership between blood vessels and surrounding glial cells.</w:t>
+        <w:t>Schwann cells</w:t>
+      </w:r>
+      <w:r>
+        <w:t xml:space="preserve"> are the PNS counterpart of oligodendrocytes, and each Schwann cell insulates one single stretch of a peripheral axon with myelin to speed conduction outside the brain and spinal cord.</w:t>
       </w:r>
     </w:p>
     <w:p>
@@ -1769,14 +1431,39 @@
         <w:pStyle w:val="ListNumber"/>
       </w:pPr>
       <w:r>
-        <w:t xml:space="preserve">The barrier allows </w:t>
-      </w:r>
-      <w:r>
         <w:rPr>
           <w:b/>
           <w:color w:val="0F2744"/>
         </w:rPr>
-        <w:t>passive diffusion</w:t>
+        <w:t>Non-myelinating Schwann cells</w:t>
+      </w:r>
+      <w:r>
+        <w:t xml:space="preserve"> are important for the survival and maintenance of peripheral axons, showing that even glia which do not insulate still keep neurons alive and functioning healthily.</w:t>
+      </w:r>
+    </w:p>
+    <w:p>
+      <w:pPr>
+        <w:pStyle w:val="ListNumber"/>
+      </w:pPr>
+      <w:r>
+        <w:t xml:space="preserve">A newly recognised glial type, the </w:t>
+      </w:r>
+      <w:r>
+        <w:rPr>
+          <w:b/>
+          <w:color w:val="0F2744"/>
+        </w:rPr>
+        <w:t>oligodendrocyte precursor cell</w:t>
+      </w:r>
+      <w:r>
+        <w:t xml:space="preserve">, takes part in synaptic signalling in the </w:t>
+      </w:r>
+      <w:r>
+        <w:rPr>
+          <w:b/>
+          <w:color w:val="0F2744"/>
+        </w:rPr>
+        <w:t>hippocampus</w:t>
       </w:r>
       <w:r>
         <w:t xml:space="preserve"> </w:t>
@@ -1787,10 +1474,10 @@
           <w:color w:val="6B4E00"/>
           <w:shd w:val="clear" w:color="auto" w:fill="FFF3D6"/>
         </w:rPr>
-        <w:t>(free drifting across the membrane)</w:t>
-      </w:r>
-      <w:r>
-        <w:t xml:space="preserve"> of small gases such as oxygen and carbon dioxide, so the brain can breathe at the cellular level without any special transport system.</w:t>
+        <w:t>(a brain region central to learning and memory)</w:t>
+      </w:r>
+      <w:r>
+        <w:t>, revising the older idea that glia only ever served passive supporting roles.</w:t>
       </w:r>
     </w:p>
     <w:p>
@@ -1798,24 +1485,311 @@
         <w:pStyle w:val="ListNumber"/>
       </w:pPr>
       <w:r>
-        <w:t xml:space="preserve">Essential molecules that cannot simply diffuse, such as </w:t>
+        <w:t xml:space="preserve">For the clinician the overall lesson is that glia are </w:t>
       </w:r>
       <w:r>
         <w:rPr>
           <w:b/>
           <w:color w:val="0F2744"/>
         </w:rPr>
-        <w:t>glucose</w:t>
-      </w:r>
-      <w:r>
-        <w:t xml:space="preserve"> and certain amino acids, are moved across by </w:t>
+        <w:t>active partners in behaviour</w:t>
+      </w:r>
+      <w:r>
+        <w:t>, since healthy astrocytes, intact myelin and well-regulated microglia are each needed for clear thinking, and their failure underlies conditions from multiple sclerosis to the neuroinflammation seen in dementia.</w:t>
+      </w:r>
+    </w:p>
+    <w:p>
+      <w:pPr>
+        <w:spacing w:after="80"/>
+      </w:pPr>
+      <w:r>
+        <w:rPr>
+          <w:b/>
+          <w:color w:val="5A6A7E"/>
+          <w:sz w:val="20"/>
+        </w:rPr>
+        <w:t>FLOWCHART · MATCHING EACH GLIAL CELL TO ITS MAIN JOB</w:t>
+      </w:r>
+    </w:p>
+    <w:p>
+      <w:r>
+        <w:rPr>
+          <w:b/>
+          <w:color w:val="1D5FA6"/>
+          <w:sz w:val="20"/>
+        </w:rPr>
+        <w:t>[ Astrocyte — feeds + balances ions ]</w:t>
+      </w:r>
+      <w:r>
+        <w:rPr>
+          <w:b/>
+          <w:color w:val="1D5FA6"/>
+        </w:rPr>
+        <w:t xml:space="preserve">  →  </w:t>
+      </w:r>
+      <w:r>
+        <w:rPr>
+          <w:b/>
+          <w:color w:val="1D5FA6"/>
+          <w:sz w:val="20"/>
+        </w:rPr>
+        <w:t>[ Oligodendrocyte — myelin in CNS ]</w:t>
+      </w:r>
+      <w:r>
+        <w:rPr>
+          <w:b/>
+          <w:color w:val="1D5FA6"/>
+        </w:rPr>
+        <w:t xml:space="preserve">  →  </w:t>
+      </w:r>
+      <w:r>
+        <w:rPr>
+          <w:b/>
+          <w:color w:val="1D5FA6"/>
+          <w:sz w:val="20"/>
+        </w:rPr>
+        <w:t>[ Schwann cell — myelin in PNS ]</w:t>
+      </w:r>
+      <w:r>
+        <w:rPr>
+          <w:b/>
+          <w:color w:val="1D5FA6"/>
+        </w:rPr>
+        <w:t xml:space="preserve">  →  </w:t>
+      </w:r>
+      <w:r>
+        <w:rPr>
+          <w:b/>
+          <w:color w:val="1D5FA6"/>
+          <w:sz w:val="20"/>
+        </w:rPr>
+        <w:t>[ Microglia — immune defence ]</w:t>
+      </w:r>
+      <w:r>
+        <w:rPr>
+          <w:b/>
+          <w:color w:val="1D5FA6"/>
+        </w:rPr>
+        <w:t xml:space="preserve">  →  </w:t>
       </w:r>
       <w:r>
         <w:rPr>
           <w:b/>
           <w:color w:val="0F2744"/>
-        </w:rPr>
-        <w:t>selective transport</w:t>
+          <w:sz w:val="20"/>
+        </w:rPr>
+        <w:t>[ Radial glia — migration scaffold ]</w:t>
+      </w:r>
+    </w:p>
+    <w:p>
+      <w:pPr>
+        <w:spacing w:after="80"/>
+      </w:pPr>
+      <w:r>
+        <w:rPr>
+          <w:b/>
+          <w:color w:val="5A6A7E"/>
+          <w:sz w:val="20"/>
+        </w:rPr>
+        <w:t>MNEMONIC</w:t>
+      </w:r>
+    </w:p>
+    <w:p>
+      <w:r>
+        <w:rPr>
+          <w:b/>
+          <w:color w:val="0E7C6B"/>
+          <w:sz w:val="30"/>
+        </w:rPr>
+        <w:t>AOMRS</w:t>
+      </w:r>
+    </w:p>
+    <w:p>
+      <w:r>
+        <w:rPr>
+          <w:i/>
+        </w:rPr>
+        <w:t>Say "A Old Monk Rarely Sleeps" (A-O-M-R-S) for the five glial cells.</w:t>
+      </w:r>
+    </w:p>
+    <w:p>
+      <w:pPr>
+        <w:pStyle w:val="ListBullet"/>
+      </w:pPr>
+      <w:r>
+        <w:rPr>
+          <w:b/>
+          <w:color w:val="0E7C6B"/>
+        </w:rPr>
+        <w:t xml:space="preserve">A: </w:t>
+      </w:r>
+      <w:r>
+        <w:rPr>
+          <w:b/>
+          <w:color w:val="0F2744"/>
+        </w:rPr>
+        <w:t>Astrocytes</w:t>
+      </w:r>
+      <w:r>
+        <w:t xml:space="preserve"> nourish neurons and balance ions.</w:t>
+      </w:r>
+    </w:p>
+    <w:p>
+      <w:pPr>
+        <w:pStyle w:val="ListBullet"/>
+      </w:pPr>
+      <w:r>
+        <w:rPr>
+          <w:b/>
+          <w:color w:val="0E7C6B"/>
+        </w:rPr>
+        <w:t xml:space="preserve">O: </w:t>
+      </w:r>
+      <w:r>
+        <w:rPr>
+          <w:b/>
+          <w:color w:val="0F2744"/>
+        </w:rPr>
+        <w:t>Oligodendrocytes</w:t>
+      </w:r>
+      <w:r>
+        <w:t xml:space="preserve"> make myelin in the CNS.</w:t>
+      </w:r>
+    </w:p>
+    <w:p>
+      <w:pPr>
+        <w:pStyle w:val="ListBullet"/>
+      </w:pPr>
+      <w:r>
+        <w:rPr>
+          <w:b/>
+          <w:color w:val="0E7C6B"/>
+        </w:rPr>
+        <w:t xml:space="preserve">M: </w:t>
+      </w:r>
+      <w:r>
+        <w:rPr>
+          <w:b/>
+          <w:color w:val="0F2744"/>
+        </w:rPr>
+        <w:t>Microglia</w:t>
+      </w:r>
+      <w:r>
+        <w:t xml:space="preserve"> are the immune defenders.</w:t>
+      </w:r>
+    </w:p>
+    <w:p>
+      <w:pPr>
+        <w:pStyle w:val="ListBullet"/>
+      </w:pPr>
+      <w:r>
+        <w:rPr>
+          <w:b/>
+          <w:color w:val="0E7C6B"/>
+        </w:rPr>
+        <w:t xml:space="preserve">R: </w:t>
+      </w:r>
+      <w:r>
+        <w:rPr>
+          <w:b/>
+          <w:color w:val="0F2744"/>
+        </w:rPr>
+        <w:t>Radial glia</w:t>
+      </w:r>
+      <w:r>
+        <w:t xml:space="preserve"> guide neuron migration.</w:t>
+      </w:r>
+    </w:p>
+    <w:p>
+      <w:pPr>
+        <w:pStyle w:val="ListBullet"/>
+      </w:pPr>
+      <w:r>
+        <w:rPr>
+          <w:b/>
+          <w:color w:val="0E7C6B"/>
+        </w:rPr>
+        <w:t xml:space="preserve">S: </w:t>
+      </w:r>
+      <w:r>
+        <w:rPr>
+          <w:b/>
+          <w:color w:val="0F2744"/>
+        </w:rPr>
+        <w:t>Schwann cells</w:t>
+      </w:r>
+      <w:r>
+        <w:t xml:space="preserve"> make myelin in the PNS.</w:t>
+      </w:r>
+    </w:p>
+    <w:p>
+      <w:r>
+        <w:br w:type="page"/>
+      </w:r>
+    </w:p>
+    <w:p>
+      <w:pPr>
+        <w:pStyle w:val="Heading1"/>
+      </w:pPr>
+      <w:r>
+        <w:rPr>
+          <w:color w:val="0F2744"/>
+        </w:rPr>
+        <w:t>3. The Blood–Brain Barrier</w:t>
+      </w:r>
+    </w:p>
+    <w:p>
+      <w:r>
+        <w:rPr>
+          <w:i/>
+        </w:rPr>
+        <w:t>The blood-brain barrier is the selective gate that protects the brain while still letting essential nutrients pass, and understanding it explains one of the central puzzles of clinical neuroscience, namely why some psychiatric and neurological drugs reach the brain and work while others are turned away at the door.</w:t>
+      </w:r>
+    </w:p>
+    <w:p>
+      <w:pPr>
+        <w:spacing w:after="80"/>
+      </w:pPr>
+      <w:r>
+        <w:rPr>
+          <w:b/>
+          <w:color w:val="5A6A7E"/>
+          <w:sz w:val="20"/>
+        </w:rPr>
+        <w:t>KEY POINTS (EXAM-READY, ONE FULL SENTENCE EACH)</w:t>
+      </w:r>
+    </w:p>
+    <w:p>
+      <w:pPr>
+        <w:pStyle w:val="ListNumber"/>
+      </w:pPr>
+      <w:r>
+        <w:t xml:space="preserve">The </w:t>
+      </w:r>
+      <w:r>
+        <w:rPr>
+          <w:b/>
+          <w:color w:val="0F2744"/>
+        </w:rPr>
+        <w:t>blood-brain barrier</w:t>
+      </w:r>
+      <w:r>
+        <w:t xml:space="preserve"> is a protective mechanism that keeps a stable environment for the brain by shielding it from harmful substances carried in the circulating blood.</w:t>
+      </w:r>
+    </w:p>
+    <w:p>
+      <w:pPr>
+        <w:pStyle w:val="ListNumber"/>
+      </w:pPr>
+      <w:r>
+        <w:t xml:space="preserve">It works by </w:t>
+      </w:r>
+      <w:r>
+        <w:rPr>
+          <w:b/>
+          <w:color w:val="0F2744"/>
+        </w:rPr>
+        <w:t>differential permeability</w:t>
       </w:r>
       <w:r>
         <w:t xml:space="preserve"> </w:t>
@@ -1826,10 +1800,10 @@
           <w:color w:val="6B4E00"/>
           <w:shd w:val="clear" w:color="auto" w:fill="FFF3D6"/>
         </w:rPr>
-        <w:t>(special carrier proteins that ferry them through)</w:t>
-      </w:r>
-      <w:r>
-        <w:t xml:space="preserve"> to feed the demanding brain tissue.</w:t>
+        <w:t>(letting some things through but not others)</w:t>
+      </w:r>
+      <w:r>
+        <w:t>, so blood-borne toxins and many drugs are kept out while the brain's normal metabolism continues undisturbed.</w:t>
       </w:r>
     </w:p>
     <w:p>
@@ -1837,32 +1811,14 @@
         <w:pStyle w:val="ListNumber"/>
       </w:pPr>
       <w:r>
-        <w:t xml:space="preserve">The brain is metabolically expensive, using about </w:t>
+        <w:t xml:space="preserve">The barrier is built mainly from the tightly joined </w:t>
       </w:r>
       <w:r>
         <w:rPr>
           <w:b/>
           <w:color w:val="0F2744"/>
         </w:rPr>
-        <w:t>twenty-five percent of the body's glucose</w:t>
-      </w:r>
-      <w:r>
-        <w:t xml:space="preserve"> and roughly seventy-five percent of its oxygen, so a steady, well-guarded blood supply is vital to normal brain function.</w:t>
-      </w:r>
-    </w:p>
-    <w:p>
-      <w:pPr>
-        <w:pStyle w:val="ListNumber"/>
-      </w:pPr>
-      <w:r>
-        <w:t xml:space="preserve">A serious fall in blood supply to the brain can cause a </w:t>
-      </w:r>
-      <w:r>
-        <w:rPr>
-          <w:b/>
-          <w:color w:val="0F2744"/>
-        </w:rPr>
-        <w:t>stroke</w:t>
+        <w:t>endothelial cells</w:t>
       </w:r>
       <w:r>
         <w:t xml:space="preserve"> </w:t>
@@ -1873,10 +1829,10 @@
           <w:color w:val="6B4E00"/>
           <w:shd w:val="clear" w:color="auto" w:fill="FFF3D6"/>
         </w:rPr>
-        <w:t>(brain damage from loss of blood flow)</w:t>
-      </w:r>
-      <w:r>
-        <w:t>, showing how dependent the brain is on continuous, properly regulated circulation.</w:t>
+        <w:t>(the cells lining the blood vessels)</w:t>
+      </w:r>
+      <w:r>
+        <w:t xml:space="preserve"> of brain capillaries, whose close seals stop substances from leaking freely between the blood and brain tissue.</w:t>
       </w:r>
     </w:p>
     <w:p>
@@ -1884,11 +1840,32 @@
         <w:pStyle w:val="ListNumber"/>
       </w:pPr>
       <w:r>
+        <w:t xml:space="preserve">Astrocyte </w:t>
+      </w:r>
+      <w:r>
         <w:rPr>
           <w:b/>
           <w:color w:val="0F2744"/>
         </w:rPr>
-        <w:t>Lipid-soluble</w:t>
+        <w:t>end-feet</w:t>
+      </w:r>
+      <w:r>
+        <w:t xml:space="preserve"> wrap around these capillary walls and help form and support the barrier, which is why the barrier is described as a partnership between blood vessels and surrounding glial cells.</w:t>
+      </w:r>
+    </w:p>
+    <w:p>
+      <w:pPr>
+        <w:pStyle w:val="ListNumber"/>
+      </w:pPr>
+      <w:r>
+        <w:t xml:space="preserve">The barrier allows </w:t>
+      </w:r>
+      <w:r>
+        <w:rPr>
+          <w:b/>
+          <w:color w:val="0F2744"/>
+        </w:rPr>
+        <w:t>passive diffusion</w:t>
       </w:r>
       <w:r>
         <w:t xml:space="preserve"> </w:t>
@@ -1899,10 +1876,10 @@
           <w:color w:val="6B4E00"/>
           <w:shd w:val="clear" w:color="auto" w:fill="FFF3D6"/>
         </w:rPr>
-        <w:t>(fat-dissolving)</w:t>
-      </w:r>
-      <w:r>
-        <w:t xml:space="preserve"> substances can slip through the plasma membranes of the barrier more easily than water-soluble ones, which is why some drugs reach the brain readily while others are largely blocked.</w:t>
+        <w:t>(free drifting across the membrane)</w:t>
+      </w:r>
+      <w:r>
+        <w:t xml:space="preserve"> of small gases such as oxygen and carbon dioxide, so the brain can breathe at the cellular level without any special transport system.</w:t>
       </w:r>
     </w:p>
     <w:p>
@@ -1910,65 +1887,24 @@
         <w:pStyle w:val="ListNumber"/>
       </w:pPr>
       <w:r>
+        <w:t xml:space="preserve">Essential molecules that cannot simply diffuse, such as </w:t>
+      </w:r>
+      <w:r>
         <w:rPr>
           <w:b/>
           <w:color w:val="0F2744"/>
         </w:rPr>
-        <w:t>Stress</w:t>
-      </w:r>
-      <w:r>
-        <w:t xml:space="preserve"> increases the permeability of the barrier, so under strain even some harmful chemicals that are normally excluded may cross into the brain, a point of real clinical importance.</w:t>
-      </w:r>
-    </w:p>
-    <w:p>
-      <w:pPr>
-        <w:pStyle w:val="ListNumber"/>
-      </w:pPr>
-      <w:r>
-        <w:t xml:space="preserve">The barrier's selective nature explains why treating brain disease is difficult, because many useful drugs are </w:t>
+        <w:t>glucose</w:t>
+      </w:r>
+      <w:r>
+        <w:t xml:space="preserve"> and certain amino acids, are moved across by </w:t>
       </w:r>
       <w:r>
         <w:rPr>
           <w:b/>
           <w:color w:val="0F2744"/>
         </w:rPr>
-        <w:t>rejected at the barrier</w:t>
-      </w:r>
-      <w:r>
-        <w:t xml:space="preserve"> and never reach the neurons that need them.</w:t>
-      </w:r>
-    </w:p>
-    <w:p>
-      <w:pPr>
-        <w:pStyle w:val="ListNumber"/>
-      </w:pPr>
-      <w:r>
-        <w:t xml:space="preserve">A clear clinical illustration is </w:t>
-      </w:r>
-      <w:r>
-        <w:rPr>
-          <w:b/>
-          <w:color w:val="0F2744"/>
-        </w:rPr>
-        <w:t>L-DOPA (levodopa)</w:t>
-      </w:r>
-      <w:r>
-        <w:t>, the precursor of dopamine, which is given in Parkinson's disease precisely because it can cross the barrier whereas dopamine itself cannot.</w:t>
-      </w:r>
-    </w:p>
-    <w:p>
-      <w:pPr>
-        <w:pStyle w:val="ListNumber"/>
-      </w:pPr>
-      <w:r>
-        <w:t xml:space="preserve">The barrier is described as a </w:t>
-      </w:r>
-      <w:r>
-        <w:rPr>
-          <w:b/>
-          <w:color w:val="0F2744"/>
-        </w:rPr>
-        <w:t>semipermeable</w:t>
+        <w:t>selective transport</w:t>
       </w:r>
       <w:r>
         <w:t xml:space="preserve"> </w:t>
@@ -1979,10 +1915,10 @@
           <w:color w:val="6B4E00"/>
           <w:shd w:val="clear" w:color="auto" w:fill="FFF3D6"/>
         </w:rPr>
-        <w:t>(only partly letting things through)</w:t>
-      </w:r>
-      <w:r>
-        <w:t xml:space="preserve"> structure formed with extracellular fluid that separates the circulating blood from the brain and the extracellular fluid of the central nervous system.</w:t>
+        <w:t>(special carrier proteins that ferry them through)</w:t>
+      </w:r>
+      <w:r>
+        <w:t xml:space="preserve"> to feed the demanding brain tissue.</w:t>
       </w:r>
     </w:p>
     <w:p>
@@ -1990,17 +1926,17 @@
         <w:pStyle w:val="ListNumber"/>
       </w:pPr>
       <w:r>
-        <w:t xml:space="preserve">By keeping ions and messenger molecules at controlled levels, the barrier protects the delicate </w:t>
+        <w:t xml:space="preserve">The brain is metabolically expensive, using about </w:t>
       </w:r>
       <w:r>
         <w:rPr>
           <w:b/>
           <w:color w:val="0F2744"/>
         </w:rPr>
-        <w:t>electrical environment</w:t>
-      </w:r>
-      <w:r>
-        <w:t xml:space="preserve"> neurons need, so signalling across the brain stays reliable and is not disturbed by swings in blood chemistry.</w:t>
+        <w:t>twenty-five percent of the body's glucose</w:t>
+      </w:r>
+      <w:r>
+        <w:t xml:space="preserve"> and roughly seventy-five percent of its oxygen, so a steady, well-guarded blood supply is vital to normal brain function.</w:t>
       </w:r>
     </w:p>
     <w:p>
@@ -2008,17 +1944,28 @@
         <w:pStyle w:val="ListNumber"/>
       </w:pPr>
       <w:r>
-        <w:t xml:space="preserve">In short, the blood-brain barrier is a finely balanced </w:t>
+        <w:t xml:space="preserve">A serious fall in blood supply to the brain can cause a </w:t>
       </w:r>
       <w:r>
         <w:rPr>
           <w:b/>
           <w:color w:val="0F2744"/>
         </w:rPr>
-        <w:t>gatekeeper</w:t>
-      </w:r>
-      <w:r>
-        <w:t xml:space="preserve"> that blocks threats, admits fuel and protects the brain's internal setting, making it central to both brain health and drug design.</w:t>
+        <w:t>stroke</w:t>
+      </w:r>
+      <w:r>
+        <w:t xml:space="preserve"> </w:t>
+      </w:r>
+      <w:r>
+        <w:rPr>
+          <w:i/>
+          <w:color w:val="6B4E00"/>
+          <w:shd w:val="clear" w:color="auto" w:fill="FFF3D6"/>
+        </w:rPr>
+        <w:t>(brain damage from loss of blood flow)</w:t>
+      </w:r>
+      <w:r>
+        <w:t>, showing how dependent the brain is on continuous, properly regulated circulation.</w:t>
       </w:r>
     </w:p>
     <w:p>
@@ -2026,7 +1973,188 @@
         <w:pStyle w:val="ListNumber"/>
       </w:pPr>
       <w:r>
+        <w:rPr>
+          <w:b/>
+          <w:color w:val="0F2744"/>
+        </w:rPr>
+        <w:t>Lipid-soluble</w:t>
+      </w:r>
+      <w:r>
+        <w:t xml:space="preserve"> </w:t>
+      </w:r>
+      <w:r>
+        <w:rPr>
+          <w:i/>
+          <w:color w:val="6B4E00"/>
+          <w:shd w:val="clear" w:color="auto" w:fill="FFF3D6"/>
+        </w:rPr>
+        <w:t>(fat-dissolving)</w:t>
+      </w:r>
+      <w:r>
+        <w:t xml:space="preserve"> substances can slip through the plasma membranes of the barrier more easily than water-soluble ones, which is why some drugs reach the brain readily while others are largely blocked.</w:t>
+      </w:r>
+    </w:p>
+    <w:p>
+      <w:pPr>
+        <w:pStyle w:val="ListNumber"/>
+      </w:pPr>
+      <w:r>
+        <w:rPr>
+          <w:b/>
+          <w:color w:val="0F2744"/>
+        </w:rPr>
+        <w:t>Stress</w:t>
+      </w:r>
+      <w:r>
+        <w:t xml:space="preserve"> increases the permeability of the barrier, so under strain even some harmful chemicals that are normally excluded may cross into the brain, a point of real clinical importance.</w:t>
+      </w:r>
+    </w:p>
+    <w:p>
+      <w:pPr>
+        <w:pStyle w:val="ListNumber"/>
+      </w:pPr>
+      <w:r>
+        <w:t xml:space="preserve">The barrier's selective nature explains why treating brain disease is difficult, because many useful drugs are </w:t>
+      </w:r>
+      <w:r>
+        <w:rPr>
+          <w:b/>
+          <w:color w:val="0F2744"/>
+        </w:rPr>
+        <w:t>rejected at the barrier</w:t>
+      </w:r>
+      <w:r>
+        <w:t xml:space="preserve"> and never reach the neurons that need them.</w:t>
+      </w:r>
+    </w:p>
+    <w:p>
+      <w:pPr>
+        <w:pStyle w:val="ListNumber"/>
+      </w:pPr>
+      <w:r>
+        <w:t xml:space="preserve">A clear clinical illustration is </w:t>
+      </w:r>
+      <w:r>
+        <w:rPr>
+          <w:b/>
+          <w:color w:val="0F2744"/>
+        </w:rPr>
+        <w:t>L-DOPA (levodopa)</w:t>
+      </w:r>
+      <w:r>
+        <w:t xml:space="preserve">, the </w:t>
+      </w:r>
+      <w:r>
+        <w:rPr>
+          <w:b/>
+          <w:color w:val="0F2744"/>
+        </w:rPr>
+        <w:t>precursor</w:t>
+      </w:r>
+      <w:r>
+        <w:t xml:space="preserve"> </w:t>
+      </w:r>
+      <w:r>
+        <w:rPr>
+          <w:i/>
+          <w:color w:val="6B4E00"/>
+          <w:shd w:val="clear" w:color="auto" w:fill="FFF3D6"/>
+        </w:rPr>
+        <w:t>(the chemical building block the body converts into the active substance)</w:t>
+      </w:r>
+      <w:r>
+        <w:t xml:space="preserve"> of dopamine, which is given in Parkinson's disease precisely because it can cross the barrier whereas dopamine itself cannot, so the brain is handed the raw material and makes the dopamine on the inside.</w:t>
+      </w:r>
+    </w:p>
+    <w:p>
+      <w:pPr>
+        <w:pStyle w:val="ListNumber"/>
+      </w:pPr>
+      <w:r>
+        <w:t xml:space="preserve">The barrier is described as a </w:t>
+      </w:r>
+      <w:r>
+        <w:rPr>
+          <w:b/>
+          <w:color w:val="0F2744"/>
+        </w:rPr>
+        <w:t>semipermeable</w:t>
+      </w:r>
+      <w:r>
+        <w:t xml:space="preserve"> </w:t>
+      </w:r>
+      <w:r>
+        <w:rPr>
+          <w:i/>
+          <w:color w:val="6B4E00"/>
+          <w:shd w:val="clear" w:color="auto" w:fill="FFF3D6"/>
+        </w:rPr>
+        <w:t>(only partly letting things through)</w:t>
+      </w:r>
+      <w:r>
+        <w:t xml:space="preserve"> structure formed with extracellular fluid that separates the circulating blood from the brain and the extracellular fluid of the central nervous system.</w:t>
+      </w:r>
+    </w:p>
+    <w:p>
+      <w:pPr>
+        <w:pStyle w:val="ListNumber"/>
+      </w:pPr>
+      <w:r>
+        <w:t xml:space="preserve">By keeping ions and messenger molecules at controlled levels, the barrier protects the delicate </w:t>
+      </w:r>
+      <w:r>
+        <w:rPr>
+          <w:b/>
+          <w:color w:val="0F2744"/>
+        </w:rPr>
+        <w:t>electrical environment</w:t>
+      </w:r>
+      <w:r>
+        <w:t xml:space="preserve"> neurons need, so signalling across the brain stays reliable and is not disturbed by swings in blood chemistry.</w:t>
+      </w:r>
+    </w:p>
+    <w:p>
+      <w:pPr>
+        <w:pStyle w:val="ListNumber"/>
+      </w:pPr>
+      <w:r>
+        <w:t xml:space="preserve">In short, the blood-brain barrier is a finely balanced </w:t>
+      </w:r>
+      <w:r>
+        <w:rPr>
+          <w:b/>
+          <w:color w:val="0F2744"/>
+        </w:rPr>
+        <w:t>gatekeeper</w:t>
+      </w:r>
+      <w:r>
+        <w:t xml:space="preserve"> that blocks threats, admits fuel and protects the brain's internal setting, making it central to both brain health and drug design.</w:t>
+      </w:r>
+    </w:p>
+    <w:p>
+      <w:pPr>
+        <w:pStyle w:val="ListNumber"/>
+      </w:pPr>
+      <w:r>
         <w:t>Because the barrier guards brain chemistry so strictly, damage or leakage of the barrier is linked to swelling, infection and several neurological conditions, underlining its role as a frontline protector of the central nervous system.</w:t>
+      </w:r>
+    </w:p>
+    <w:p>
+      <w:pPr>
+        <w:pStyle w:val="ListNumber"/>
+      </w:pPr>
+      <w:r>
+        <w:t xml:space="preserve">For a clinical psychologist the key takeaway is that the barrier is both a </w:t>
+      </w:r>
+      <w:r>
+        <w:rPr>
+          <w:b/>
+          <w:color w:val="0F2744"/>
+        </w:rPr>
+        <w:t>shield and a hurdle</w:t>
+      </w:r>
+      <w:r>
+        <w:t>: it keeps the brain's chemistry stable enough for reliable mood and cognition, yet the same selectivity is why delivering medicines to the brain, and explaining why a drug does or does not help, is so often a question of whether it can cross this gate.</w:t>
       </w:r>
     </w:p>
     <w:tbl>
@@ -2303,7 +2431,7 @@
         <w:rPr>
           <w:i/>
         </w:rPr>
-        <w:t>At rest a neuron holds a steady negative voltage inside, ready to fire the moment it is stimulated.</w:t>
+        <w:t>At rest a neuron holds a steady negative voltage inside, like a charged battery waiting to be used, and this baseline is worth mastering because psychoactive drugs, anaesthetics and ion imbalances all change behaviour by nudging this very voltage.</w:t>
       </w:r>
     </w:p>
     <w:p>
@@ -2532,7 +2660,7 @@
         <w:t>stored electrical energy</w:t>
       </w:r>
       <w:r>
-        <w:t>, like a charged battery, that the neuron can release quickly when it is stimulated strongly enough to fire.</w:t>
+        <w:t>, like a charged battery holding a voltage until a circuit is switched on, that the neuron can release quickly when it is stimulated strongly enough to fire.</w:t>
       </w:r>
     </w:p>
     <w:p>
@@ -2669,21 +2797,39 @@
         <w:pStyle w:val="ListNumber"/>
       </w:pPr>
       <w:r>
-        <w:t xml:space="preserve">Overall, the resting potential is the stable baseline, set by ion gradients and the </w:t>
+        <w:t xml:space="preserve">For example, many </w:t>
       </w:r>
       <w:r>
         <w:rPr>
           <w:b/>
           <w:color w:val="0F2744"/>
         </w:rPr>
-        <w:t>sodium-potassium pump</w:t>
-      </w:r>
-      <w:r>
-        <w:t>, from which every action potential begins and to which the neuron always returns after firing.</w:t>
+        <w:t>mood-stabilising and anti-seizure drugs</w:t>
+      </w:r>
+      <w:r>
+        <w:t xml:space="preserve"> work by acting on ion channels to make neurons harder to depolarise, which stabilises the resting state and calms over-excitable circuits, a direct bridge from this basic physiology to psychiatric treatment.</w:t>
       </w:r>
     </w:p>
     <w:p>
       <w:pPr>
+        <w:pStyle w:val="ListNumber"/>
+      </w:pPr>
+      <w:r>
+        <w:t xml:space="preserve">Overall, the resting potential is the stable baseline, set by ion gradients and the </w:t>
+      </w:r>
+      <w:r>
+        <w:rPr>
+          <w:b/>
+          <w:color w:val="0F2744"/>
+        </w:rPr>
+        <w:t>sodium-potassium pump</w:t>
+      </w:r>
+      <w:r>
+        <w:t>, from which every action potential begins and to which the neuron always returns after firing.</w:t>
+      </w:r>
+    </w:p>
+    <w:p>
+      <w:pPr>
         <w:spacing w:after="80"/>
       </w:pPr>
       <w:r>
@@ -2912,7 +3058,7 @@
         <w:rPr>
           <w:i/>
         </w:rPr>
-        <w:t>The action potential is the brief, all-or-none electrical spike that carries the nerve impulse along the axon.</w:t>
+        <w:t>The action potential is the brief, all-or-none electrical spike that carries the nerve impulse along the axon, and following its exact sequence of ion movements shows a clinical psychologist precisely where local anaesthetics, toxins and some drugs act to switch signalling on or off.</w:t>
       </w:r>
     </w:p>
     <w:p>
@@ -2992,19 +3138,14 @@
         <w:t>−55 mV</w:t>
       </w:r>
       <w:r>
-        <w:t>, the tipping point; once this value is reached, the impulse is generated in a committed, all-or-none way.</w:t>
-      </w:r>
-    </w:p>
-    <w:p>
-      <w:pPr>
-        <w:pStyle w:val="ListNumber"/>
-      </w:pPr>
+        <w:t xml:space="preserve">, the tipping point; once this value is reached, the impulse is generated in a committed, </w:t>
+      </w:r>
       <w:r>
         <w:rPr>
           <w:b/>
           <w:color w:val="0F2744"/>
         </w:rPr>
-        <w:t>Depolarisation</w:t>
+        <w:t>all-or-none</w:t>
       </w:r>
       <w:r>
         <w:t xml:space="preserve"> </w:t>
@@ -3015,20 +3156,10 @@
           <w:color w:val="6B4E00"/>
           <w:shd w:val="clear" w:color="auto" w:fill="FFF3D6"/>
         </w:rPr>
-        <w:t>(the inside becoming less negative)</w:t>
-      </w:r>
-      <w:r>
-        <w:t xml:space="preserve"> begins when a stimulus, for example at a touch receptor, opens </w:t>
-      </w:r>
-      <w:r>
-        <w:rPr>
-          <w:b/>
-          <w:color w:val="0F2744"/>
-        </w:rPr>
-        <w:t>sodium (Na+) channels</w:t>
-      </w:r>
-      <w:r>
-        <w:t xml:space="preserve"> and positive ions rush into the negatively charged neuron.</w:t>
+        <w:t>(either a full signal fires or none at all, like a trigger that is pulled or not)</w:t>
+      </w:r>
+      <w:r>
+        <w:t xml:space="preserve"> way.</w:t>
       </w:r>
     </w:p>
     <w:p>
@@ -3036,50 +3167,11 @@
         <w:pStyle w:val="ListNumber"/>
       </w:pPr>
       <w:r>
-        <w:t xml:space="preserve">As </w:t>
-      </w:r>
-      <w:r>
         <w:rPr>
           <w:b/>
           <w:color w:val="0F2744"/>
         </w:rPr>
-        <w:t>sodium floods in</w:t>
-      </w:r>
-      <w:r>
-        <w:t>, the inside of the neuron becomes positive and the membrane potential climbs steeply, which is the sharp upstroke seen on a recording of the action potential.</w:t>
-      </w:r>
-    </w:p>
-    <w:p>
-      <w:pPr>
-        <w:pStyle w:val="ListNumber"/>
-      </w:pPr>
-      <w:r>
-        <w:t xml:space="preserve">Next, </w:t>
-      </w:r>
-      <w:r>
-        <w:rPr>
-          <w:b/>
-          <w:color w:val="0F2744"/>
-        </w:rPr>
-        <w:t>potassium (K+) channels</w:t>
-      </w:r>
-      <w:r>
-        <w:t xml:space="preserve"> open and potassium ions move out of the cell, a flow that reverses the rising charge and begins to bring the membrane voltage back down.</w:t>
-      </w:r>
-    </w:p>
-    <w:p>
-      <w:pPr>
-        <w:pStyle w:val="ListNumber"/>
-      </w:pPr>
-      <w:r>
-        <w:t xml:space="preserve">The brief peak created as sodium enters and then potassium leaves is called the </w:t>
-      </w:r>
-      <w:r>
-        <w:rPr>
-          <w:b/>
-          <w:color w:val="0F2744"/>
-        </w:rPr>
-        <w:t>spike potential</w:t>
+        <w:t>Depolarisation</w:t>
       </w:r>
       <w:r>
         <w:t xml:space="preserve"> </w:t>
@@ -3090,10 +3182,20 @@
           <w:color w:val="6B4E00"/>
           <w:shd w:val="clear" w:color="auto" w:fill="FFF3D6"/>
         </w:rPr>
-        <w:t>(the tall, narrow burst of voltage)</w:t>
-      </w:r>
-      <w:r>
-        <w:t>, the characteristic shape of a single nerve impulse.</w:t>
+        <w:t>(the inside becoming less negative)</w:t>
+      </w:r>
+      <w:r>
+        <w:t xml:space="preserve"> begins when a stimulus, for example at a touch receptor, opens </w:t>
+      </w:r>
+      <w:r>
+        <w:rPr>
+          <w:b/>
+          <w:color w:val="0F2744"/>
+        </w:rPr>
+        <w:t>sodium (Na+) channels</w:t>
+      </w:r>
+      <w:r>
+        <w:t xml:space="preserve"> and positive ions rush into the negatively charged neuron.</w:t>
       </w:r>
     </w:p>
     <w:p>
@@ -3101,11 +3203,50 @@
         <w:pStyle w:val="ListNumber"/>
       </w:pPr>
       <w:r>
+        <w:t xml:space="preserve">As </w:t>
+      </w:r>
+      <w:r>
         <w:rPr>
           <w:b/>
           <w:color w:val="0F2744"/>
         </w:rPr>
-        <w:t>Repolarisation</w:t>
+        <w:t>sodium floods in</w:t>
+      </w:r>
+      <w:r>
+        <w:t>, the inside of the neuron becomes positive and the membrane potential climbs steeply, which is the sharp upstroke seen on a recording of the action potential.</w:t>
+      </w:r>
+    </w:p>
+    <w:p>
+      <w:pPr>
+        <w:pStyle w:val="ListNumber"/>
+      </w:pPr>
+      <w:r>
+        <w:t xml:space="preserve">Next, </w:t>
+      </w:r>
+      <w:r>
+        <w:rPr>
+          <w:b/>
+          <w:color w:val="0F2744"/>
+        </w:rPr>
+        <w:t>potassium (K+) channels</w:t>
+      </w:r>
+      <w:r>
+        <w:t xml:space="preserve"> open and potassium ions move out of the cell, a flow that reverses the rising charge and begins to bring the membrane voltage back down.</w:t>
+      </w:r>
+    </w:p>
+    <w:p>
+      <w:pPr>
+        <w:pStyle w:val="ListNumber"/>
+      </w:pPr>
+      <w:r>
+        <w:t xml:space="preserve">The brief peak created as sodium enters and then potassium leaves is called the </w:t>
+      </w:r>
+      <w:r>
+        <w:rPr>
+          <w:b/>
+          <w:color w:val="0F2744"/>
+        </w:rPr>
+        <w:t>spike potential</w:t>
       </w:r>
       <w:r>
         <w:t xml:space="preserve"> </w:t>
@@ -3116,10 +3257,10 @@
           <w:color w:val="6B4E00"/>
           <w:shd w:val="clear" w:color="auto" w:fill="FFF3D6"/>
         </w:rPr>
-        <w:t>(returning toward the negative resting value)</w:t>
-      </w:r>
-      <w:r>
-        <w:t xml:space="preserve"> happens as sodium channels close back to their resting state, driving the membrane potential back toward about −70 mV.</w:t>
+        <w:t>(the tall, narrow burst of voltage)</w:t>
+      </w:r>
+      <w:r>
+        <w:t>, the characteristic shape of a single nerve impulse.</w:t>
       </w:r>
     </w:p>
     <w:p>
@@ -3127,24 +3268,11 @@
         <w:pStyle w:val="ListNumber"/>
       </w:pPr>
       <w:r>
-        <w:t xml:space="preserve">Because the potassium channels stay open slightly too long, the voltage briefly overshoots past −70 mV to nearly </w:t>
-      </w:r>
-      <w:r>
         <w:rPr>
           <w:b/>
           <w:color w:val="0F2744"/>
         </w:rPr>
-        <w:t>−80 mV</w:t>
-      </w:r>
-      <w:r>
-        <w:t xml:space="preserve">, a dip called </w:t>
-      </w:r>
-      <w:r>
-        <w:rPr>
-          <w:b/>
-          <w:color w:val="0F2744"/>
-        </w:rPr>
-        <w:t>hyperpolarisation</w:t>
+        <w:t>Repolarisation</w:t>
       </w:r>
       <w:r>
         <w:t xml:space="preserve"> </w:t>
@@ -3155,10 +3283,10 @@
           <w:color w:val="6B4E00"/>
           <w:shd w:val="clear" w:color="auto" w:fill="FFF3D6"/>
         </w:rPr>
-        <w:t>(more negative than the normal resting level)</w:t>
-      </w:r>
-      <w:r>
-        <w:t>.</w:t>
+        <w:t>(returning toward the negative resting value)</w:t>
+      </w:r>
+      <w:r>
+        <w:t xml:space="preserve"> happens as sodium channels close back to their resting state, driving the membrane potential back toward about −70 mV.</w:t>
       </w:r>
     </w:p>
     <w:p>
@@ -3166,32 +3294,24 @@
         <w:pStyle w:val="ListNumber"/>
       </w:pPr>
       <w:r>
-        <w:t xml:space="preserve">Ion concentrations are then restored and the cell settles back to its </w:t>
+        <w:t xml:space="preserve">Because the potassium channels stay open slightly too long, the voltage briefly overshoots past −70 mV to nearly </w:t>
       </w:r>
       <w:r>
         <w:rPr>
           <w:b/>
           <w:color w:val="0F2744"/>
         </w:rPr>
-        <w:t>−70 mV</w:t>
-      </w:r>
-      <w:r>
-        <w:t xml:space="preserve"> resting membrane potential, ready to respond again once a new stimulus arrives.</w:t>
-      </w:r>
-    </w:p>
-    <w:p>
-      <w:pPr>
-        <w:pStyle w:val="ListNumber"/>
-      </w:pPr>
-      <w:r>
-        <w:t xml:space="preserve">Immediately after firing there is an </w:t>
+        <w:t>−80 mV</w:t>
+      </w:r>
+      <w:r>
+        <w:t xml:space="preserve">, a dip called </w:t>
       </w:r>
       <w:r>
         <w:rPr>
           <w:b/>
           <w:color w:val="0F2744"/>
         </w:rPr>
-        <w:t>absolute refractory period</w:t>
+        <w:t>hyperpolarisation</w:t>
       </w:r>
       <w:r>
         <w:t xml:space="preserve"> </w:t>
@@ -3202,10 +3322,10 @@
           <w:color w:val="6B4E00"/>
           <w:shd w:val="clear" w:color="auto" w:fill="FFF3D6"/>
         </w:rPr>
-        <w:t>(a short time when no new impulse is possible)</w:t>
-      </w:r>
-      <w:r>
-        <w:t>, during which the neuron cannot generate another action potential no matter how strong the stimulus.</w:t>
+        <w:t>(more negative than the normal resting level)</w:t>
+      </w:r>
+      <w:r>
+        <w:t>.</w:t>
       </w:r>
     </w:p>
     <w:p>
@@ -3213,27 +3333,17 @@
         <w:pStyle w:val="ListNumber"/>
       </w:pPr>
       <w:r>
-        <w:t xml:space="preserve">This is followed by a </w:t>
+        <w:t xml:space="preserve">Ion concentrations are then restored and the cell settles back to its </w:t>
       </w:r>
       <w:r>
         <w:rPr>
           <w:b/>
           <w:color w:val="0F2744"/>
         </w:rPr>
-        <w:t>relative refractory period</w:t>
-      </w:r>
-      <w:r>
-        <w:t xml:space="preserve"> during which a new action potential can occur, but only if the stimulus is </w:t>
-      </w:r>
-      <w:r>
-        <w:rPr>
-          <w:b/>
-          <w:color w:val="0F2744"/>
-        </w:rPr>
-        <w:t>stronger than usual</w:t>
-      </w:r>
-      <w:r>
-        <w:t xml:space="preserve"> to overcome the lingering hyperpolarisation.</w:t>
+        <w:t>−70 mV</w:t>
+      </w:r>
+      <w:r>
+        <w:t xml:space="preserve"> resting membrane potential, ready to respond again once a new stimulus arrives.</w:t>
       </w:r>
     </w:p>
     <w:p>
@@ -3241,14 +3351,14 @@
         <w:pStyle w:val="ListNumber"/>
       </w:pPr>
       <w:r>
-        <w:t xml:space="preserve">In myelinated axons the impulse jumps between </w:t>
+        <w:t xml:space="preserve">Immediately after firing there is an </w:t>
       </w:r>
       <w:r>
         <w:rPr>
           <w:b/>
           <w:color w:val="0F2744"/>
         </w:rPr>
-        <w:t>nodes of Ranvier</w:t>
+        <w:t>absolute refractory period</w:t>
       </w:r>
       <w:r>
         <w:t xml:space="preserve"> </w:t>
@@ -3259,10 +3369,10 @@
           <w:color w:val="6B4E00"/>
           <w:shd w:val="clear" w:color="auto" w:fill="FFF3D6"/>
         </w:rPr>
-        <w:t>(bare gaps in the insulation)</w:t>
-      </w:r>
-      <w:r>
-        <w:t>, a leaping conduction that makes signalling much faster than in unmyelinated fibres.</w:t>
+        <w:t>(a short time when no new impulse is possible)</w:t>
+      </w:r>
+      <w:r>
+        <w:t>, during which the neuron cannot generate another action potential no matter how strong the stimulus.</w:t>
       </w:r>
     </w:p>
     <w:p>
@@ -3270,17 +3380,27 @@
         <w:pStyle w:val="ListNumber"/>
       </w:pPr>
       <w:r>
-        <w:t xml:space="preserve">The action potential is essentially </w:t>
+        <w:t xml:space="preserve">This is followed by a </w:t>
       </w:r>
       <w:r>
         <w:rPr>
           <w:b/>
           <w:color w:val="0F2744"/>
         </w:rPr>
-        <w:t>self-regenerating</w:t>
-      </w:r>
-      <w:r>
-        <w:t>, being recharged at each node as it travels, so the signal keeps its full strength over long distances along the axon.</w:t>
+        <w:t>relative refractory period</w:t>
+      </w:r>
+      <w:r>
+        <w:t xml:space="preserve"> during which a new action potential can occur, but only if the stimulus is </w:t>
+      </w:r>
+      <w:r>
+        <w:rPr>
+          <w:b/>
+          <w:color w:val="0F2744"/>
+        </w:rPr>
+        <w:t>stronger than usual</w:t>
+      </w:r>
+      <w:r>
+        <w:t xml:space="preserve"> to overcome the lingering hyperpolarisation.</w:t>
       </w:r>
     </w:p>
     <w:p>
@@ -3288,340 +3408,14 @@
         <w:pStyle w:val="ListNumber"/>
       </w:pPr>
       <w:r>
-        <w:t xml:space="preserve">Because of the all-or-none rule, information is coded not by the size of each spike but by the </w:t>
+        <w:t xml:space="preserve">In myelinated axons the impulse jumps between </w:t>
       </w:r>
       <w:r>
         <w:rPr>
           <w:b/>
           <w:color w:val="0F2744"/>
         </w:rPr>
-        <w:t>frequency</w:t>
-      </w:r>
-      <w:r>
-        <w:t xml:space="preserve"> of impulses, so a stronger stimulus produces more action potentials per second rather than bigger ones.</w:t>
-      </w:r>
-    </w:p>
-    <w:p>
-      <w:pPr>
-        <w:pStyle w:val="ListNumber"/>
-      </w:pPr>
-      <w:r>
-        <w:t xml:space="preserve">The refractory periods also ensure the impulse travels in </w:t>
-      </w:r>
-      <w:r>
-        <w:rPr>
-          <w:b/>
-          <w:color w:val="0F2744"/>
-        </w:rPr>
-        <w:t>one direction</w:t>
-      </w:r>
-      <w:r>
-        <w:t xml:space="preserve"> only, from the cell body toward the axon terminal, preventing the signal from running backward along the fibre.</w:t>
-      </w:r>
-    </w:p>
-    <w:p>
-      <w:pPr>
-        <w:pStyle w:val="ListNumber"/>
-      </w:pPr>
-      <w:r>
-        <w:t xml:space="preserve">Clinically, anything that disturbs sodium or potassium channels, such as local anaesthetics or certain toxins, can </w:t>
-      </w:r>
-      <w:r>
-        <w:rPr>
-          <w:b/>
-          <w:color w:val="0F2744"/>
-        </w:rPr>
-        <w:t>block the action potential</w:t>
-      </w:r>
-      <w:r>
-        <w:t>, which is how nerve conduction and sensation can be switched off for medical purposes.</w:t>
-      </w:r>
-    </w:p>
-    <w:p>
-      <w:pPr>
-        <w:spacing w:after="80"/>
-      </w:pPr>
-      <w:r>
-        <w:rPr>
-          <w:b/>
-          <w:color w:val="5A6A7E"/>
-          <w:sz w:val="20"/>
-        </w:rPr>
-        <w:t>FLOWCHART · THE SEQUENCE OF ONE ACTION POTENTIAL</w:t>
-      </w:r>
-    </w:p>
-    <w:p>
-      <w:r>
-        <w:rPr>
-          <w:b/>
-          <w:color w:val="1D5FA6"/>
-          <w:sz w:val="20"/>
-        </w:rPr>
-        <w:t>[ Resting −70 mV — polarised ]</w:t>
-      </w:r>
-      <w:r>
-        <w:rPr>
-          <w:b/>
-          <w:color w:val="1D5FA6"/>
-        </w:rPr>
-        <w:t xml:space="preserve">  →  </w:t>
-      </w:r>
-      <w:r>
-        <w:rPr>
-          <w:b/>
-          <w:color w:val="1D5FA6"/>
-          <w:sz w:val="20"/>
-        </w:rPr>
-        <w:t>[ Threshold −55 mV — Na+ channels open ]</w:t>
-      </w:r>
-      <w:r>
-        <w:rPr>
-          <w:b/>
-          <w:color w:val="1D5FA6"/>
-        </w:rPr>
-        <w:t xml:space="preserve">  →  </w:t>
-      </w:r>
-      <w:r>
-        <w:rPr>
-          <w:b/>
-          <w:color w:val="1D5FA6"/>
-          <w:sz w:val="20"/>
-        </w:rPr>
-        <w:t>[ Depolarisation — Na+ in, +spike ]</w:t>
-      </w:r>
-      <w:r>
-        <w:rPr>
-          <w:b/>
-          <w:color w:val="1D5FA6"/>
-        </w:rPr>
-        <w:t xml:space="preserve">  →  </w:t>
-      </w:r>
-      <w:r>
-        <w:rPr>
-          <w:b/>
-          <w:color w:val="1D5FA6"/>
-          <w:sz w:val="20"/>
-        </w:rPr>
-        <w:t>[ Repolarisation — K+ out ]</w:t>
-      </w:r>
-      <w:r>
-        <w:rPr>
-          <w:b/>
-          <w:color w:val="1D5FA6"/>
-        </w:rPr>
-        <w:t xml:space="preserve">  →  </w:t>
-      </w:r>
-      <w:r>
-        <w:rPr>
-          <w:b/>
-          <w:color w:val="1D5FA6"/>
-          <w:sz w:val="20"/>
-        </w:rPr>
-        <w:t>[ Hyperpolarisation −80 mV — overshoot ]</w:t>
-      </w:r>
-      <w:r>
-        <w:rPr>
-          <w:b/>
-          <w:color w:val="1D5FA6"/>
-        </w:rPr>
-        <w:t xml:space="preserve">  →  </w:t>
-      </w:r>
-      <w:r>
-        <w:rPr>
-          <w:b/>
-          <w:color w:val="0F2744"/>
-          <w:sz w:val="20"/>
-        </w:rPr>
-        <w:t>[ Refractory + reset — back to −70 mV ]</w:t>
-      </w:r>
-    </w:p>
-    <w:p>
-      <w:pPr>
-        <w:spacing w:after="80"/>
-      </w:pPr>
-      <w:r>
-        <w:rPr>
-          <w:b/>
-          <w:color w:val="5A6A7E"/>
-          <w:sz w:val="20"/>
-        </w:rPr>
-        <w:t>MNEMONIC</w:t>
-      </w:r>
-    </w:p>
-    <w:p>
-      <w:r>
-        <w:rPr>
-          <w:b/>
-          <w:color w:val="0E7C6B"/>
-          <w:sz w:val="30"/>
-        </w:rPr>
-        <w:t>DRRR</w:t>
-      </w:r>
-    </w:p>
-    <w:p>
-      <w:r>
-        <w:rPr>
-          <w:i/>
-        </w:rPr>
-        <w:t>Remember DRRR ("Depolarise, Repolarise, Refract, Reset") for the spike's phases.</w:t>
-      </w:r>
-    </w:p>
-    <w:p>
-      <w:pPr>
-        <w:pStyle w:val="ListBullet"/>
-      </w:pPr>
-      <w:r>
-        <w:rPr>
-          <w:b/>
-          <w:color w:val="0E7C6B"/>
-        </w:rPr>
-        <w:t xml:space="preserve">D: </w:t>
-      </w:r>
-      <w:r>
-        <w:rPr>
-          <w:b/>
-          <w:color w:val="0F2744"/>
-        </w:rPr>
-        <w:t>Depolarisation</w:t>
-      </w:r>
-      <w:r>
-        <w:t>, sodium rushes in and voltage rises.</w:t>
-      </w:r>
-    </w:p>
-    <w:p>
-      <w:pPr>
-        <w:pStyle w:val="ListBullet"/>
-      </w:pPr>
-      <w:r>
-        <w:rPr>
-          <w:b/>
-          <w:color w:val="0E7C6B"/>
-        </w:rPr>
-        <w:t xml:space="preserve">R: </w:t>
-      </w:r>
-      <w:r>
-        <w:rPr>
-          <w:b/>
-          <w:color w:val="0F2744"/>
-        </w:rPr>
-        <w:t>Repolarisation</w:t>
-      </w:r>
-      <w:r>
-        <w:t>, potassium leaves and voltage falls.</w:t>
-      </w:r>
-    </w:p>
-    <w:p>
-      <w:pPr>
-        <w:pStyle w:val="ListBullet"/>
-      </w:pPr>
-      <w:r>
-        <w:rPr>
-          <w:b/>
-          <w:color w:val="0E7C6B"/>
-        </w:rPr>
-        <w:t xml:space="preserve">R: </w:t>
-      </w:r>
-      <w:r>
-        <w:rPr>
-          <w:b/>
-          <w:color w:val="0F2744"/>
-        </w:rPr>
-        <w:t>Refractory + hyperpolarisation</w:t>
-      </w:r>
-      <w:r>
-        <w:t>, a brief overshoot and recovery gap.</w:t>
-      </w:r>
-    </w:p>
-    <w:p>
-      <w:pPr>
-        <w:pStyle w:val="ListBullet"/>
-      </w:pPr>
-      <w:r>
-        <w:rPr>
-          <w:b/>
-          <w:color w:val="0E7C6B"/>
-        </w:rPr>
-        <w:t xml:space="preserve">R: </w:t>
-      </w:r>
-      <w:r>
-        <w:rPr>
-          <w:b/>
-          <w:color w:val="0F2744"/>
-        </w:rPr>
-        <w:t>Reset</w:t>
-      </w:r>
-      <w:r>
-        <w:t>, ions are restored to the −70 mV resting level.</w:t>
-      </w:r>
-    </w:p>
-    <w:p>
-      <w:r>
-        <w:br w:type="page"/>
-      </w:r>
-    </w:p>
-    <w:p>
-      <w:pPr>
-        <w:pStyle w:val="Heading1"/>
-      </w:pPr>
-      <w:r>
-        <w:rPr>
-          <w:color w:val="0F2744"/>
-        </w:rPr>
-        <w:t>6. Communication Between Neurons — Neurotransmitters</w:t>
-      </w:r>
-    </w:p>
-    <w:p>
-      <w:r>
-        <w:rPr>
-          <w:i/>
-        </w:rPr>
-        <w:t>At the synapse, chemical messengers carry the signal from one neuron across the gap to the next.</w:t>
-      </w:r>
-    </w:p>
-    <w:p>
-      <w:pPr>
-        <w:spacing w:after="80"/>
-      </w:pPr>
-      <w:r>
-        <w:rPr>
-          <w:b/>
-          <w:color w:val="5A6A7E"/>
-          <w:sz w:val="20"/>
-        </w:rPr>
-        <w:t>KEY POINTS (EXAM-READY, ONE FULL SENTENCE EACH)</w:t>
-      </w:r>
-    </w:p>
-    <w:p>
-      <w:pPr>
-        <w:pStyle w:val="ListNumber"/>
-      </w:pPr>
-      <w:r>
-        <w:t xml:space="preserve">A </w:t>
-      </w:r>
-      <w:r>
-        <w:rPr>
-          <w:b/>
-          <w:color w:val="0F2744"/>
-        </w:rPr>
-        <w:t>synapse</w:t>
-      </w:r>
-      <w:r>
-        <w:t xml:space="preserve"> is the junction where one neuron communicates with the next, and because it is a thin gap neurons do not physically merge but instead signal across it chemically.</w:t>
-      </w:r>
-    </w:p>
-    <w:p>
-      <w:pPr>
-        <w:pStyle w:val="ListNumber"/>
-      </w:pPr>
-      <w:r>
-        <w:t xml:space="preserve">The synapse has three parts, the </w:t>
-      </w:r>
-      <w:r>
-        <w:rPr>
-          <w:b/>
-          <w:color w:val="0F2744"/>
-        </w:rPr>
-        <w:t>presynaptic ending</w:t>
+        <w:t>nodes of Ranvier</w:t>
       </w:r>
       <w:r>
         <w:t xml:space="preserve"> </w:t>
@@ -3632,27 +3426,79 @@
           <w:color w:val="6B4E00"/>
           <w:shd w:val="clear" w:color="auto" w:fill="FFF3D6"/>
         </w:rPr>
-        <w:t>(the sending side)</w:t>
-      </w:r>
-      <w:r>
-        <w:t xml:space="preserve"> that releases the message, the </w:t>
+        <w:t>(bare gaps in the insulation)</w:t>
+      </w:r>
+      <w:r>
+        <w:t>, a leaping conduction that makes signalling much faster than in unmyelinated fibres.</w:t>
+      </w:r>
+    </w:p>
+    <w:p>
+      <w:pPr>
+        <w:pStyle w:val="ListNumber"/>
+      </w:pPr>
+      <w:r>
+        <w:t xml:space="preserve">The action potential is essentially </w:t>
       </w:r>
       <w:r>
         <w:rPr>
           <w:b/>
           <w:color w:val="0F2744"/>
         </w:rPr>
-        <w:t>postsynaptic ending</w:t>
-      </w:r>
-      <w:r>
-        <w:t xml:space="preserve"> that receives it, and the narrow </w:t>
+        <w:t>self-regenerating</w:t>
+      </w:r>
+      <w:r>
+        <w:t>, being recharged at each node as it travels, so the signal keeps its full strength over long distances along the axon.</w:t>
+      </w:r>
+    </w:p>
+    <w:p>
+      <w:pPr>
+        <w:pStyle w:val="ListNumber"/>
+      </w:pPr>
+      <w:r>
+        <w:t xml:space="preserve">Because of the all-or-none rule, information is coded not by the size of each spike but by the </w:t>
       </w:r>
       <w:r>
         <w:rPr>
           <w:b/>
           <w:color w:val="0F2744"/>
         </w:rPr>
-        <w:t>synaptic cleft</w:t>
+        <w:t>frequency</w:t>
+      </w:r>
+      <w:r>
+        <w:t xml:space="preserve"> of impulses, so a stronger stimulus produces more action potentials per second rather than bigger ones.</w:t>
+      </w:r>
+    </w:p>
+    <w:p>
+      <w:pPr>
+        <w:pStyle w:val="ListNumber"/>
+      </w:pPr>
+      <w:r>
+        <w:t xml:space="preserve">The refractory periods also ensure the impulse travels in </w:t>
+      </w:r>
+      <w:r>
+        <w:rPr>
+          <w:b/>
+          <w:color w:val="0F2744"/>
+        </w:rPr>
+        <w:t>one direction</w:t>
+      </w:r>
+      <w:r>
+        <w:t xml:space="preserve"> only, from the cell body toward the axon terminal, preventing the signal from running backward along the fibre.</w:t>
+      </w:r>
+    </w:p>
+    <w:p>
+      <w:pPr>
+        <w:pStyle w:val="ListNumber"/>
+      </w:pPr>
+      <w:r>
+        <w:t xml:space="preserve">Clinically, anything that disturbs sodium or potassium channels, such as </w:t>
+      </w:r>
+      <w:r>
+        <w:rPr>
+          <w:b/>
+          <w:color w:val="0F2744"/>
+        </w:rPr>
+        <w:t>local anaesthetics</w:t>
       </w:r>
       <w:r>
         <w:t xml:space="preserve"> </w:t>
@@ -3663,10 +3509,20 @@
           <w:color w:val="6B4E00"/>
           <w:shd w:val="clear" w:color="auto" w:fill="FFF3D6"/>
         </w:rPr>
-        <w:t>(the gap between them, about 20 nm wide)</w:t>
-      </w:r>
-      <w:r>
-        <w:t xml:space="preserve"> in between.</w:t>
+        <w:t>(numbing drugs that block pain signals)</w:t>
+      </w:r>
+      <w:r>
+        <w:t xml:space="preserve"> or certain toxins, can </w:t>
+      </w:r>
+      <w:r>
+        <w:rPr>
+          <w:b/>
+          <w:color w:val="0F2744"/>
+        </w:rPr>
+        <w:t>block the action potential</w:t>
+      </w:r>
+      <w:r>
+        <w:t>, which is how nerve conduction and sensation can be switched off for medical purposes.</w:t>
       </w:r>
     </w:p>
     <w:p>
@@ -3674,21 +3530,304 @@
         <w:pStyle w:val="ListNumber"/>
       </w:pPr>
       <w:r>
+        <w:t xml:space="preserve">This same logic explains everyday clinical facts: an anaesthetic injected near a nerve stops its sodium channels so the signal never reaches the brain and no pain is felt, which makes the action potential not just a textbook spike but the exact event therapy can </w:t>
+      </w:r>
+      <w:r>
         <w:rPr>
           <w:b/>
           <w:color w:val="0F2744"/>
         </w:rPr>
-        <w:t>Neurotransmitters</w:t>
-      </w:r>
-      <w:r>
-        <w:t xml:space="preserve"> are the chemical messengers synthesised by neurons and released across the synapse, and they are stored in tiny sacs called </w:t>
+        <w:t>start or silence</w:t>
+      </w:r>
+      <w:r>
+        <w:t>.</w:t>
+      </w:r>
+    </w:p>
+    <w:p>
+      <w:pPr>
+        <w:spacing w:after="80"/>
+      </w:pPr>
+      <w:r>
+        <w:rPr>
+          <w:b/>
+          <w:color w:val="5A6A7E"/>
+          <w:sz w:val="20"/>
+        </w:rPr>
+        <w:t>FLOWCHART · THE SEQUENCE OF ONE ACTION POTENTIAL</w:t>
+      </w:r>
+    </w:p>
+    <w:p>
+      <w:r>
+        <w:rPr>
+          <w:b/>
+          <w:color w:val="1D5FA6"/>
+          <w:sz w:val="20"/>
+        </w:rPr>
+        <w:t>[ Resting −70 mV — polarised ]</w:t>
+      </w:r>
+      <w:r>
+        <w:rPr>
+          <w:b/>
+          <w:color w:val="1D5FA6"/>
+        </w:rPr>
+        <w:t xml:space="preserve">  →  </w:t>
+      </w:r>
+      <w:r>
+        <w:rPr>
+          <w:b/>
+          <w:color w:val="1D5FA6"/>
+          <w:sz w:val="20"/>
+        </w:rPr>
+        <w:t>[ Threshold −55 mV — Na+ channels open ]</w:t>
+      </w:r>
+      <w:r>
+        <w:rPr>
+          <w:b/>
+          <w:color w:val="1D5FA6"/>
+        </w:rPr>
+        <w:t xml:space="preserve">  →  </w:t>
+      </w:r>
+      <w:r>
+        <w:rPr>
+          <w:b/>
+          <w:color w:val="1D5FA6"/>
+          <w:sz w:val="20"/>
+        </w:rPr>
+        <w:t>[ Depolarisation — Na+ in, +spike ]</w:t>
+      </w:r>
+      <w:r>
+        <w:rPr>
+          <w:b/>
+          <w:color w:val="1D5FA6"/>
+        </w:rPr>
+        <w:t xml:space="preserve">  →  </w:t>
+      </w:r>
+      <w:r>
+        <w:rPr>
+          <w:b/>
+          <w:color w:val="1D5FA6"/>
+          <w:sz w:val="20"/>
+        </w:rPr>
+        <w:t>[ Repolarisation — K+ out ]</w:t>
+      </w:r>
+      <w:r>
+        <w:rPr>
+          <w:b/>
+          <w:color w:val="1D5FA6"/>
+        </w:rPr>
+        <w:t xml:space="preserve">  →  </w:t>
+      </w:r>
+      <w:r>
+        <w:rPr>
+          <w:b/>
+          <w:color w:val="1D5FA6"/>
+          <w:sz w:val="20"/>
+        </w:rPr>
+        <w:t>[ Hyperpolarisation −80 mV — overshoot ]</w:t>
+      </w:r>
+      <w:r>
+        <w:rPr>
+          <w:b/>
+          <w:color w:val="1D5FA6"/>
+        </w:rPr>
+        <w:t xml:space="preserve">  →  </w:t>
       </w:r>
       <w:r>
         <w:rPr>
           <w:b/>
           <w:color w:val="0F2744"/>
-        </w:rPr>
-        <w:t>vesicles</w:t>
+          <w:sz w:val="20"/>
+        </w:rPr>
+        <w:t>[ Refractory + reset — back to −70 mV ]</w:t>
+      </w:r>
+    </w:p>
+    <w:p>
+      <w:pPr>
+        <w:spacing w:after="80"/>
+      </w:pPr>
+      <w:r>
+        <w:rPr>
+          <w:b/>
+          <w:color w:val="5A6A7E"/>
+          <w:sz w:val="20"/>
+        </w:rPr>
+        <w:t>MNEMONIC</w:t>
+      </w:r>
+    </w:p>
+    <w:p>
+      <w:r>
+        <w:rPr>
+          <w:b/>
+          <w:color w:val="0E7C6B"/>
+          <w:sz w:val="30"/>
+        </w:rPr>
+        <w:t>DRRR</w:t>
+      </w:r>
+    </w:p>
+    <w:p>
+      <w:r>
+        <w:rPr>
+          <w:i/>
+        </w:rPr>
+        <w:t>Remember DRRR ("Depolarise, Repolarise, Refract, Reset") for the spike's phases.</w:t>
+      </w:r>
+    </w:p>
+    <w:p>
+      <w:pPr>
+        <w:pStyle w:val="ListBullet"/>
+      </w:pPr>
+      <w:r>
+        <w:rPr>
+          <w:b/>
+          <w:color w:val="0E7C6B"/>
+        </w:rPr>
+        <w:t xml:space="preserve">D: </w:t>
+      </w:r>
+      <w:r>
+        <w:rPr>
+          <w:b/>
+          <w:color w:val="0F2744"/>
+        </w:rPr>
+        <w:t>Depolarisation</w:t>
+      </w:r>
+      <w:r>
+        <w:t>, sodium rushes in and voltage rises.</w:t>
+      </w:r>
+    </w:p>
+    <w:p>
+      <w:pPr>
+        <w:pStyle w:val="ListBullet"/>
+      </w:pPr>
+      <w:r>
+        <w:rPr>
+          <w:b/>
+          <w:color w:val="0E7C6B"/>
+        </w:rPr>
+        <w:t xml:space="preserve">R: </w:t>
+      </w:r>
+      <w:r>
+        <w:rPr>
+          <w:b/>
+          <w:color w:val="0F2744"/>
+        </w:rPr>
+        <w:t>Repolarisation</w:t>
+      </w:r>
+      <w:r>
+        <w:t>, potassium leaves and voltage falls.</w:t>
+      </w:r>
+    </w:p>
+    <w:p>
+      <w:pPr>
+        <w:pStyle w:val="ListBullet"/>
+      </w:pPr>
+      <w:r>
+        <w:rPr>
+          <w:b/>
+          <w:color w:val="0E7C6B"/>
+        </w:rPr>
+        <w:t xml:space="preserve">R: </w:t>
+      </w:r>
+      <w:r>
+        <w:rPr>
+          <w:b/>
+          <w:color w:val="0F2744"/>
+        </w:rPr>
+        <w:t>Refractory + hyperpolarisation</w:t>
+      </w:r>
+      <w:r>
+        <w:t>, a brief overshoot and recovery gap.</w:t>
+      </w:r>
+    </w:p>
+    <w:p>
+      <w:pPr>
+        <w:pStyle w:val="ListBullet"/>
+      </w:pPr>
+      <w:r>
+        <w:rPr>
+          <w:b/>
+          <w:color w:val="0E7C6B"/>
+        </w:rPr>
+        <w:t xml:space="preserve">R: </w:t>
+      </w:r>
+      <w:r>
+        <w:rPr>
+          <w:b/>
+          <w:color w:val="0F2744"/>
+        </w:rPr>
+        <w:t>Reset</w:t>
+      </w:r>
+      <w:r>
+        <w:t>, ions are restored to the −70 mV resting level.</w:t>
+      </w:r>
+    </w:p>
+    <w:p>
+      <w:r>
+        <w:br w:type="page"/>
+      </w:r>
+    </w:p>
+    <w:p>
+      <w:pPr>
+        <w:pStyle w:val="Heading1"/>
+      </w:pPr>
+      <w:r>
+        <w:rPr>
+          <w:color w:val="0F2744"/>
+        </w:rPr>
+        <w:t>6. Communication Between Neurons — Neurotransmitters</w:t>
+      </w:r>
+    </w:p>
+    <w:p>
+      <w:r>
+        <w:rPr>
+          <w:i/>
+        </w:rPr>
+        <w:t>At the synapse, chemical messengers carry the signal from one neuron across a tiny gap to the next, and because almost every psychiatric medication works here, the synapse is the single most important meeting point between the biology of behaviour and clinical practice.</w:t>
+      </w:r>
+    </w:p>
+    <w:p>
+      <w:pPr>
+        <w:spacing w:after="80"/>
+      </w:pPr>
+      <w:r>
+        <w:rPr>
+          <w:b/>
+          <w:color w:val="5A6A7E"/>
+          <w:sz w:val="20"/>
+        </w:rPr>
+        <w:t>KEY POINTS (EXAM-READY, ONE FULL SENTENCE EACH)</w:t>
+      </w:r>
+    </w:p>
+    <w:p>
+      <w:pPr>
+        <w:pStyle w:val="ListNumber"/>
+      </w:pPr>
+      <w:r>
+        <w:t xml:space="preserve">A </w:t>
+      </w:r>
+      <w:r>
+        <w:rPr>
+          <w:b/>
+          <w:color w:val="0F2744"/>
+        </w:rPr>
+        <w:t>synapse</w:t>
+      </w:r>
+      <w:r>
+        <w:t xml:space="preserve"> is the junction where one neuron communicates with the next, and because it is a thin gap neurons do not physically merge but instead signal across it chemically.</w:t>
+      </w:r>
+    </w:p>
+    <w:p>
+      <w:pPr>
+        <w:pStyle w:val="ListNumber"/>
+      </w:pPr>
+      <w:r>
+        <w:t xml:space="preserve">The synapse has three parts, the </w:t>
+      </w:r>
+      <w:r>
+        <w:rPr>
+          <w:b/>
+          <w:color w:val="0F2744"/>
+        </w:rPr>
+        <w:t>presynaptic ending</w:t>
       </w:r>
       <w:r>
         <w:t xml:space="preserve"> </w:t>
@@ -3699,35 +3838,27 @@
           <w:color w:val="6B4E00"/>
           <w:shd w:val="clear" w:color="auto" w:fill="FFF3D6"/>
         </w:rPr>
-        <w:t>(membrane bubbles holding the chemical)</w:t>
-      </w:r>
-      <w:r>
-        <w:t xml:space="preserve"> in the terminal.</w:t>
-      </w:r>
-    </w:p>
-    <w:p>
-      <w:pPr>
-        <w:pStyle w:val="ListNumber"/>
-      </w:pPr>
-      <w:r>
-        <w:t xml:space="preserve">When the impulse arrives, </w:t>
+        <w:t>(the sending side)</w:t>
+      </w:r>
+      <w:r>
+        <w:t xml:space="preserve"> that releases the message, the </w:t>
       </w:r>
       <w:r>
         <w:rPr>
           <w:b/>
           <w:color w:val="0F2744"/>
         </w:rPr>
-        <w:t>calcium (Ca2+) channels</w:t>
-      </w:r>
-      <w:r>
-        <w:t xml:space="preserve"> open and calcium entering the terminal drives the vesicles to fuse with the membrane in a process called </w:t>
+        <w:t>postsynaptic ending</w:t>
+      </w:r>
+      <w:r>
+        <w:t xml:space="preserve"> that receives it, and the narrow </w:t>
       </w:r>
       <w:r>
         <w:rPr>
           <w:b/>
           <w:color w:val="0F2744"/>
         </w:rPr>
-        <w:t>exocytosis</w:t>
+        <w:t>synaptic cleft</w:t>
       </w:r>
       <w:r>
         <w:t xml:space="preserve"> </w:t>
@@ -3738,10 +3869,10 @@
           <w:color w:val="6B4E00"/>
           <w:shd w:val="clear" w:color="auto" w:fill="FFF3D6"/>
         </w:rPr>
-        <w:t>(releasing contents by the sac merging with the cell wall)</w:t>
-      </w:r>
-      <w:r>
-        <w:t>.</w:t>
+        <w:t>(the gap between them, about 20 nm wide)</w:t>
+      </w:r>
+      <w:r>
+        <w:t xml:space="preserve"> in between.</w:t>
       </w:r>
     </w:p>
     <w:p>
@@ -3749,14 +3880,21 @@
         <w:pStyle w:val="ListNumber"/>
       </w:pPr>
       <w:r>
-        <w:t xml:space="preserve">The released neurotransmitter crosses the cleft by </w:t>
-      </w:r>
-      <w:r>
         <w:rPr>
           <w:b/>
           <w:color w:val="0F2744"/>
         </w:rPr>
-        <w:t>diffusion</w:t>
+        <w:t>Neurotransmitters</w:t>
+      </w:r>
+      <w:r>
+        <w:t xml:space="preserve"> are the chemical messengers synthesised by neurons and released across the synapse, and they are stored in tiny sacs called </w:t>
+      </w:r>
+      <w:r>
+        <w:rPr>
+          <w:b/>
+          <w:color w:val="0F2744"/>
+        </w:rPr>
+        <w:t>vesicles</w:t>
       </w:r>
       <w:r>
         <w:t xml:space="preserve"> </w:t>
@@ -3767,10 +3905,10 @@
           <w:color w:val="6B4E00"/>
           <w:shd w:val="clear" w:color="auto" w:fill="FFF3D6"/>
         </w:rPr>
-        <w:t>(drifting across the gap)</w:t>
-      </w:r>
-      <w:r>
-        <w:t xml:space="preserve"> and binds to receptors on the postsynaptic membrane, opening ion channels and changing that cell's local voltage.</w:t>
+        <w:t>(membrane bubbles holding the chemical)</w:t>
+      </w:r>
+      <w:r>
+        <w:t xml:space="preserve"> in the terminal.</w:t>
       </w:r>
     </w:p>
     <w:p>
@@ -3778,24 +3916,24 @@
         <w:pStyle w:val="ListNumber"/>
       </w:pPr>
       <w:r>
-        <w:t xml:space="preserve">If the binding causes </w:t>
+        <w:t xml:space="preserve">When the impulse arrives, </w:t>
       </w:r>
       <w:r>
         <w:rPr>
           <w:b/>
           <w:color w:val="0F2744"/>
         </w:rPr>
-        <w:t>depolarisation</w:t>
-      </w:r>
-      <w:r>
-        <w:t xml:space="preserve"> the result is an excitatory response, whereas if it causes </w:t>
+        <w:t>calcium (Ca2+) channels</w:t>
+      </w:r>
+      <w:r>
+        <w:t xml:space="preserve"> open and calcium entering the terminal drives the vesicles to fuse with the membrane in a process called </w:t>
       </w:r>
       <w:r>
         <w:rPr>
           <w:b/>
           <w:color w:val="0F2744"/>
         </w:rPr>
-        <w:t>hyperpolarisation</w:t>
+        <w:t>exocytosis</w:t>
       </w:r>
       <w:r>
         <w:t xml:space="preserve"> </w:t>
@@ -3806,10 +3944,10 @@
           <w:color w:val="6B4E00"/>
           <w:shd w:val="clear" w:color="auto" w:fill="FFF3D6"/>
         </w:rPr>
-        <w:t>(making the cell more negative)</w:t>
-      </w:r>
-      <w:r>
-        <w:t xml:space="preserve"> the result is an inhibitory response that quietens the next neuron.</w:t>
+        <w:t>(releasing contents by the sac merging with the cell wall)</w:t>
+      </w:r>
+      <w:r>
+        <w:t>.</w:t>
       </w:r>
     </w:p>
     <w:p>
@@ -3817,31 +3955,14 @@
         <w:pStyle w:val="ListNumber"/>
       </w:pPr>
       <w:r>
+        <w:t xml:space="preserve">The released neurotransmitter crosses the cleft by </w:t>
+      </w:r>
+      <w:r>
         <w:rPr>
           <w:b/>
           <w:color w:val="0F2744"/>
         </w:rPr>
-        <w:t>Ionotropic (channel-linked) receptors</w:t>
-      </w:r>
-      <w:r>
-        <w:t xml:space="preserve"> give fast, direct responses because the neurotransmitter itself opens an ion channel, while </w:t>
-      </w:r>
-      <w:r>
-        <w:rPr>
-          <w:b/>
-          <w:color w:val="0F2744"/>
-        </w:rPr>
-        <w:t>metabotropic (G-protein-linked) receptors</w:t>
-      </w:r>
-      <w:r>
-        <w:t xml:space="preserve"> act indirectly through </w:t>
-      </w:r>
-      <w:r>
-        <w:rPr>
-          <w:b/>
-          <w:color w:val="0F2744"/>
-        </w:rPr>
-        <w:t>second messengers</w:t>
+        <w:t>diffusion</w:t>
       </w:r>
       <w:r>
         <w:t xml:space="preserve"> </w:t>
@@ -3852,10 +3973,10 @@
           <w:color w:val="6B4E00"/>
           <w:shd w:val="clear" w:color="auto" w:fill="FFF3D6"/>
         </w:rPr>
-        <w:t>(internal relay chemicals)</w:t>
-      </w:r>
-      <w:r>
-        <w:t xml:space="preserve"> for slower, longer effects.</w:t>
+        <w:t>(drifting across the gap)</w:t>
+      </w:r>
+      <w:r>
+        <w:t xml:space="preserve"> and binds to receptors on the postsynaptic membrane, opening ion channels and changing that cell's local voltage.</w:t>
       </w:r>
     </w:p>
     <w:p>
@@ -3863,81 +3984,24 @@
         <w:pStyle w:val="ListNumber"/>
       </w:pPr>
       <w:r>
+        <w:t xml:space="preserve">If the binding causes </w:t>
+      </w:r>
+      <w:r>
         <w:rPr>
           <w:b/>
           <w:color w:val="0F2744"/>
         </w:rPr>
-        <w:t>GABA</w:t>
-      </w:r>
-      <w:r>
-        <w:t xml:space="preserve"> is the major inhibitory neurotransmitter of the CNS, found at thirty to forty percent of all synapses, and its deficiency is linked to seizures and anxiety disorders.</w:t>
-      </w:r>
-    </w:p>
-    <w:p>
-      <w:pPr>
-        <w:pStyle w:val="ListNumber"/>
-      </w:pPr>
+        <w:t>depolarisation</w:t>
+      </w:r>
+      <w:r>
+        <w:t xml:space="preserve"> the result is an excitatory response, whereas if it causes </w:t>
+      </w:r>
       <w:r>
         <w:rPr>
           <w:b/>
           <w:color w:val="0F2744"/>
         </w:rPr>
-        <w:t>Glycine</w:t>
-      </w:r>
-      <w:r>
-        <w:t xml:space="preserve"> is a simple amino-acid </w:t>
-      </w:r>
-      <w:r>
-        <w:rPr>
-          <w:b/>
-          <w:color w:val="0F2744"/>
-        </w:rPr>
-        <w:t>inhibitory</w:t>
-      </w:r>
-      <w:r>
-        <w:t xml:space="preserve"> neurotransmitter of the spinal cord, brain stem and retina, and the poison strychnine causes convulsions by blocking glycine's calming action.</w:t>
-      </w:r>
-    </w:p>
-    <w:p>
-      <w:pPr>
-        <w:pStyle w:val="ListNumber"/>
-      </w:pPr>
-      <w:r>
-        <w:rPr>
-          <w:b/>
-          <w:color w:val="0F2744"/>
-        </w:rPr>
-        <w:t>Glutamate</w:t>
-      </w:r>
-      <w:r>
-        <w:t xml:space="preserve"> is the main </w:t>
-      </w:r>
-      <w:r>
-        <w:rPr>
-          <w:b/>
-          <w:color w:val="0F2744"/>
-        </w:rPr>
-        <w:t>excitatory</w:t>
-      </w:r>
-      <w:r>
-        <w:t xml:space="preserve"> neurotransmitter and is central to learning and memory, while </w:t>
-      </w:r>
-      <w:r>
-        <w:rPr>
-          <w:b/>
-          <w:color w:val="0F2744"/>
-        </w:rPr>
-        <w:t>aspartate</w:t>
-      </w:r>
-      <w:r>
-        <w:t xml:space="preserve"> is another excitatory transmitter that activates </w:t>
-      </w:r>
-      <w:r>
-        <w:rPr>
-          <w:b/>
-          <w:color w:val="0F2744"/>
-        </w:rPr>
-        <w:t>NMDA receptors</w:t>
+        <w:t>hyperpolarisation</w:t>
       </w:r>
       <w:r>
         <w:t xml:space="preserve"> </w:t>
@@ -3948,10 +4012,10 @@
           <w:color w:val="6B4E00"/>
           <w:shd w:val="clear" w:color="auto" w:fill="FFF3D6"/>
         </w:rPr>
-        <w:t>(a specific glutamate-type receptor)</w:t>
-      </w:r>
-      <w:r>
-        <w:t>.</w:t>
+        <w:t>(making the cell more negative)</w:t>
+      </w:r>
+      <w:r>
+        <w:t xml:space="preserve"> the result is an inhibitory response that quietens the next neuron.</w:t>
       </w:r>
     </w:p>
     <w:p>
@@ -3963,17 +4027,27 @@
           <w:b/>
           <w:color w:val="0F2744"/>
         </w:rPr>
-        <w:t>Serotonin (5-HT)</w:t>
-      </w:r>
-      <w:r>
-        <w:t xml:space="preserve"> helps regulate mood, anger, aggression, sleep, appetite and body temperature, which is why </w:t>
+        <w:t>Ionotropic (channel-linked) receptors</w:t>
+      </w:r>
+      <w:r>
+        <w:t xml:space="preserve"> give fast, direct responses because the neurotransmitter itself opens an ion channel, while </w:t>
       </w:r>
       <w:r>
         <w:rPr>
           <w:b/>
           <w:color w:val="0F2744"/>
         </w:rPr>
-        <w:t>SSRIs</w:t>
+        <w:t>metabotropic (G-protein-linked) receptors</w:t>
+      </w:r>
+      <w:r>
+        <w:t xml:space="preserve"> act indirectly through </w:t>
+      </w:r>
+      <w:r>
+        <w:rPr>
+          <w:b/>
+          <w:color w:val="0F2744"/>
+        </w:rPr>
+        <w:t>second messengers</w:t>
       </w:r>
       <w:r>
         <w:t xml:space="preserve"> </w:t>
@@ -3984,10 +4058,10 @@
           <w:color w:val="6B4E00"/>
           <w:shd w:val="clear" w:color="auto" w:fill="FFF3D6"/>
         </w:rPr>
-        <w:t>(selective serotonin reuptake inhibitors, a class of antidepressant)</w:t>
-      </w:r>
-      <w:r>
-        <w:t xml:space="preserve"> are used to treat depression.</w:t>
+        <w:t>(internal relay chemicals)</w:t>
+      </w:r>
+      <w:r>
+        <w:t xml:space="preserve"> for slower, longer effects.</w:t>
       </w:r>
     </w:p>
     <w:p>
@@ -3999,105 +4073,17 @@
           <w:b/>
           <w:color w:val="0F2744"/>
         </w:rPr>
-        <w:t>Dopamine</w:t>
-      </w:r>
-      <w:r>
-        <w:t xml:space="preserve"> works along four brain pathways, and its shortage causes </w:t>
+        <w:t>GABA</w:t>
+      </w:r>
+      <w:r>
+        <w:t xml:space="preserve"> is the major </w:t>
       </w:r>
       <w:r>
         <w:rPr>
           <w:b/>
           <w:color w:val="0F2744"/>
         </w:rPr>
-        <w:t>Parkinson's disease</w:t>
-      </w:r>
-      <w:r>
-        <w:t xml:space="preserve"> while its excess is linked to </w:t>
-      </w:r>
-      <w:r>
-        <w:rPr>
-          <w:b/>
-          <w:color w:val="0F2744"/>
-        </w:rPr>
-        <w:t>schizophrenia</w:t>
-      </w:r>
-      <w:r>
-        <w:t>, making it one of the most clinically important transmitters.</w:t>
-      </w:r>
-    </w:p>
-    <w:p>
-      <w:pPr>
-        <w:pStyle w:val="ListNumber"/>
-      </w:pPr>
-      <w:r>
-        <w:rPr>
-          <w:b/>
-          <w:color w:val="0F2744"/>
-        </w:rPr>
-        <w:t>Noradrenaline</w:t>
-      </w:r>
-      <w:r>
-        <w:t xml:space="preserve"> is an excitatory monoamine from the locus coeruleus that plays a key role in </w:t>
-      </w:r>
-      <w:r>
-        <w:rPr>
-          <w:b/>
-          <w:color w:val="0F2744"/>
-        </w:rPr>
-        <w:t>attention and arousal</w:t>
-      </w:r>
-      <w:r>
-        <w:t>, as well as heart rate, blood pressure and digestive processes.</w:t>
-      </w:r>
-    </w:p>
-    <w:p>
-      <w:pPr>
-        <w:pStyle w:val="ListNumber"/>
-      </w:pPr>
-      <w:r>
-        <w:rPr>
-          <w:b/>
-          <w:color w:val="0F2744"/>
-        </w:rPr>
-        <w:t>Acetylcholine (ACh)</w:t>
-      </w:r>
-      <w:r>
-        <w:t xml:space="preserve">, the first neurotransmitter ever identified, acts in both the PNS and CNS, and its deficiency is one of the causes of </w:t>
-      </w:r>
-      <w:r>
-        <w:rPr>
-          <w:b/>
-          <w:color w:val="0F2744"/>
-        </w:rPr>
-        <w:t>Alzheimer's disease</w:t>
-      </w:r>
-      <w:r>
-        <w:t xml:space="preserve"> with its memory loss.</w:t>
-      </w:r>
-    </w:p>
-    <w:p>
-      <w:pPr>
-        <w:pStyle w:val="ListNumber"/>
-      </w:pPr>
-      <w:r>
-        <w:t xml:space="preserve">The synapse is the main site of action of most </w:t>
-      </w:r>
-      <w:r>
-        <w:rPr>
-          <w:b/>
-          <w:color w:val="0F2744"/>
-        </w:rPr>
-        <w:t>psychoactive drugs</w:t>
-      </w:r>
-      <w:r>
-        <w:t xml:space="preserve">, for example cocaine blocks </w:t>
-      </w:r>
-      <w:r>
-        <w:rPr>
-          <w:b/>
-          <w:color w:val="0F2744"/>
-        </w:rPr>
-        <w:t>dopamine reuptake</w:t>
+        <w:t>inhibitory</w:t>
       </w:r>
       <w:r>
         <w:t xml:space="preserve"> </w:t>
@@ -4108,10 +4094,10 @@
           <w:color w:val="6B4E00"/>
           <w:shd w:val="clear" w:color="auto" w:fill="FFF3D6"/>
         </w:rPr>
-        <w:t>(reabsorption of the transmitter)</w:t>
-      </w:r>
-      <w:r>
-        <w:t xml:space="preserve"> so its effect is intensified in the synaptic cleft.</w:t>
+        <w:t>(calming, signal-dampening)</w:t>
+      </w:r>
+      <w:r>
+        <w:t xml:space="preserve"> neurotransmitter of the CNS, found at thirty to forty percent of all synapses, and because its shortage is linked to seizures and anxiety disorders, many anti-anxiety and anti-seizure drugs work by boosting GABA's quietening effect.</w:t>
       </w:r>
     </w:p>
     <w:p>
@@ -4119,24 +4105,66 @@
         <w:pStyle w:val="ListNumber"/>
       </w:pPr>
       <w:r>
-        <w:t xml:space="preserve">Signalling is kept precise by stopping it promptly, as transmitters are cleared by </w:t>
-      </w:r>
-      <w:r>
         <w:rPr>
           <w:b/>
           <w:color w:val="0F2744"/>
         </w:rPr>
-        <w:t>reuptake</w:t>
-      </w:r>
-      <w:r>
-        <w:t xml:space="preserve"> back into the neuron or by enzymes, and </w:t>
+        <w:t>Glycine</w:t>
+      </w:r>
+      <w:r>
+        <w:t xml:space="preserve"> is a simple amino-acid </w:t>
       </w:r>
       <w:r>
         <w:rPr>
           <w:b/>
           <w:color w:val="0F2744"/>
         </w:rPr>
-        <w:t>autoreceptors</w:t>
+        <w:t>inhibitory</w:t>
+      </w:r>
+      <w:r>
+        <w:t xml:space="preserve"> neurotransmitter of the spinal cord, brain stem and retina, and the poison strychnine causes convulsions by blocking glycine's calming action.</w:t>
+      </w:r>
+    </w:p>
+    <w:p>
+      <w:pPr>
+        <w:pStyle w:val="ListNumber"/>
+      </w:pPr>
+      <w:r>
+        <w:rPr>
+          <w:b/>
+          <w:color w:val="0F2744"/>
+        </w:rPr>
+        <w:t>Glutamate</w:t>
+      </w:r>
+      <w:r>
+        <w:t xml:space="preserve"> is the main </w:t>
+      </w:r>
+      <w:r>
+        <w:rPr>
+          <w:b/>
+          <w:color w:val="0F2744"/>
+        </w:rPr>
+        <w:t>excitatory</w:t>
+      </w:r>
+      <w:r>
+        <w:t xml:space="preserve"> neurotransmitter and is central to learning and memory, while </w:t>
+      </w:r>
+      <w:r>
+        <w:rPr>
+          <w:b/>
+          <w:color w:val="0F2744"/>
+        </w:rPr>
+        <w:t>aspartate</w:t>
+      </w:r>
+      <w:r>
+        <w:t xml:space="preserve"> is another excitatory transmitter that activates </w:t>
+      </w:r>
+      <w:r>
+        <w:rPr>
+          <w:b/>
+          <w:color w:val="0F2744"/>
+        </w:rPr>
+        <w:t>NMDA receptors</w:t>
       </w:r>
       <w:r>
         <w:t xml:space="preserve"> </w:t>
@@ -4147,370 +4175,32 @@
           <w:color w:val="6B4E00"/>
           <w:shd w:val="clear" w:color="auto" w:fill="FFF3D6"/>
         </w:rPr>
-        <w:t>(self-sensing receptors)</w:t>
-      </w:r>
-      <w:r>
-        <w:t xml:space="preserve"> give feedback that controls further release.</w:t>
+        <w:t>(a specific glutamate-type receptor)</w:t>
+      </w:r>
+      <w:r>
+        <w:t>.</w:t>
       </w:r>
     </w:p>
     <w:p>
       <w:pPr>
-        <w:spacing w:after="80"/>
-      </w:pPr>
-      <w:r>
-        <w:rPr>
-          <w:b/>
-          <w:color w:val="5A6A7E"/>
-          <w:sz w:val="20"/>
-        </w:rPr>
-        <w:t>FLOWCHART · HOW A CHEMICAL MESSAGE CROSSES THE SYNAPSE</w:t>
-      </w:r>
-    </w:p>
-    <w:p>
-      <w:r>
-        <w:rPr>
-          <w:b/>
-          <w:color w:val="1D5FA6"/>
-          <w:sz w:val="20"/>
-        </w:rPr>
-        <w:t>[ Impulse reaches terminal — arrives ]</w:t>
-      </w:r>
-      <w:r>
-        <w:rPr>
-          <w:b/>
-          <w:color w:val="1D5FA6"/>
-        </w:rPr>
-        <w:t xml:space="preserve">  →  </w:t>
-      </w:r>
-      <w:r>
-        <w:rPr>
-          <w:b/>
-          <w:color w:val="1D5FA6"/>
-          <w:sz w:val="20"/>
-        </w:rPr>
-        <w:t>[ Ca2+ enters — channels open ]</w:t>
-      </w:r>
-      <w:r>
-        <w:rPr>
-          <w:b/>
-          <w:color w:val="1D5FA6"/>
-        </w:rPr>
-        <w:t xml:space="preserve">  →  </w:t>
-      </w:r>
-      <w:r>
-        <w:rPr>
-          <w:b/>
-          <w:color w:val="1D5FA6"/>
-          <w:sz w:val="20"/>
-        </w:rPr>
-        <w:t>[ Vesicles fuse (exocytosis) — release ]</w:t>
-      </w:r>
-      <w:r>
-        <w:rPr>
-          <w:b/>
-          <w:color w:val="1D5FA6"/>
-        </w:rPr>
-        <w:t xml:space="preserve">  →  </w:t>
-      </w:r>
-      <w:r>
-        <w:rPr>
-          <w:b/>
-          <w:color w:val="1D5FA6"/>
-          <w:sz w:val="20"/>
-        </w:rPr>
-        <w:t>[ Transmitter crosses cleft — diffusion ]</w:t>
-      </w:r>
-      <w:r>
-        <w:rPr>
-          <w:b/>
-          <w:color w:val="1D5FA6"/>
-        </w:rPr>
-        <w:t xml:space="preserve">  →  </w:t>
-      </w:r>
-      <w:r>
-        <w:rPr>
-          <w:b/>
-          <w:color w:val="1D5FA6"/>
-          <w:sz w:val="20"/>
-        </w:rPr>
-        <w:t>[ Binds postsynaptic receptors — excite / inhibit ]</w:t>
-      </w:r>
-      <w:r>
-        <w:rPr>
-          <w:b/>
-          <w:color w:val="1D5FA6"/>
-        </w:rPr>
-        <w:t xml:space="preserve">  →  </w:t>
-      </w:r>
+        <w:pStyle w:val="ListNumber"/>
+      </w:pPr>
       <w:r>
         <w:rPr>
           <w:b/>
           <w:color w:val="0F2744"/>
-          <w:sz w:val="20"/>
-        </w:rPr>
-        <w:t>[ Reuptake or enzyme clears it — signal ends ]</w:t>
-      </w:r>
-    </w:p>
-    <w:p>
-      <w:pPr>
-        <w:spacing w:after="80"/>
-      </w:pPr>
-      <w:r>
-        <w:rPr>
-          <w:b/>
-          <w:color w:val="5A6A7E"/>
-          <w:sz w:val="20"/>
-        </w:rPr>
-        <w:t>MNEMONIC</w:t>
-      </w:r>
-    </w:p>
-    <w:p>
-      <w:r>
-        <w:rPr>
-          <w:b/>
-          <w:color w:val="0E7C6B"/>
-          <w:sz w:val="30"/>
-        </w:rPr>
-        <w:t>GGGSDNA</w:t>
-      </w:r>
-    </w:p>
-    <w:p>
-      <w:r>
-        <w:rPr>
-          <w:i/>
-        </w:rPr>
-        <w:t>"Good Girls Give Sweets, Dad Needs Acetylcholine" lists the main transmitters (G-G-G-S-D-N-A).</w:t>
-      </w:r>
-    </w:p>
-    <w:p>
-      <w:pPr>
-        <w:pStyle w:val="ListBullet"/>
-      </w:pPr>
-      <w:r>
-        <w:rPr>
-          <w:b/>
-          <w:color w:val="0E7C6B"/>
-        </w:rPr>
-        <w:t xml:space="preserve">G: </w:t>
+        </w:rPr>
+        <w:t>Serotonin (5-HT)</w:t>
+      </w:r>
+      <w:r>
+        <w:t xml:space="preserve"> helps regulate mood, anger, aggression, sleep, appetite and body temperature, which is why </w:t>
       </w:r>
       <w:r>
         <w:rPr>
           <w:b/>
           <w:color w:val="0F2744"/>
         </w:rPr>
-        <w:t>GABA</w:t>
-      </w:r>
-      <w:r>
-        <w:t>, the major inhibitory transmitter.</w:t>
-      </w:r>
-    </w:p>
-    <w:p>
-      <w:pPr>
-        <w:pStyle w:val="ListBullet"/>
-      </w:pPr>
-      <w:r>
-        <w:rPr>
-          <w:b/>
-          <w:color w:val="0E7C6B"/>
-        </w:rPr>
-        <w:t xml:space="preserve">G: </w:t>
-      </w:r>
-      <w:r>
-        <w:rPr>
-          <w:b/>
-          <w:color w:val="0F2744"/>
-        </w:rPr>
-        <w:t>Glycine</w:t>
-      </w:r>
-      <w:r>
-        <w:t>, inhibitory in the spinal cord.</w:t>
-      </w:r>
-    </w:p>
-    <w:p>
-      <w:pPr>
-        <w:pStyle w:val="ListBullet"/>
-      </w:pPr>
-      <w:r>
-        <w:rPr>
-          <w:b/>
-          <w:color w:val="0E7C6B"/>
-        </w:rPr>
-        <w:t xml:space="preserve">G: </w:t>
-      </w:r>
-      <w:r>
-        <w:rPr>
-          <w:b/>
-          <w:color w:val="0F2744"/>
-        </w:rPr>
-        <w:t>Glutamate</w:t>
-      </w:r>
-      <w:r>
-        <w:t>, the main excitatory transmitter.</w:t>
-      </w:r>
-    </w:p>
-    <w:p>
-      <w:pPr>
-        <w:pStyle w:val="ListBullet"/>
-      </w:pPr>
-      <w:r>
-        <w:rPr>
-          <w:b/>
-          <w:color w:val="0E7C6B"/>
-        </w:rPr>
-        <w:t xml:space="preserve">S: </w:t>
-      </w:r>
-      <w:r>
-        <w:rPr>
-          <w:b/>
-          <w:color w:val="0F2744"/>
-        </w:rPr>
-        <w:t>Serotonin</w:t>
-      </w:r>
-      <w:r>
-        <w:t>, mood, sleep and appetite.</w:t>
-      </w:r>
-    </w:p>
-    <w:p>
-      <w:pPr>
-        <w:pStyle w:val="ListBullet"/>
-      </w:pPr>
-      <w:r>
-        <w:rPr>
-          <w:b/>
-          <w:color w:val="0E7C6B"/>
-        </w:rPr>
-        <w:t xml:space="preserve">D: </w:t>
-      </w:r>
-      <w:r>
-        <w:rPr>
-          <w:b/>
-          <w:color w:val="0F2744"/>
-        </w:rPr>
-        <w:t>Dopamine</w:t>
-      </w:r>
-      <w:r>
-        <w:t>, movement, reward and psychosis.</w:t>
-      </w:r>
-    </w:p>
-    <w:p>
-      <w:pPr>
-        <w:pStyle w:val="ListBullet"/>
-      </w:pPr>
-      <w:r>
-        <w:rPr>
-          <w:b/>
-          <w:color w:val="0E7C6B"/>
-        </w:rPr>
-        <w:t xml:space="preserve">N: </w:t>
-      </w:r>
-      <w:r>
-        <w:rPr>
-          <w:b/>
-          <w:color w:val="0F2744"/>
-        </w:rPr>
-        <w:t>Noradrenaline</w:t>
-      </w:r>
-      <w:r>
-        <w:t>, attention and arousal.</w:t>
-      </w:r>
-    </w:p>
-    <w:p>
-      <w:pPr>
-        <w:pStyle w:val="ListBullet"/>
-      </w:pPr>
-      <w:r>
-        <w:rPr>
-          <w:b/>
-          <w:color w:val="0E7C6B"/>
-        </w:rPr>
-        <w:t xml:space="preserve">A: </w:t>
-      </w:r>
-      <w:r>
-        <w:rPr>
-          <w:b/>
-          <w:color w:val="0F2744"/>
-        </w:rPr>
-        <w:t>Acetylcholine</w:t>
-      </w:r>
-      <w:r>
-        <w:t>, the first transmitter, tied to memory.</w:t>
-      </w:r>
-    </w:p>
-    <w:p>
-      <w:r>
-        <w:br w:type="page"/>
-      </w:r>
-    </w:p>
-    <w:p>
-      <w:pPr>
-        <w:pStyle w:val="Heading1"/>
-      </w:pPr>
-      <w:r>
-        <w:rPr>
-          <w:color w:val="0F2744"/>
-        </w:rPr>
-        <w:t>7. Neuromodulators and Hormones</w:t>
-      </w:r>
-    </w:p>
-    <w:p>
-      <w:r>
-        <w:rPr>
-          <w:i/>
-        </w:rPr>
-        <w:t>Beyond fast synapses, neuromodulators and hormones tune behaviour more slowly and over wider reaches of the body.</w:t>
-      </w:r>
-    </w:p>
-    <w:p>
-      <w:pPr>
-        <w:spacing w:after="80"/>
-      </w:pPr>
-      <w:r>
-        <w:rPr>
-          <w:b/>
-          <w:color w:val="5A6A7E"/>
-          <w:sz w:val="20"/>
-        </w:rPr>
-        <w:t>KEY POINTS (EXAM-READY, ONE FULL SENTENCE EACH)</w:t>
-      </w:r>
-    </w:p>
-    <w:p>
-      <w:pPr>
-        <w:pStyle w:val="ListNumber"/>
-      </w:pPr>
-      <w:r>
-        <w:rPr>
-          <w:b/>
-          <w:color w:val="0F2744"/>
-        </w:rPr>
-        <w:t>Neuromodulators</w:t>
-      </w:r>
-      <w:r>
-        <w:t xml:space="preserve"> are a slower mode of chemical communication, released by neurons but travelling </w:t>
-      </w:r>
-      <w:r>
-        <w:rPr>
-          <w:b/>
-          <w:color w:val="0F2744"/>
-        </w:rPr>
-        <w:t>larger distances</w:t>
-      </w:r>
-      <w:r>
-        <w:t xml:space="preserve"> and spreading more widely through the nervous system than ordinary point-to-point transmitters.</w:t>
-      </w:r>
-    </w:p>
-    <w:p>
-      <w:pPr>
-        <w:pStyle w:val="ListNumber"/>
-      </w:pPr>
-      <w:r>
-        <w:t xml:space="preserve">Many neuromodulators are </w:t>
-      </w:r>
-      <w:r>
-        <w:rPr>
-          <w:b/>
-          <w:color w:val="0F2744"/>
-        </w:rPr>
-        <w:t>neuropeptides</w:t>
+        <w:t>SSRIs</w:t>
       </w:r>
       <w:r>
         <w:t xml:space="preserve"> </w:t>
@@ -4521,10 +4211,10 @@
           <w:color w:val="6B4E00"/>
           <w:shd w:val="clear" w:color="auto" w:fill="FFF3D6"/>
         </w:rPr>
-        <w:t>(short chains of amino acids linked by peptide bonds)</w:t>
-      </w:r>
-      <w:r>
-        <w:t>, protein-like molecules that act alongside classical neurotransmitters rather than replacing them.</w:t>
+        <w:t>(selective serotonin reuptake inhibitors, a class of antidepressant that keeps more serotonin in the synapse by slowing its reabsorption)</w:t>
+      </w:r>
+      <w:r>
+        <w:t xml:space="preserve"> are used to treat depression.</w:t>
       </w:r>
     </w:p>
     <w:p>
@@ -4532,57 +4222,21 @@
         <w:pStyle w:val="ListNumber"/>
       </w:pPr>
       <w:r>
-        <w:t xml:space="preserve">Rather than simply exciting or inhibiting one cell, neuromodulators </w:t>
-      </w:r>
-      <w:r>
         <w:rPr>
           <w:b/>
           <w:color w:val="0F2744"/>
         </w:rPr>
-        <w:t>adjust the general state</w:t>
-      </w:r>
-      <w:r>
-        <w:t xml:space="preserve"> of many neurons, shaping broad conditions such as alertness, attentiveness and anxiety.</w:t>
-      </w:r>
-    </w:p>
-    <w:p>
-      <w:pPr>
-        <w:pStyle w:val="ListNumber"/>
-      </w:pPr>
-      <w:r>
-        <w:t xml:space="preserve">Neuropeptides typically work by </w:t>
+        <w:t>Dopamine</w:t>
+      </w:r>
+      <w:r>
+        <w:t xml:space="preserve"> works along four brain pathways, and its shortage causes </w:t>
       </w:r>
       <w:r>
         <w:rPr>
           <w:b/>
           <w:color w:val="0F2744"/>
         </w:rPr>
-        <w:t>raising or lowering the release</w:t>
-      </w:r>
-      <w:r>
-        <w:t xml:space="preserve"> of other neurotransmitters or by altering how strongly postsynaptic cells respond, so they fine-tune signalling rather than carry it alone.</w:t>
-      </w:r>
-    </w:p>
-    <w:p>
-      <w:pPr>
-        <w:pStyle w:val="ListNumber"/>
-      </w:pPr>
-      <w:r>
-        <w:rPr>
-          <w:b/>
-          <w:color w:val="0F2744"/>
-        </w:rPr>
-        <w:t>Hormones</w:t>
-      </w:r>
-      <w:r>
-        <w:t xml:space="preserve"> are a third mode of communication in the body, chemical substances secreted by the </w:t>
-      </w:r>
-      <w:r>
-        <w:rPr>
-          <w:b/>
-          <w:color w:val="0F2744"/>
-        </w:rPr>
-        <w:t>endocrine glands</w:t>
+        <w:t>Parkinson's disease</w:t>
       </w:r>
       <w:r>
         <w:t xml:space="preserve"> </w:t>
@@ -4593,10 +4247,20 @@
           <w:color w:val="6B4E00"/>
           <w:shd w:val="clear" w:color="auto" w:fill="FFF3D6"/>
         </w:rPr>
-        <w:t>(ductless glands that release into the blood)</w:t>
-      </w:r>
-      <w:r>
-        <w:t xml:space="preserve"> or by cells in organs such as the stomach and kidneys.</w:t>
+        <w:t>(a movement disorder with tremor and stiffness)</w:t>
+      </w:r>
+      <w:r>
+        <w:t xml:space="preserve"> while its excess is linked to </w:t>
+      </w:r>
+      <w:r>
+        <w:rPr>
+          <w:b/>
+          <w:color w:val="0F2744"/>
+        </w:rPr>
+        <w:t>schizophrenia</w:t>
+      </w:r>
+      <w:r>
+        <w:t>, so this one transmitter connects both a neurological and a psychiatric disorder a clinical psychologist must understand.</w:t>
       </w:r>
     </w:p>
     <w:p>
@@ -4604,34 +4268,64 @@
         <w:pStyle w:val="ListNumber"/>
       </w:pPr>
       <w:r>
-        <w:t xml:space="preserve">Hormones fall into three chemical classes, </w:t>
-      </w:r>
-      <w:r>
         <w:rPr>
           <w:b/>
           <w:color w:val="0F2744"/>
         </w:rPr>
-        <w:t>amino-acid derivatives</w:t>
-      </w:r>
-      <w:r>
-        <w:t xml:space="preserve">, </w:t>
+        <w:t>Noradrenaline</w:t>
+      </w:r>
+      <w:r>
+        <w:t xml:space="preserve"> is an excitatory monoamine from the locus coeruleus that plays a key role in </w:t>
       </w:r>
       <w:r>
         <w:rPr>
           <w:b/>
           <w:color w:val="0F2744"/>
         </w:rPr>
-        <w:t>peptides and proteins</w:t>
-      </w:r>
-      <w:r>
-        <w:t xml:space="preserve">, and </w:t>
-      </w:r>
+        <w:t>attention and arousal</w:t>
+      </w:r>
+      <w:r>
+        <w:t>, as well as heart rate, blood pressure and digestive processes.</w:t>
+      </w:r>
+    </w:p>
+    <w:p>
+      <w:pPr>
+        <w:pStyle w:val="ListNumber"/>
+      </w:pPr>
       <w:r>
         <w:rPr>
           <w:b/>
           <w:color w:val="0F2744"/>
         </w:rPr>
-        <w:t>steroids</w:t>
+        <w:t>Acetylcholine (ACh)</w:t>
+      </w:r>
+      <w:r>
+        <w:t xml:space="preserve">, the first neurotransmitter ever identified, acts in both the PNS and CNS, and its deficiency is one of the causes of </w:t>
+      </w:r>
+      <w:r>
+        <w:rPr>
+          <w:b/>
+          <w:color w:val="0F2744"/>
+        </w:rPr>
+        <w:t>Alzheimer's disease</w:t>
+      </w:r>
+      <w:r>
+        <w:t xml:space="preserve"> with its memory loss, which is why several dementia drugs aim to preserve acetylcholine at the synapse.</w:t>
+      </w:r>
+    </w:p>
+    <w:p>
+      <w:pPr>
+        <w:pStyle w:val="ListNumber"/>
+      </w:pPr>
+      <w:r>
+        <w:t xml:space="preserve">The synapse is the main site of action of most </w:t>
+      </w:r>
+      <w:r>
+        <w:rPr>
+          <w:b/>
+          <w:color w:val="0F2744"/>
+        </w:rPr>
+        <w:t>psychoactive drugs</w:t>
       </w:r>
       <w:r>
         <w:t xml:space="preserve"> </w:t>
@@ -4642,91 +4336,17 @@
           <w:color w:val="6B4E00"/>
           <w:shd w:val="clear" w:color="auto" w:fill="FFF3D6"/>
         </w:rPr>
-        <w:t>(fat-based hormones made from cholesterol)</w:t>
-      </w:r>
-      <w:r>
-        <w:t>, and this chemistry shapes how each hormone acts on its targets.</w:t>
-      </w:r>
-    </w:p>
-    <w:p>
-      <w:pPr>
-        <w:pStyle w:val="ListNumber"/>
-      </w:pPr>
-      <w:r>
-        <w:t xml:space="preserve">Hormones are released into the </w:t>
+        <w:t>(substances that change mood, perception or behaviour)</w:t>
+      </w:r>
+      <w:r>
+        <w:t xml:space="preserve">, for example cocaine blocks </w:t>
       </w:r>
       <w:r>
         <w:rPr>
           <w:b/>
           <w:color w:val="0F2744"/>
         </w:rPr>
-        <w:t>extracellular fluid</w:t>
-      </w:r>
-      <w:r>
-        <w:t xml:space="preserve"> and carried in the </w:t>
-      </w:r>
-      <w:r>
-        <w:rPr>
-          <w:b/>
-          <w:color w:val="0F2744"/>
-        </w:rPr>
-        <w:t>bloodstream</w:t>
-      </w:r>
-      <w:r>
-        <w:t xml:space="preserve"> to distant target cells, so unlike synaptic signals they can influence the whole body at once.</w:t>
-      </w:r>
-    </w:p>
-    <w:p>
-      <w:pPr>
-        <w:pStyle w:val="ListNumber"/>
-      </w:pPr>
-      <w:r>
-        <w:t xml:space="preserve">Because many neurons carry </w:t>
-      </w:r>
-      <w:r>
-        <w:rPr>
-          <w:b/>
-          <w:color w:val="0F2744"/>
-        </w:rPr>
-        <w:t>hormone receptors</w:t>
-      </w:r>
-      <w:r>
-        <w:t xml:space="preserve">, hormones can directly change behaviour; for example </w:t>
-      </w:r>
-      <w:r>
-        <w:rPr>
-          <w:b/>
-          <w:color w:val="0F2744"/>
-        </w:rPr>
-        <w:t>testosterone</w:t>
-      </w:r>
-      <w:r>
-        <w:t>, a sex hormone, increases aggressiveness in male animals.</w:t>
-      </w:r>
-    </w:p>
-    <w:p>
-      <w:pPr>
-        <w:pStyle w:val="ListNumber"/>
-      </w:pPr>
-      <w:r>
-        <w:t xml:space="preserve">The </w:t>
-      </w:r>
-      <w:r>
-        <w:rPr>
-          <w:b/>
-          <w:color w:val="0F2744"/>
-        </w:rPr>
-        <w:t>adrenal glands</w:t>
-      </w:r>
-      <w:r>
-        <w:t xml:space="preserve"> release hormones for the </w:t>
-      </w:r>
-      <w:r>
-        <w:rPr>
-          <w:b/>
-          <w:color w:val="0F2744"/>
-        </w:rPr>
-        <w:t>stress response</w:t>
+        <w:t>dopamine reuptake</w:t>
       </w:r>
       <w:r>
         <w:t xml:space="preserve"> </w:t>
@@ -4737,10 +4357,10 @@
           <w:color w:val="6B4E00"/>
           <w:shd w:val="clear" w:color="auto" w:fill="FFF3D6"/>
         </w:rPr>
-        <w:t>(the body's reaction to threat)</w:t>
-      </w:r>
-      <w:r>
-        <w:t>, preparing the body to react quickly during demanding or frightening situations.</w:t>
+        <w:t>(reabsorption of the transmitter back into the sending neuron)</w:t>
+      </w:r>
+      <w:r>
+        <w:t xml:space="preserve"> so its effect is intensified and prolonged in the synaptic cleft.</w:t>
       </w:r>
     </w:p>
     <w:p>
@@ -4748,60 +4368,14 @@
         <w:pStyle w:val="ListNumber"/>
       </w:pPr>
       <w:r>
-        <w:t xml:space="preserve">The </w:t>
+        <w:t xml:space="preserve">Signalling is kept precise by stopping it promptly, as transmitters are cleared by </w:t>
       </w:r>
       <w:r>
         <w:rPr>
           <w:b/>
           <w:color w:val="0F2744"/>
         </w:rPr>
-        <w:t>hypothalamus</w:t>
-      </w:r>
-      <w:r>
-        <w:t xml:space="preserve"> controls sleep, hunger and appetite, acting as a key link between the nervous system and the endocrine system that keeps basic drives regulated.</w:t>
-      </w:r>
-    </w:p>
-    <w:p>
-      <w:pPr>
-        <w:pStyle w:val="ListNumber"/>
-      </w:pPr>
-      <w:r>
-        <w:t xml:space="preserve">The </w:t>
-      </w:r>
-      <w:r>
-        <w:rPr>
-          <w:b/>
-          <w:color w:val="0F2744"/>
-        </w:rPr>
-        <w:t>ovaries and testicles (gonads)</w:t>
-      </w:r>
-      <w:r>
-        <w:t xml:space="preserve"> control female and male characteristics by secreting the sex hormones that govern reproduction and the development of secondary sexual traits.</w:t>
-      </w:r>
-    </w:p>
-    <w:p>
-      <w:pPr>
-        <w:pStyle w:val="ListNumber"/>
-      </w:pPr>
-      <w:r>
-        <w:t xml:space="preserve">The </w:t>
-      </w:r>
-      <w:r>
-        <w:rPr>
-          <w:b/>
-          <w:color w:val="0F2744"/>
-        </w:rPr>
-        <w:t>pancreas</w:t>
-      </w:r>
-      <w:r>
-        <w:t xml:space="preserve"> releases </w:t>
-      </w:r>
-      <w:r>
-        <w:rPr>
-          <w:b/>
-          <w:color w:val="0F2744"/>
-        </w:rPr>
-        <w:t>insulin</w:t>
+        <w:t>reuptake</w:t>
       </w:r>
       <w:r>
         <w:t xml:space="preserve"> </w:t>
@@ -4812,111 +4386,17 @@
           <w:color w:val="6B4E00"/>
           <w:shd w:val="clear" w:color="auto" w:fill="FFF3D6"/>
         </w:rPr>
-        <w:t>(the hormone that lowers blood sugar)</w:t>
-      </w:r>
-      <w:r>
-        <w:t xml:space="preserve"> and so controls the level of glucose in the body, a balance that is essential for steady energy supply to the brain.</w:t>
-      </w:r>
-    </w:p>
-    <w:p>
-      <w:pPr>
-        <w:pStyle w:val="ListNumber"/>
-      </w:pPr>
-      <w:r>
-        <w:t xml:space="preserve">The </w:t>
+        <w:t>(reabsorption back into the sending neuron)</w:t>
+      </w:r>
+      <w:r>
+        <w:t xml:space="preserve"> or by enzymes, and </w:t>
       </w:r>
       <w:r>
         <w:rPr>
           <w:b/>
           <w:color w:val="0F2744"/>
         </w:rPr>
-        <w:t>parathyroid glands</w:t>
-      </w:r>
-      <w:r>
-        <w:t xml:space="preserve"> retain and regulate the body's </w:t>
-      </w:r>
-      <w:r>
-        <w:rPr>
-          <w:b/>
-          <w:color w:val="0F2744"/>
-        </w:rPr>
-        <w:t>calcium</w:t>
-      </w:r>
-      <w:r>
-        <w:t xml:space="preserve"> levels, while the </w:t>
-      </w:r>
-      <w:r>
-        <w:rPr>
-          <w:b/>
-          <w:color w:val="0F2744"/>
-        </w:rPr>
-        <w:t>pineal body</w:t>
-      </w:r>
-      <w:r>
-        <w:t xml:space="preserve"> secretes melatonin to maintain sleep cycles and other daily biological rhythms.</w:t>
-      </w:r>
-    </w:p>
-    <w:p>
-      <w:pPr>
-        <w:pStyle w:val="ListNumber"/>
-      </w:pPr>
-      <w:r>
-        <w:t xml:space="preserve">The </w:t>
-      </w:r>
-      <w:r>
-        <w:rPr>
-          <w:b/>
-          <w:color w:val="0F2744"/>
-        </w:rPr>
-        <w:t>pituitary gland</w:t>
-      </w:r>
-      <w:r>
-        <w:t xml:space="preserve"> is often called the master gland because it helps </w:t>
-      </w:r>
-      <w:r>
-        <w:rPr>
-          <w:b/>
-          <w:color w:val="0F2744"/>
-        </w:rPr>
-        <w:t>maintain the other endocrine glands</w:t>
-      </w:r>
-      <w:r>
-        <w:t xml:space="preserve">, while the </w:t>
-      </w:r>
-      <w:r>
-        <w:rPr>
-          <w:b/>
-          <w:color w:val="0F2744"/>
-        </w:rPr>
-        <w:t>thymus</w:t>
-      </w:r>
-      <w:r>
-        <w:t xml:space="preserve"> supports the body's immune system.</w:t>
-      </w:r>
-    </w:p>
-    <w:p>
-      <w:pPr>
-        <w:pStyle w:val="ListNumber"/>
-      </w:pPr>
-      <w:r>
-        <w:t xml:space="preserve">The </w:t>
-      </w:r>
-      <w:r>
-        <w:rPr>
-          <w:b/>
-          <w:color w:val="0F2744"/>
-        </w:rPr>
-        <w:t>thyroid gland</w:t>
-      </w:r>
-      <w:r>
-        <w:t xml:space="preserve"> maintains the body's </w:t>
-      </w:r>
-      <w:r>
-        <w:rPr>
-          <w:b/>
-          <w:color w:val="0F2744"/>
-        </w:rPr>
-        <w:t>metabolism</w:t>
+        <w:t>autoreceptors</w:t>
       </w:r>
       <w:r>
         <w:t xml:space="preserve"> </w:t>
@@ -4927,10 +4407,10 @@
           <w:color w:val="6B4E00"/>
           <w:shd w:val="clear" w:color="auto" w:fill="FFF3D6"/>
         </w:rPr>
-        <w:t>(the rate at which the body uses energy)</w:t>
-      </w:r>
-      <w:r>
-        <w:t>, including bone growth and heat production, so it influences overall energy and activity levels.</w:t>
+        <w:t>(self-sensing receptors on the sending neuron that monitor how much it has released)</w:t>
+      </w:r>
+      <w:r>
+        <w:t xml:space="preserve"> give feedback that controls further release.</w:t>
       </w:r>
     </w:p>
     <w:p>
@@ -4938,10 +4418,808 @@
         <w:pStyle w:val="ListNumber"/>
       </w:pPr>
       <w:r>
+        <w:t xml:space="preserve">The clinical thread running through this whole topic is that </w:t>
+      </w:r>
+      <w:r>
         <w:rPr>
           <w:b/>
           <w:color w:val="0F2744"/>
         </w:rPr>
+        <w:t>drugs act at the synapse</w:t>
+      </w:r>
+      <w:r>
+        <w:t>: by changing how much transmitter is released, how long it lingers, or which receptors it reaches, antidepressants, antipsychotics and anti-anxiety agents all exert their effects exactly here, which is why mastering synaptic transmission underpins understanding psychopharmacology.</w:t>
+      </w:r>
+    </w:p>
+    <w:p>
+      <w:pPr>
+        <w:spacing w:after="80"/>
+      </w:pPr>
+      <w:r>
+        <w:rPr>
+          <w:b/>
+          <w:color w:val="5A6A7E"/>
+          <w:sz w:val="20"/>
+        </w:rPr>
+        <w:t>FLOWCHART · HOW A CHEMICAL MESSAGE CROSSES THE SYNAPSE</w:t>
+      </w:r>
+    </w:p>
+    <w:p>
+      <w:r>
+        <w:rPr>
+          <w:b/>
+          <w:color w:val="1D5FA6"/>
+          <w:sz w:val="20"/>
+        </w:rPr>
+        <w:t>[ Impulse reaches terminal — arrives ]</w:t>
+      </w:r>
+      <w:r>
+        <w:rPr>
+          <w:b/>
+          <w:color w:val="1D5FA6"/>
+        </w:rPr>
+        <w:t xml:space="preserve">  →  </w:t>
+      </w:r>
+      <w:r>
+        <w:rPr>
+          <w:b/>
+          <w:color w:val="1D5FA6"/>
+          <w:sz w:val="20"/>
+        </w:rPr>
+        <w:t>[ Ca2+ enters — channels open ]</w:t>
+      </w:r>
+      <w:r>
+        <w:rPr>
+          <w:b/>
+          <w:color w:val="1D5FA6"/>
+        </w:rPr>
+        <w:t xml:space="preserve">  →  </w:t>
+      </w:r>
+      <w:r>
+        <w:rPr>
+          <w:b/>
+          <w:color w:val="1D5FA6"/>
+          <w:sz w:val="20"/>
+        </w:rPr>
+        <w:t>[ Vesicles fuse (exocytosis) — release ]</w:t>
+      </w:r>
+      <w:r>
+        <w:rPr>
+          <w:b/>
+          <w:color w:val="1D5FA6"/>
+        </w:rPr>
+        <w:t xml:space="preserve">  →  </w:t>
+      </w:r>
+      <w:r>
+        <w:rPr>
+          <w:b/>
+          <w:color w:val="1D5FA6"/>
+          <w:sz w:val="20"/>
+        </w:rPr>
+        <w:t>[ Transmitter crosses cleft — diffusion ]</w:t>
+      </w:r>
+      <w:r>
+        <w:rPr>
+          <w:b/>
+          <w:color w:val="1D5FA6"/>
+        </w:rPr>
+        <w:t xml:space="preserve">  →  </w:t>
+      </w:r>
+      <w:r>
+        <w:rPr>
+          <w:b/>
+          <w:color w:val="1D5FA6"/>
+          <w:sz w:val="20"/>
+        </w:rPr>
+        <w:t>[ Binds postsynaptic receptors — excite / inhibit ]</w:t>
+      </w:r>
+      <w:r>
+        <w:rPr>
+          <w:b/>
+          <w:color w:val="1D5FA6"/>
+        </w:rPr>
+        <w:t xml:space="preserve">  →  </w:t>
+      </w:r>
+      <w:r>
+        <w:rPr>
+          <w:b/>
+          <w:color w:val="0F2744"/>
+          <w:sz w:val="20"/>
+        </w:rPr>
+        <w:t>[ Reuptake or enzyme clears it — signal ends ]</w:t>
+      </w:r>
+    </w:p>
+    <w:p>
+      <w:pPr>
+        <w:spacing w:after="80"/>
+      </w:pPr>
+      <w:r>
+        <w:rPr>
+          <w:b/>
+          <w:color w:val="5A6A7E"/>
+          <w:sz w:val="20"/>
+        </w:rPr>
+        <w:t>MNEMONIC</w:t>
+      </w:r>
+    </w:p>
+    <w:p>
+      <w:r>
+        <w:rPr>
+          <w:b/>
+          <w:color w:val="0E7C6B"/>
+          <w:sz w:val="30"/>
+        </w:rPr>
+        <w:t>GGGSDNA</w:t>
+      </w:r>
+    </w:p>
+    <w:p>
+      <w:r>
+        <w:rPr>
+          <w:i/>
+        </w:rPr>
+        <w:t>"Good Girls Give Sweets, Dad Needs Acetylcholine" lists the main transmitters (G-G-G-S-D-N-A).</w:t>
+      </w:r>
+    </w:p>
+    <w:p>
+      <w:pPr>
+        <w:pStyle w:val="ListBullet"/>
+      </w:pPr>
+      <w:r>
+        <w:rPr>
+          <w:b/>
+          <w:color w:val="0E7C6B"/>
+        </w:rPr>
+        <w:t xml:space="preserve">G: </w:t>
+      </w:r>
+      <w:r>
+        <w:rPr>
+          <w:b/>
+          <w:color w:val="0F2744"/>
+        </w:rPr>
+        <w:t>GABA</w:t>
+      </w:r>
+      <w:r>
+        <w:t>, the major inhibitory transmitter.</w:t>
+      </w:r>
+    </w:p>
+    <w:p>
+      <w:pPr>
+        <w:pStyle w:val="ListBullet"/>
+      </w:pPr>
+      <w:r>
+        <w:rPr>
+          <w:b/>
+          <w:color w:val="0E7C6B"/>
+        </w:rPr>
+        <w:t xml:space="preserve">G: </w:t>
+      </w:r>
+      <w:r>
+        <w:rPr>
+          <w:b/>
+          <w:color w:val="0F2744"/>
+        </w:rPr>
+        <w:t>Glycine</w:t>
+      </w:r>
+      <w:r>
+        <w:t>, inhibitory in the spinal cord.</w:t>
+      </w:r>
+    </w:p>
+    <w:p>
+      <w:pPr>
+        <w:pStyle w:val="ListBullet"/>
+      </w:pPr>
+      <w:r>
+        <w:rPr>
+          <w:b/>
+          <w:color w:val="0E7C6B"/>
+        </w:rPr>
+        <w:t xml:space="preserve">G: </w:t>
+      </w:r>
+      <w:r>
+        <w:rPr>
+          <w:b/>
+          <w:color w:val="0F2744"/>
+        </w:rPr>
+        <w:t>Glutamate</w:t>
+      </w:r>
+      <w:r>
+        <w:t>, the main excitatory transmitter.</w:t>
+      </w:r>
+    </w:p>
+    <w:p>
+      <w:pPr>
+        <w:pStyle w:val="ListBullet"/>
+      </w:pPr>
+      <w:r>
+        <w:rPr>
+          <w:b/>
+          <w:color w:val="0E7C6B"/>
+        </w:rPr>
+        <w:t xml:space="preserve">S: </w:t>
+      </w:r>
+      <w:r>
+        <w:rPr>
+          <w:b/>
+          <w:color w:val="0F2744"/>
+        </w:rPr>
+        <w:t>Serotonin</w:t>
+      </w:r>
+      <w:r>
+        <w:t>, mood, sleep and appetite.</w:t>
+      </w:r>
+    </w:p>
+    <w:p>
+      <w:pPr>
+        <w:pStyle w:val="ListBullet"/>
+      </w:pPr>
+      <w:r>
+        <w:rPr>
+          <w:b/>
+          <w:color w:val="0E7C6B"/>
+        </w:rPr>
+        <w:t xml:space="preserve">D: </w:t>
+      </w:r>
+      <w:r>
+        <w:rPr>
+          <w:b/>
+          <w:color w:val="0F2744"/>
+        </w:rPr>
+        <w:t>Dopamine</w:t>
+      </w:r>
+      <w:r>
+        <w:t>, movement, reward and psychosis.</w:t>
+      </w:r>
+    </w:p>
+    <w:p>
+      <w:pPr>
+        <w:pStyle w:val="ListBullet"/>
+      </w:pPr>
+      <w:r>
+        <w:rPr>
+          <w:b/>
+          <w:color w:val="0E7C6B"/>
+        </w:rPr>
+        <w:t xml:space="preserve">N: </w:t>
+      </w:r>
+      <w:r>
+        <w:rPr>
+          <w:b/>
+          <w:color w:val="0F2744"/>
+        </w:rPr>
+        <w:t>Noradrenaline</w:t>
+      </w:r>
+      <w:r>
+        <w:t>, attention and arousal.</w:t>
+      </w:r>
+    </w:p>
+    <w:p>
+      <w:pPr>
+        <w:pStyle w:val="ListBullet"/>
+      </w:pPr>
+      <w:r>
+        <w:rPr>
+          <w:b/>
+          <w:color w:val="0E7C6B"/>
+        </w:rPr>
+        <w:t xml:space="preserve">A: </w:t>
+      </w:r>
+      <w:r>
+        <w:rPr>
+          <w:b/>
+          <w:color w:val="0F2744"/>
+        </w:rPr>
+        <w:t>Acetylcholine</w:t>
+      </w:r>
+      <w:r>
+        <w:t>, the first transmitter, tied to memory.</w:t>
+      </w:r>
+    </w:p>
+    <w:p>
+      <w:r>
+        <w:br w:type="page"/>
+      </w:r>
+    </w:p>
+    <w:p>
+      <w:pPr>
+        <w:pStyle w:val="Heading1"/>
+      </w:pPr>
+      <w:r>
+        <w:rPr>
+          <w:color w:val="0F2744"/>
+        </w:rPr>
+        <w:t>7. Neuromodulators and Hormones</w:t>
+      </w:r>
+    </w:p>
+    <w:p>
+      <w:r>
+        <w:rPr>
+          <w:i/>
+        </w:rPr>
+        <w:t>Beyond fast synapses, neuromodulators and hormones tune behaviour more slowly and over wider reaches of the body, and this broader, slower chemistry is what links the nervous and endocrine systems to lasting states such as stress, mood, sleep and arousal that are central to clinical work.</w:t>
+      </w:r>
+    </w:p>
+    <w:p>
+      <w:pPr>
+        <w:spacing w:after="80"/>
+      </w:pPr>
+      <w:r>
+        <w:rPr>
+          <w:b/>
+          <w:color w:val="5A6A7E"/>
+          <w:sz w:val="20"/>
+        </w:rPr>
+        <w:t>KEY POINTS (EXAM-READY, ONE FULL SENTENCE EACH)</w:t>
+      </w:r>
+    </w:p>
+    <w:p>
+      <w:pPr>
+        <w:pStyle w:val="ListNumber"/>
+      </w:pPr>
+      <w:r>
+        <w:rPr>
+          <w:b/>
+          <w:color w:val="0F2744"/>
+        </w:rPr>
+        <w:t>Neuromodulators</w:t>
+      </w:r>
+      <w:r>
+        <w:t xml:space="preserve"> are a slower mode of chemical communication, released by neurons but travelling </w:t>
+      </w:r>
+      <w:r>
+        <w:rPr>
+          <w:b/>
+          <w:color w:val="0F2744"/>
+        </w:rPr>
+        <w:t>larger distances</w:t>
+      </w:r>
+      <w:r>
+        <w:t xml:space="preserve"> and spreading more widely through the nervous system than ordinary point-to-point transmitters.</w:t>
+      </w:r>
+    </w:p>
+    <w:p>
+      <w:pPr>
+        <w:pStyle w:val="ListNumber"/>
+      </w:pPr>
+      <w:r>
+        <w:t xml:space="preserve">Many neuromodulators are </w:t>
+      </w:r>
+      <w:r>
+        <w:rPr>
+          <w:b/>
+          <w:color w:val="0F2744"/>
+        </w:rPr>
+        <w:t>neuropeptides</w:t>
+      </w:r>
+      <w:r>
+        <w:t xml:space="preserve"> </w:t>
+      </w:r>
+      <w:r>
+        <w:rPr>
+          <w:i/>
+          <w:color w:val="6B4E00"/>
+          <w:shd w:val="clear" w:color="auto" w:fill="FFF3D6"/>
+        </w:rPr>
+        <w:t>(short chains of amino acids linked by peptide bonds)</w:t>
+      </w:r>
+      <w:r>
+        <w:t>, protein-like molecules that act alongside classical neurotransmitters rather than replacing them.</w:t>
+      </w:r>
+    </w:p>
+    <w:p>
+      <w:pPr>
+        <w:pStyle w:val="ListNumber"/>
+      </w:pPr>
+      <w:r>
+        <w:t xml:space="preserve">Rather than simply exciting or inhibiting one cell, neuromodulators </w:t>
+      </w:r>
+      <w:r>
+        <w:rPr>
+          <w:b/>
+          <w:color w:val="0F2744"/>
+        </w:rPr>
+        <w:t>adjust the general state</w:t>
+      </w:r>
+      <w:r>
+        <w:t xml:space="preserve"> of many neurons, shaping broad conditions such as alertness, attentiveness and anxiety.</w:t>
+      </w:r>
+    </w:p>
+    <w:p>
+      <w:pPr>
+        <w:pStyle w:val="ListNumber"/>
+      </w:pPr>
+      <w:r>
+        <w:t xml:space="preserve">Neuropeptides typically work by </w:t>
+      </w:r>
+      <w:r>
+        <w:rPr>
+          <w:b/>
+          <w:color w:val="0F2744"/>
+        </w:rPr>
+        <w:t>raising or lowering the release</w:t>
+      </w:r>
+      <w:r>
+        <w:t xml:space="preserve"> of other neurotransmitters or by altering how strongly postsynaptic cells respond, so they fine-tune signalling rather than carry it alone.</w:t>
+      </w:r>
+    </w:p>
+    <w:p>
+      <w:pPr>
+        <w:pStyle w:val="ListNumber"/>
+      </w:pPr>
+      <w:r>
+        <w:rPr>
+          <w:b/>
+          <w:color w:val="0F2744"/>
+        </w:rPr>
+        <w:t>Hormones</w:t>
+      </w:r>
+      <w:r>
+        <w:t xml:space="preserve"> are a third mode of communication in the body, chemical substances secreted by the </w:t>
+      </w:r>
+      <w:r>
+        <w:rPr>
+          <w:b/>
+          <w:color w:val="0F2744"/>
+        </w:rPr>
+        <w:t>endocrine glands</w:t>
+      </w:r>
+      <w:r>
+        <w:t xml:space="preserve"> </w:t>
+      </w:r>
+      <w:r>
+        <w:rPr>
+          <w:i/>
+          <w:color w:val="6B4E00"/>
+          <w:shd w:val="clear" w:color="auto" w:fill="FFF3D6"/>
+        </w:rPr>
+        <w:t>(ductless glands that release into the blood)</w:t>
+      </w:r>
+      <w:r>
+        <w:t xml:space="preserve"> or by cells in organs such as the stomach and kidneys.</w:t>
+      </w:r>
+    </w:p>
+    <w:p>
+      <w:pPr>
+        <w:pStyle w:val="ListNumber"/>
+      </w:pPr>
+      <w:r>
+        <w:t xml:space="preserve">Hormones fall into three chemical classes, </w:t>
+      </w:r>
+      <w:r>
+        <w:rPr>
+          <w:b/>
+          <w:color w:val="0F2744"/>
+        </w:rPr>
+        <w:t>amino-acid derivatives</w:t>
+      </w:r>
+      <w:r>
+        <w:t xml:space="preserve">, </w:t>
+      </w:r>
+      <w:r>
+        <w:rPr>
+          <w:b/>
+          <w:color w:val="0F2744"/>
+        </w:rPr>
+        <w:t>peptides and proteins</w:t>
+      </w:r>
+      <w:r>
+        <w:t xml:space="preserve">, and </w:t>
+      </w:r>
+      <w:r>
+        <w:rPr>
+          <w:b/>
+          <w:color w:val="0F2744"/>
+        </w:rPr>
+        <w:t>steroids</w:t>
+      </w:r>
+      <w:r>
+        <w:t xml:space="preserve"> </w:t>
+      </w:r>
+      <w:r>
+        <w:rPr>
+          <w:i/>
+          <w:color w:val="6B4E00"/>
+          <w:shd w:val="clear" w:color="auto" w:fill="FFF3D6"/>
+        </w:rPr>
+        <w:t>(fat-based hormones made from cholesterol)</w:t>
+      </w:r>
+      <w:r>
+        <w:t>, and this chemistry shapes how each hormone acts on its targets.</w:t>
+      </w:r>
+    </w:p>
+    <w:p>
+      <w:pPr>
+        <w:pStyle w:val="ListNumber"/>
+      </w:pPr>
+      <w:r>
+        <w:t xml:space="preserve">Hormones are released into the </w:t>
+      </w:r>
+      <w:r>
+        <w:rPr>
+          <w:b/>
+          <w:color w:val="0F2744"/>
+        </w:rPr>
+        <w:t>extracellular fluid</w:t>
+      </w:r>
+      <w:r>
+        <w:t xml:space="preserve"> and carried in the </w:t>
+      </w:r>
+      <w:r>
+        <w:rPr>
+          <w:b/>
+          <w:color w:val="0F2744"/>
+        </w:rPr>
+        <w:t>bloodstream</w:t>
+      </w:r>
+      <w:r>
+        <w:t xml:space="preserve"> to distant target cells, so unlike synaptic signals they can influence the whole body at once.</w:t>
+      </w:r>
+    </w:p>
+    <w:p>
+      <w:pPr>
+        <w:pStyle w:val="ListNumber"/>
+      </w:pPr>
+      <w:r>
+        <w:t xml:space="preserve">Because many neurons carry </w:t>
+      </w:r>
+      <w:r>
+        <w:rPr>
+          <w:b/>
+          <w:color w:val="0F2744"/>
+        </w:rPr>
+        <w:t>hormone receptors</w:t>
+      </w:r>
+      <w:r>
+        <w:t xml:space="preserve">, hormones can directly change behaviour; for example </w:t>
+      </w:r>
+      <w:r>
+        <w:rPr>
+          <w:b/>
+          <w:color w:val="0F2744"/>
+        </w:rPr>
+        <w:t>testosterone</w:t>
+      </w:r>
+      <w:r>
+        <w:t>, a sex hormone, increases aggressiveness in male animals.</w:t>
+      </w:r>
+    </w:p>
+    <w:p>
+      <w:pPr>
+        <w:pStyle w:val="ListNumber"/>
+      </w:pPr>
+      <w:r>
+        <w:t xml:space="preserve">The </w:t>
+      </w:r>
+      <w:r>
+        <w:rPr>
+          <w:b/>
+          <w:color w:val="0F2744"/>
+        </w:rPr>
+        <w:t>adrenal glands</w:t>
+      </w:r>
+      <w:r>
+        <w:t xml:space="preserve"> release hormones for the </w:t>
+      </w:r>
+      <w:r>
+        <w:rPr>
+          <w:b/>
+          <w:color w:val="0F2744"/>
+        </w:rPr>
+        <w:t>stress response</w:t>
+      </w:r>
+      <w:r>
+        <w:t xml:space="preserve"> </w:t>
+      </w:r>
+      <w:r>
+        <w:rPr>
+          <w:i/>
+          <w:color w:val="6B4E00"/>
+          <w:shd w:val="clear" w:color="auto" w:fill="FFF3D6"/>
+        </w:rPr>
+        <w:t>(the body's fight-or-flight reaction to threat)</w:t>
+      </w:r>
+      <w:r>
+        <w:t>, preparing the body to react quickly during demanding or frightening situations, a system directly relevant to understanding anxiety and chronic stress in the clinic.</w:t>
+      </w:r>
+    </w:p>
+    <w:p>
+      <w:pPr>
+        <w:pStyle w:val="ListNumber"/>
+      </w:pPr>
+      <w:r>
+        <w:t xml:space="preserve">The </w:t>
+      </w:r>
+      <w:r>
+        <w:rPr>
+          <w:b/>
+          <w:color w:val="0F2744"/>
+        </w:rPr>
+        <w:t>hypothalamus</w:t>
+      </w:r>
+      <w:r>
+        <w:t xml:space="preserve"> controls sleep, hunger and appetite, acting as a key link between the nervous system and the endocrine system that keeps basic drives regulated.</w:t>
+      </w:r>
+    </w:p>
+    <w:p>
+      <w:pPr>
+        <w:pStyle w:val="ListNumber"/>
+      </w:pPr>
+      <w:r>
+        <w:t xml:space="preserve">The </w:t>
+      </w:r>
+      <w:r>
+        <w:rPr>
+          <w:b/>
+          <w:color w:val="0F2744"/>
+        </w:rPr>
+        <w:t>ovaries and testicles (gonads)</w:t>
+      </w:r>
+      <w:r>
+        <w:t xml:space="preserve"> control female and male characteristics by secreting the sex hormones that govern reproduction and the development of secondary sexual traits.</w:t>
+      </w:r>
+    </w:p>
+    <w:p>
+      <w:pPr>
+        <w:pStyle w:val="ListNumber"/>
+      </w:pPr>
+      <w:r>
+        <w:t xml:space="preserve">The </w:t>
+      </w:r>
+      <w:r>
+        <w:rPr>
+          <w:b/>
+          <w:color w:val="0F2744"/>
+        </w:rPr>
+        <w:t>pancreas</w:t>
+      </w:r>
+      <w:r>
+        <w:t xml:space="preserve"> releases </w:t>
+      </w:r>
+      <w:r>
+        <w:rPr>
+          <w:b/>
+          <w:color w:val="0F2744"/>
+        </w:rPr>
+        <w:t>insulin</w:t>
+      </w:r>
+      <w:r>
+        <w:t xml:space="preserve"> </w:t>
+      </w:r>
+      <w:r>
+        <w:rPr>
+          <w:i/>
+          <w:color w:val="6B4E00"/>
+          <w:shd w:val="clear" w:color="auto" w:fill="FFF3D6"/>
+        </w:rPr>
+        <w:t>(the hormone that lowers blood sugar)</w:t>
+      </w:r>
+      <w:r>
+        <w:t xml:space="preserve"> and so controls the level of glucose in the body, a balance that is essential for steady energy supply to the brain.</w:t>
+      </w:r>
+    </w:p>
+    <w:p>
+      <w:pPr>
+        <w:pStyle w:val="ListNumber"/>
+      </w:pPr>
+      <w:r>
+        <w:t xml:space="preserve">The </w:t>
+      </w:r>
+      <w:r>
+        <w:rPr>
+          <w:b/>
+          <w:color w:val="0F2744"/>
+        </w:rPr>
+        <w:t>parathyroid glands</w:t>
+      </w:r>
+      <w:r>
+        <w:t xml:space="preserve"> retain and regulate the body's </w:t>
+      </w:r>
+      <w:r>
+        <w:rPr>
+          <w:b/>
+          <w:color w:val="0F2744"/>
+        </w:rPr>
+        <w:t>calcium</w:t>
+      </w:r>
+      <w:r>
+        <w:t xml:space="preserve"> levels, while the </w:t>
+      </w:r>
+      <w:r>
+        <w:rPr>
+          <w:b/>
+          <w:color w:val="0F2744"/>
+        </w:rPr>
+        <w:t>pineal body</w:t>
+      </w:r>
+      <w:r>
+        <w:t xml:space="preserve"> secretes melatonin to maintain sleep cycles and other daily biological rhythms.</w:t>
+      </w:r>
+    </w:p>
+    <w:p>
+      <w:pPr>
+        <w:pStyle w:val="ListNumber"/>
+      </w:pPr>
+      <w:r>
+        <w:t xml:space="preserve">The </w:t>
+      </w:r>
+      <w:r>
+        <w:rPr>
+          <w:b/>
+          <w:color w:val="0F2744"/>
+        </w:rPr>
+        <w:t>pituitary gland</w:t>
+      </w:r>
+      <w:r>
+        <w:t xml:space="preserve"> is often called the master gland because it helps </w:t>
+      </w:r>
+      <w:r>
+        <w:rPr>
+          <w:b/>
+          <w:color w:val="0F2744"/>
+        </w:rPr>
+        <w:t>maintain the other endocrine glands</w:t>
+      </w:r>
+      <w:r>
+        <w:t xml:space="preserve">, while the </w:t>
+      </w:r>
+      <w:r>
+        <w:rPr>
+          <w:b/>
+          <w:color w:val="0F2744"/>
+        </w:rPr>
+        <w:t>thymus</w:t>
+      </w:r>
+      <w:r>
+        <w:t xml:space="preserve"> supports the body's immune system.</w:t>
+      </w:r>
+    </w:p>
+    <w:p>
+      <w:pPr>
+        <w:pStyle w:val="ListNumber"/>
+      </w:pPr>
+      <w:r>
+        <w:t xml:space="preserve">The </w:t>
+      </w:r>
+      <w:r>
+        <w:rPr>
+          <w:b/>
+          <w:color w:val="0F2744"/>
+        </w:rPr>
+        <w:t>thyroid gland</w:t>
+      </w:r>
+      <w:r>
+        <w:t xml:space="preserve"> maintains the body's </w:t>
+      </w:r>
+      <w:r>
+        <w:rPr>
+          <w:b/>
+          <w:color w:val="0F2744"/>
+        </w:rPr>
+        <w:t>metabolism</w:t>
+      </w:r>
+      <w:r>
+        <w:t xml:space="preserve"> </w:t>
+      </w:r>
+      <w:r>
+        <w:rPr>
+          <w:i/>
+          <w:color w:val="6B4E00"/>
+          <w:shd w:val="clear" w:color="auto" w:fill="FFF3D6"/>
+        </w:rPr>
+        <w:t>(the rate at which the body uses energy)</w:t>
+      </w:r>
+      <w:r>
+        <w:t>, including bone growth and heat production, so it influences overall energy and activity levels.</w:t>
+      </w:r>
+    </w:p>
+    <w:p>
+      <w:pPr>
+        <w:pStyle w:val="ListNumber"/>
+      </w:pPr>
+      <w:r>
+        <w:rPr>
+          <w:b/>
+          <w:color w:val="0F2744"/>
+        </w:rPr>
         <w:t>Melatonin</w:t>
       </w:r>
       <w:r>
@@ -4955,7 +5233,36 @@
         <w:t>sleep-wake cycle</w:t>
       </w:r>
       <w:r>
-        <w:t>, being made in darkness and kept low in daylight, which shows how a single molecule can act as both transmitter-related signal and hormone.</w:t>
+        <w:t xml:space="preserve"> </w:t>
+      </w:r>
+      <w:r>
+        <w:rPr>
+          <w:i/>
+          <w:color w:val="6B4E00"/>
+          <w:shd w:val="clear" w:color="auto" w:fill="FFF3D6"/>
+        </w:rPr>
+        <w:t>(the daily rhythm of sleeping and waking, also called the body clock)</w:t>
+      </w:r>
+      <w:r>
+        <w:t>, being made in darkness and kept low in daylight, which shows how a single molecule can act as both a transmitter-related signal and a hormone.</w:t>
+      </w:r>
+    </w:p>
+    <w:p>
+      <w:pPr>
+        <w:pStyle w:val="ListNumber"/>
+      </w:pPr>
+      <w:r>
+        <w:t xml:space="preserve">For the clinician the unifying idea is one of </w:t>
+      </w:r>
+      <w:r>
+        <w:rPr>
+          <w:b/>
+          <w:color w:val="0F2744"/>
+        </w:rPr>
+        <w:t>widening scope and slowing speed</w:t>
+      </w:r>
+      <w:r>
+        <w:t>: neurotransmitters act in milliseconds at a single synapse, neuromodulators shade the mood of whole circuits, and hormones act over minutes to days across the body, so disorders of stress, sleep, appetite and sexual function often trace back to this slower chemistry rather than to one fast synapse.</w:t>
       </w:r>
     </w:p>
     <w:p>

</xml_diff>

<commit_message>
feat: add labelled openly-licensed diagrams to Unit II notes (HTML + DOCX)
</commit_message>
<xml_diff>
--- a/Biological_Foundations_Unit2_Structure_and_Functions_of_Cells.docx
+++ b/Biological_Foundations_Unit2_Structure_and_Functions_of_Cells.docx
@@ -170,6 +170,24 @@
         <w:pStyle w:val="ListBullet"/>
       </w:pPr>
       <w:r>
+        <w:t xml:space="preserve">Several topics now carry a </w:t>
+      </w:r>
+      <w:r>
+        <w:rPr>
+          <w:b/>
+          <w:color w:val="0F2744"/>
+        </w:rPr>
+        <w:t>labelled diagram</w:t>
+      </w:r>
+      <w:r>
+        <w:t>; use each figure as a visual map, matching its labels to the numbered points and the flowchart so you can both picture and describe the structure in the exam.</w:t>
+      </w:r>
+    </w:p>
+    <w:p>
+      <w:pPr>
+        <w:pStyle w:val="ListBullet"/>
+      </w:pPr>
+      <w:r>
         <w:t>Revise by first reading the flowchart to fix the sequence, then the mnemonic to lock the key points, and finally the full sentences to add exam-ready detail and wording.</w:t>
       </w:r>
     </w:p>
@@ -763,6 +781,71 @@
     </w:p>
     <w:p>
       <w:pPr>
+        <w:jc w:val="center"/>
+      </w:pPr>
+      <w:r>
+        <w:drawing>
+          <wp:inline xmlns:a="http://schemas.openxmlformats.org/drawingml/2006/main" xmlns:pic="http://schemas.openxmlformats.org/drawingml/2006/picture">
+            <wp:extent cx="5029200" cy="3661886"/>
+            <wp:docPr id="1" name="Picture 1"/>
+            <wp:cNvGraphicFramePr>
+              <a:graphicFrameLocks noChangeAspect="1"/>
+            </wp:cNvGraphicFramePr>
+            <a:graphic>
+              <a:graphicData uri="http://schemas.openxmlformats.org/drawingml/2006/picture">
+                <pic:pic>
+                  <pic:nvPicPr>
+                    <pic:cNvPr id="0" name="neuron.png"/>
+                    <pic:cNvPicPr/>
+                  </pic:nvPicPr>
+                  <pic:blipFill>
+                    <a:blip r:embed="rId10"/>
+                    <a:stretch>
+                      <a:fillRect/>
+                    </a:stretch>
+                  </pic:blipFill>
+                  <pic:spPr>
+                    <a:xfrm>
+                      <a:off x="0" y="0"/>
+                      <a:ext cx="5029200" cy="3661886"/>
+                    </a:xfrm>
+                    <a:prstGeom prst="rect"/>
+                  </pic:spPr>
+                </pic:pic>
+              </a:graphicData>
+            </a:graphic>
+          </wp:inline>
+        </w:drawing>
+      </w:r>
+    </w:p>
+    <w:p>
+      <w:pPr>
+        <w:jc w:val="center"/>
+      </w:pPr>
+      <w:r>
+        <w:rPr>
+          <w:i/>
+          <w:color w:val="5A6A7E"/>
+          <w:sz w:val="18"/>
+        </w:rPr>
+        <w:t>Figure 1. Labelled structure of a typical neuron, showing the dendrites, cell body (soma), axon hillock, myelinated axon, nodes of Ranvier and the axon terminals — study it alongside the DRAMA flowchart below.</w:t>
+      </w:r>
+    </w:p>
+    <w:p>
+      <w:pPr>
+        <w:jc w:val="center"/>
+      </w:pPr>
+      <w:r>
+        <w:rPr>
+          <w:i/>
+          <w:color w:val="5A6A7E"/>
+          <w:sz w:val="16"/>
+        </w:rPr>
+        <w:t>Source: Wikimedia Commons, “Complete neuron cell diagram” by LadyofHats (Mariana Ruiz Villarreal). License: Public domain.</w:t>
+      </w:r>
+    </w:p>
+    <w:p>
+      <w:pPr>
         <w:spacing w:after="80"/>
       </w:pPr>
       <w:r>
@@ -1500,6 +1583,71 @@
     </w:p>
     <w:p>
       <w:pPr>
+        <w:jc w:val="center"/>
+      </w:pPr>
+      <w:r>
+        <w:drawing>
+          <wp:inline xmlns:a="http://schemas.openxmlformats.org/drawingml/2006/main" xmlns:pic="http://schemas.openxmlformats.org/drawingml/2006/picture">
+            <wp:extent cx="5029200" cy="4023360"/>
+            <wp:docPr id="2" name="Picture 2"/>
+            <wp:cNvGraphicFramePr>
+              <a:graphicFrameLocks noChangeAspect="1"/>
+            </wp:cNvGraphicFramePr>
+            <a:graphic>
+              <a:graphicData uri="http://schemas.openxmlformats.org/drawingml/2006/picture">
+                <pic:pic>
+                  <pic:nvPicPr>
+                    <pic:cNvPr id="0" name="glia.png"/>
+                    <pic:cNvPicPr/>
+                  </pic:nvPicPr>
+                  <pic:blipFill>
+                    <a:blip r:embed="rId11"/>
+                    <a:stretch>
+                      <a:fillRect/>
+                    </a:stretch>
+                  </pic:blipFill>
+                  <pic:spPr>
+                    <a:xfrm>
+                      <a:off x="0" y="0"/>
+                      <a:ext cx="5029200" cy="4023360"/>
+                    </a:xfrm>
+                    <a:prstGeom prst="rect"/>
+                  </pic:spPr>
+                </pic:pic>
+              </a:graphicData>
+            </a:graphic>
+          </wp:inline>
+        </w:drawing>
+      </w:r>
+    </w:p>
+    <w:p>
+      <w:pPr>
+        <w:jc w:val="center"/>
+      </w:pPr>
+      <w:r>
+        <w:rPr>
+          <w:i/>
+          <w:color w:val="5A6A7E"/>
+          <w:sz w:val="18"/>
+        </w:rPr>
+        <w:t>Figure 2. The main types of neuroglia shown together around neurons — astrocytes, oligodendrocytes, microglia and ependymal cells — matching the AOMRS mnemonic of glial jobs.</w:t>
+      </w:r>
+    </w:p>
+    <w:p>
+      <w:pPr>
+        <w:jc w:val="center"/>
+      </w:pPr>
+      <w:r>
+        <w:rPr>
+          <w:i/>
+          <w:color w:val="5A6A7E"/>
+          <w:sz w:val="16"/>
+        </w:rPr>
+        <w:t>Source: Wikimedia Commons, “Blausen 0870 Types of Neuroglia” by BruceBlaus / Blausen.com staff (2014). License: CC BY 3.0.</w:t>
+      </w:r>
+    </w:p>
+    <w:p>
+      <w:pPr>
         <w:spacing w:after="80"/>
       </w:pPr>
       <w:r>
@@ -2155,6 +2303,71 @@
       </w:r>
       <w:r>
         <w:t>: it keeps the brain's chemistry stable enough for reliable mood and cognition, yet the same selectivity is why delivering medicines to the brain, and explaining why a drug does or does not help, is so often a question of whether it can cross this gate.</w:t>
+      </w:r>
+    </w:p>
+    <w:p>
+      <w:pPr>
+        <w:jc w:val="center"/>
+      </w:pPr>
+      <w:r>
+        <w:drawing>
+          <wp:inline xmlns:a="http://schemas.openxmlformats.org/drawingml/2006/main" xmlns:pic="http://schemas.openxmlformats.org/drawingml/2006/picture">
+            <wp:extent cx="5029200" cy="5029200"/>
+            <wp:docPr id="3" name="Picture 3"/>
+            <wp:cNvGraphicFramePr>
+              <a:graphicFrameLocks noChangeAspect="1"/>
+            </wp:cNvGraphicFramePr>
+            <a:graphic>
+              <a:graphicData uri="http://schemas.openxmlformats.org/drawingml/2006/picture">
+                <pic:pic>
+                  <pic:nvPicPr>
+                    <pic:cNvPr id="0" name="bbb.png"/>
+                    <pic:cNvPicPr/>
+                  </pic:nvPicPr>
+                  <pic:blipFill>
+                    <a:blip r:embed="rId12"/>
+                    <a:stretch>
+                      <a:fillRect/>
+                    </a:stretch>
+                  </pic:blipFill>
+                  <pic:spPr>
+                    <a:xfrm>
+                      <a:off x="0" y="0"/>
+                      <a:ext cx="5029200" cy="5029200"/>
+                    </a:xfrm>
+                    <a:prstGeom prst="rect"/>
+                  </pic:spPr>
+                </pic:pic>
+              </a:graphicData>
+            </a:graphic>
+          </wp:inline>
+        </w:drawing>
+      </w:r>
+    </w:p>
+    <w:p>
+      <w:pPr>
+        <w:jc w:val="center"/>
+      </w:pPr>
+      <w:r>
+        <w:rPr>
+          <w:i/>
+          <w:color w:val="5A6A7E"/>
+          <w:sz w:val="18"/>
+        </w:rPr>
+        <w:t>Figure 3. The blood-brain barrier at a brain capillary — tightly joined endothelial cells wrapped by astrocyte end-feet form the selective gate described in the GUARD mnemonic.</w:t>
+      </w:r>
+    </w:p>
+    <w:p>
+      <w:pPr>
+        <w:jc w:val="center"/>
+      </w:pPr>
+      <w:r>
+        <w:rPr>
+          <w:i/>
+          <w:color w:val="5A6A7E"/>
+          <w:sz w:val="16"/>
+        </w:rPr>
+        <w:t>Source: Wikimedia Commons, “Blood-Brain Barrier (NIH BioArt 688)” by Ryan Kissinger, NIH / NIAID (NIH BioArt). License: Public domain.</w:t>
       </w:r>
     </w:p>
     <w:tbl>
@@ -3545,6 +3758,71 @@
     </w:p>
     <w:p>
       <w:pPr>
+        <w:jc w:val="center"/>
+      </w:pPr>
+      <w:r>
+        <w:drawing>
+          <wp:inline xmlns:a="http://schemas.openxmlformats.org/drawingml/2006/main" xmlns:pic="http://schemas.openxmlformats.org/drawingml/2006/picture">
+            <wp:extent cx="5029200" cy="4971574"/>
+            <wp:docPr id="4" name="Picture 4"/>
+            <wp:cNvGraphicFramePr>
+              <a:graphicFrameLocks noChangeAspect="1"/>
+            </wp:cNvGraphicFramePr>
+            <a:graphic>
+              <a:graphicData uri="http://schemas.openxmlformats.org/drawingml/2006/picture">
+                <pic:pic>
+                  <pic:nvPicPr>
+                    <pic:cNvPr id="0" name="action_potential.png"/>
+                    <pic:cNvPicPr/>
+                  </pic:nvPicPr>
+                  <pic:blipFill>
+                    <a:blip r:embed="rId13"/>
+                    <a:stretch>
+                      <a:fillRect/>
+                    </a:stretch>
+                  </pic:blipFill>
+                  <pic:spPr>
+                    <a:xfrm>
+                      <a:off x="0" y="0"/>
+                      <a:ext cx="5029200" cy="4971574"/>
+                    </a:xfrm>
+                    <a:prstGeom prst="rect"/>
+                  </pic:spPr>
+                </pic:pic>
+              </a:graphicData>
+            </a:graphic>
+          </wp:inline>
+        </w:drawing>
+      </w:r>
+    </w:p>
+    <w:p>
+      <w:pPr>
+        <w:jc w:val="center"/>
+      </w:pPr>
+      <w:r>
+        <w:rPr>
+          <w:i/>
+          <w:color w:val="5A6A7E"/>
+          <w:sz w:val="18"/>
+        </w:rPr>
+        <w:t>Figure 4. The action-potential graph of membrane voltage against time, showing the threshold, the depolarising upstroke, repolarisation and the hyperpolarisation undershoot before the cell returns to rest.</w:t>
+      </w:r>
+    </w:p>
+    <w:p>
+      <w:pPr>
+        <w:jc w:val="center"/>
+      </w:pPr>
+      <w:r>
+        <w:rPr>
+          <w:i/>
+          <w:color w:val="5A6A7E"/>
+          <w:sz w:val="16"/>
+        </w:rPr>
+        <w:t>Source: Wikimedia Commons, “Action potential” by Chris 73 / Diberri / tiZom. License: CC BY-SA 3.0.</w:t>
+      </w:r>
+    </w:p>
+    <w:p>
+      <w:pPr>
         <w:spacing w:after="80"/>
       </w:pPr>
       <w:r>
@@ -4433,6 +4711,71 @@
     </w:p>
     <w:p>
       <w:pPr>
+        <w:jc w:val="center"/>
+      </w:pPr>
+      <w:r>
+        <w:drawing>
+          <wp:inline xmlns:a="http://schemas.openxmlformats.org/drawingml/2006/main" xmlns:pic="http://schemas.openxmlformats.org/drawingml/2006/picture">
+            <wp:extent cx="5029200" cy="6268010"/>
+            <wp:docPr id="5" name="Picture 5"/>
+            <wp:cNvGraphicFramePr>
+              <a:graphicFrameLocks noChangeAspect="1"/>
+            </wp:cNvGraphicFramePr>
+            <a:graphic>
+              <a:graphicData uri="http://schemas.openxmlformats.org/drawingml/2006/picture">
+                <pic:pic>
+                  <pic:nvPicPr>
+                    <pic:cNvPr id="0" name="synapse.jpg"/>
+                    <pic:cNvPicPr/>
+                  </pic:nvPicPr>
+                  <pic:blipFill>
+                    <a:blip r:embed="rId14"/>
+                    <a:stretch>
+                      <a:fillRect/>
+                    </a:stretch>
+                  </pic:blipFill>
+                  <pic:spPr>
+                    <a:xfrm>
+                      <a:off x="0" y="0"/>
+                      <a:ext cx="5029200" cy="6268010"/>
+                    </a:xfrm>
+                    <a:prstGeom prst="rect"/>
+                  </pic:spPr>
+                </pic:pic>
+              </a:graphicData>
+            </a:graphic>
+          </wp:inline>
+        </w:drawing>
+      </w:r>
+    </w:p>
+    <w:p>
+      <w:pPr>
+        <w:jc w:val="center"/>
+      </w:pPr>
+      <w:r>
+        <w:rPr>
+          <w:i/>
+          <w:color w:val="5A6A7E"/>
+          <w:sz w:val="18"/>
+        </w:rPr>
+        <w:t>Figure 5. A chemical synapse, showing the presynaptic terminal with neurotransmitter-filled vesicles, the synaptic cleft and the receptors on the postsynaptic membrane — the sequence set out in the flowchart below.</w:t>
+      </w:r>
+    </w:p>
+    <w:p>
+      <w:pPr>
+        <w:jc w:val="center"/>
+      </w:pPr>
+      <w:r>
+        <w:rPr>
+          <w:i/>
+          <w:color w:val="5A6A7E"/>
+          <w:sz w:val="16"/>
+        </w:rPr>
+        <w:t>Source: Wikimedia Commons, “Chemical synapse schema (cropped)” by User:Looie496, illustrated by Christy Krames for the US NIH / National Institute on Aging. License: Public domain.</w:t>
+      </w:r>
+    </w:p>
+    <w:p>
+      <w:pPr>
         <w:spacing w:after="80"/>
       </w:pPr>
       <w:r>
@@ -5550,6 +5893,54 @@
       </w:pPr>
       <w:r>
         <w:t>StatPearls (NCBI Bookshelf), Treasure Island (FL): StatPearls Publishing — physiology articles on the resting membrane potential and the action potential, used to confirm standard ionic values and mechanisms.</w:t>
+      </w:r>
+    </w:p>
+    <w:p>
+      <w:pPr>
+        <w:pStyle w:val="Heading2"/>
+      </w:pPr>
+      <w:r>
+        <w:t>Figure image sources (online)</w:t>
+      </w:r>
+    </w:p>
+    <w:p>
+      <w:pPr>
+        <w:pStyle w:val="ListBullet"/>
+      </w:pPr>
+      <w:r>
+        <w:t>Figure 1 — Wikimedia Commons, “Complete neuron cell diagram” by LadyofHats (Mariana Ruiz Villarreal). License: Public domain. Via Wikimedia Commons.</w:t>
+      </w:r>
+    </w:p>
+    <w:p>
+      <w:pPr>
+        <w:pStyle w:val="ListBullet"/>
+      </w:pPr>
+      <w:r>
+        <w:t>Figure 2 — Wikimedia Commons, “Blausen 0870 Types of Neuroglia” by BruceBlaus / Blausen.com staff (2014). License: CC BY 3.0. Via Wikimedia Commons.</w:t>
+      </w:r>
+    </w:p>
+    <w:p>
+      <w:pPr>
+        <w:pStyle w:val="ListBullet"/>
+      </w:pPr>
+      <w:r>
+        <w:t>Figure 3 — Wikimedia Commons, “Blood-Brain Barrier (NIH BioArt 688)” by Ryan Kissinger, NIH / NIAID (NIH BioArt). License: Public domain. Via Wikimedia Commons.</w:t>
+      </w:r>
+    </w:p>
+    <w:p>
+      <w:pPr>
+        <w:pStyle w:val="ListBullet"/>
+      </w:pPr>
+      <w:r>
+        <w:t>Figure 4 — Wikimedia Commons, “Action potential” by Chris 73 / Diberri / tiZom. License: CC BY-SA 3.0. Via Wikimedia Commons.</w:t>
+      </w:r>
+    </w:p>
+    <w:p>
+      <w:pPr>
+        <w:pStyle w:val="ListBullet"/>
+      </w:pPr>
+      <w:r>
+        <w:t>Figure 5 — Wikimedia Commons, “Chemical synapse schema (cropped)” by User:Looie496, illustrated by Christy Krames for the US NIH / National Institute on Aging. License: Public domain. Via Wikimedia Commons.</w:t>
       </w:r>
     </w:p>
     <w:p>

</xml_diff>

<commit_message>
fix: name NIH BioArt as the precise source of the blood-brain-barrier figure
</commit_message>
<xml_diff>
--- a/Biological_Foundations_Unit2_Structure_and_Functions_of_Cells.docx
+++ b/Biological_Foundations_Unit2_Structure_and_Functions_of_Cells.docx
@@ -2367,7 +2367,7 @@
           <w:color w:val="5A6A7E"/>
           <w:sz w:val="16"/>
         </w:rPr>
-        <w:t>Source: Wikimedia Commons, “Blood-Brain Barrier (NIH BioArt 688)” by Ryan Kissinger, NIH / NIAID (NIH BioArt). License: Public domain.</w:t>
+        <w:t>Source: NIH BioArt (NIH / NIAID), “Blood-Brain Barrier (NIH BioArt 688)” (accessed via Wikimedia Commons) by Ryan Kissinger, NIH / NIAID (NIH BioArt). License: Public domain.</w:t>
       </w:r>
     </w:p>
     <w:tbl>
@@ -5924,7 +5924,7 @@
         <w:pStyle w:val="ListBullet"/>
       </w:pPr>
       <w:r>
-        <w:t>Figure 3 — Wikimedia Commons, “Blood-Brain Barrier (NIH BioArt 688)” by Ryan Kissinger, NIH / NIAID (NIH BioArt). License: Public domain. Via Wikimedia Commons.</w:t>
+        <w:t>Figure 3 — NIH BioArt (NIH / NIAID), “Blood-Brain Barrier (NIH BioArt 688)” (accessed via Wikimedia Commons) by Ryan Kissinger, NIH / NIAID (NIH BioArt). License: Public domain.</w:t>
       </w:r>
     </w:p>
     <w:p>

</xml_diff>

<commit_message>
feat: strengthen Unit II conceptualisation and clinical framing for M.Phil. readers
</commit_message>
<xml_diff>
--- a/Biological_Foundations_Unit2_Structure_and_Functions_of_Cells.docx
+++ b/Biological_Foundations_Unit2_Structure_and_Functions_of_Cells.docx
@@ -212,7 +212,7 @@
         <w:rPr>
           <w:i/>
         </w:rPr>
-        <w:t>Neurons are the signalling cells that receive, process and pass on information across the whole nervous system, and because every thought, feeling and behaviour ultimately rests on how these cells fire and connect, they are the natural starting point for a clinical psychologist studying the biology of behaviour.</w:t>
+        <w:t>Neurons are the signalling cells that receive, process and pass on information across the whole nervous system; the story of this topic runs from what a neuron is, through how its parts let it collect many inputs and send one decision, to why that single design underlies every thought, feeling and behaviour, which is exactly why a clinical psychologist begins the biology of behaviour here, where damage to these cells shows up as changes in how a person senses, moves, remembers and feels.</w:t>
       </w:r>
     </w:p>
     <w:p>
@@ -777,6 +777,92 @@
       </w:r>
       <w:r>
         <w:t>: dendrites gather signals, the soma and axon hillock weigh them up, and the axon delivers a single decision onward, so disruption at any one stage can reshape how a person senses, moves, thinks or feels.</w:t>
+      </w:r>
+    </w:p>
+    <w:p>
+      <w:pPr>
+        <w:pStyle w:val="ListNumber"/>
+      </w:pPr>
+      <w:r>
+        <w:t xml:space="preserve">A useful everyday analogy is that a neuron works like a </w:t>
+      </w:r>
+      <w:r>
+        <w:rPr>
+          <w:b/>
+          <w:color w:val="0F2744"/>
+        </w:rPr>
+        <w:t>tiny mail-sorting office</w:t>
+      </w:r>
+      <w:r>
+        <w:t xml:space="preserve">: the dendrites are the many in-trays receiving letters </w:t>
+      </w:r>
+      <w:r>
+        <w:rPr>
+          <w:i/>
+          <w:color w:val="6B4E00"/>
+          <w:shd w:val="clear" w:color="auto" w:fill="FFF3D6"/>
+        </w:rPr>
+        <w:t>(incoming signals from other neurons)</w:t>
+      </w:r>
+      <w:r>
+        <w:t>, the soma is the clerk who reads and combines them, the axon hillock is the desk where the decision to post is made, and the myelinated axon is the courier road carrying one sealed letter to its destination.</w:t>
+      </w:r>
+    </w:p>
+    <w:p>
+      <w:pPr>
+        <w:pStyle w:val="ListNumber"/>
+      </w:pPr>
+      <w:r>
+        <w:t xml:space="preserve">Because neurons rarely replace themselves, the brain protects skills by </w:t>
+      </w:r>
+      <w:r>
+        <w:rPr>
+          <w:b/>
+          <w:color w:val="0F2744"/>
+        </w:rPr>
+        <w:t>plasticity</w:t>
+      </w:r>
+      <w:r>
+        <w:t xml:space="preserve"> </w:t>
+      </w:r>
+      <w:r>
+        <w:rPr>
+          <w:i/>
+          <w:color w:val="6B4E00"/>
+          <w:shd w:val="clear" w:color="auto" w:fill="FFF3D6"/>
+        </w:rPr>
+        <w:t>(its ability to rewire existing connections and strengthen or weaken synapses with experience)</w:t>
+      </w:r>
+      <w:r>
+        <w:t>, and this capacity to reshape circuits is the biological foundation of learning, recovery after injury, and much of what psychological therapy and rehabilitation try to harness.</w:t>
+      </w:r>
+    </w:p>
+    <w:p>
+      <w:pPr>
+        <w:pStyle w:val="ListNumber"/>
+      </w:pPr>
+      <w:r>
+        <w:t xml:space="preserve">Clinically this cell-level view matters because many conditions a trainee will assess map onto specific neuronal failures: in </w:t>
+      </w:r>
+      <w:r>
+        <w:rPr>
+          <w:b/>
+          <w:color w:val="0F2744"/>
+        </w:rPr>
+        <w:t>Alzheimer's disease</w:t>
+      </w:r>
+      <w:r>
+        <w:t xml:space="preserve"> it is the slow death of neurons and their synapses that erodes memory, in </w:t>
+      </w:r>
+      <w:r>
+        <w:rPr>
+          <w:b/>
+          <w:color w:val="0F2744"/>
+        </w:rPr>
+        <w:t>Parkinson's disease</w:t>
+      </w:r>
+      <w:r>
+        <w:t xml:space="preserve"> it is the loss of one group of signalling neurons that disturbs movement, so the person's changing behaviour is a visible readout of what is happening to these cells.</w:t>
       </w:r>
     </w:p>
     <w:p>
@@ -1089,7 +1175,7 @@
         <w:rPr>
           <w:i/>
         </w:rPr>
-        <w:t>Glial cells are the support cells that feed, insulate, defend and hold the nervous system together, and far from being mere packing, they shape how well neurons signal, which is why glial dysfunction now sits at the centre of our understanding of demyelinating and neurodegenerative disorders a clinical psychologist will meet.</w:t>
+        <w:t>Glial cells are the support cells that feed, insulate, defend and hold the nervous system together; the arc here moves from seeing them as mere packing to understanding that they actively decide how well neurons signal, and that shift matters because glial failure, whether stripped insulation or inflamed defenders, now sits at the centre of demyelinating and neurodegenerative disorders a clinical psychologist will meet, where it shows up as slowed thinking, fatigue and mood change.</w:t>
       </w:r>
     </w:p>
     <w:p>
@@ -1579,6 +1665,53 @@
       </w:r>
       <w:r>
         <w:t>, since healthy astrocytes, intact myelin and well-regulated microglia are each needed for clear thinking, and their failure underlies conditions from multiple sclerosis to the neuroinflammation seen in dementia.</w:t>
+      </w:r>
+    </w:p>
+    <w:p>
+      <w:pPr>
+        <w:pStyle w:val="ListNumber"/>
+      </w:pPr>
+      <w:r>
+        <w:t xml:space="preserve">A simple way to picture the glial team is a </w:t>
+      </w:r>
+      <w:r>
+        <w:rPr>
+          <w:b/>
+          <w:color w:val="0F2744"/>
+        </w:rPr>
+        <w:t>pit crew around a racing car</w:t>
+      </w:r>
+      <w:r>
+        <w:t>: the astrocytes refuel and clean up, the oligodendrocytes and Schwann cells lay down the fast insulated track, the microglia act as the safety marshals clearing debris, and the radial glia earlier built the circuit itself, so the neuron (the car) only performs because the crew keeps its conditions right.</w:t>
+      </w:r>
+    </w:p>
+    <w:p>
+      <w:pPr>
+        <w:pStyle w:val="ListNumber"/>
+      </w:pPr>
+      <w:r>
+        <w:t xml:space="preserve">A fast-growing clinical thread is </w:t>
+      </w:r>
+      <w:r>
+        <w:rPr>
+          <w:b/>
+          <w:color w:val="0F2744"/>
+        </w:rPr>
+        <w:t>neuroinflammation</w:t>
+      </w:r>
+      <w:r>
+        <w:t xml:space="preserve"> </w:t>
+      </w:r>
+      <w:r>
+        <w:rPr>
+          <w:i/>
+          <w:color w:val="6B4E00"/>
+          <w:shd w:val="clear" w:color="auto" w:fill="FFF3D6"/>
+        </w:rPr>
+        <w:t>(a sustained, low-level immune reaction inside the brain driven mainly by over-activated microglia)</w:t>
+      </w:r>
+      <w:r>
+        <w:t>, which is increasingly linked not only to multiple sclerosis and dementia but also to the fatigue, poor concentration and low mood seen in depression, so the state of a patient's glia can shape the psychological symptoms a trainee observes.</w:t>
       </w:r>
     </w:p>
     <w:p>
@@ -1891,7 +2024,7 @@
         <w:rPr>
           <w:i/>
         </w:rPr>
-        <w:t>The blood-brain barrier is the selective gate that protects the brain while still letting essential nutrients pass, and understanding it explains one of the central puzzles of clinical neuroscience, namely why some psychiatric and neurological drugs reach the brain and work while others are turned away at the door.</w:t>
+        <w:t>The blood-brain barrier is the selective gate that protects the brain while still letting essential nutrients pass; the story runs from what the gate is built from, through how it chooses what to admit, to why that selectivity decides which psychiatric and neurological drugs can work, so for a clinical psychologist this one structure quietly explains both why the brain's chemistry stays stable enough for steady mood and thought and why delivering medicine to the brain is so often the hard part of treatment.</w:t>
       </w:r>
     </w:p>
     <w:p>
@@ -2303,6 +2436,74 @@
       </w:r>
       <w:r>
         <w:t>: it keeps the brain's chemistry stable enough for reliable mood and cognition, yet the same selectivity is why delivering medicines to the brain, and explaining why a drug does or does not help, is so often a question of whether it can cross this gate.</w:t>
+      </w:r>
+    </w:p>
+    <w:p>
+      <w:pPr>
+        <w:pStyle w:val="ListNumber"/>
+      </w:pPr>
+      <w:r>
+        <w:t xml:space="preserve">A helpful analogy is a </w:t>
+      </w:r>
+      <w:r>
+        <w:rPr>
+          <w:b/>
+          <w:color w:val="0F2744"/>
+        </w:rPr>
+        <w:t>high-security border checkpoint</w:t>
+      </w:r>
+      <w:r>
+        <w:t>: open lanes wave through trusted travellers like oxygen and carbon dioxide, special passport-controlled gates escort approved visitors like glucose and amino acids, and the barrier turns most strangers away, which is exactly the behaviour a drug designer has to plan around.</w:t>
+      </w:r>
+    </w:p>
+    <w:p>
+      <w:pPr>
+        <w:pStyle w:val="ListNumber"/>
+      </w:pPr>
+      <w:r>
+        <w:t xml:space="preserve">This directly shapes </w:t>
+      </w:r>
+      <w:r>
+        <w:rPr>
+          <w:b/>
+          <w:color w:val="0F2744"/>
+        </w:rPr>
+        <w:t>psychopharmacology</w:t>
+      </w:r>
+      <w:r>
+        <w:t xml:space="preserve"> </w:t>
+      </w:r>
+      <w:r>
+        <w:rPr>
+          <w:i/>
+          <w:color w:val="6B4E00"/>
+          <w:shd w:val="clear" w:color="auto" w:fill="FFF3D6"/>
+        </w:rPr>
+        <w:t>(the study of how drugs affect mind and behaviour)</w:t>
+      </w:r>
+      <w:r>
+        <w:t xml:space="preserve">, because a useful medicine must be fat-soluble enough to slip across the barrier to reach the brain, which is one reason many psychiatric drugs are designed to be </w:t>
+      </w:r>
+      <w:r>
+        <w:rPr>
+          <w:b/>
+          <w:color w:val="0F2744"/>
+        </w:rPr>
+        <w:t>lipophilic</w:t>
+      </w:r>
+      <w:r>
+        <w:t xml:space="preserve"> </w:t>
+      </w:r>
+      <w:r>
+        <w:rPr>
+          <w:i/>
+          <w:color w:val="6B4E00"/>
+          <w:shd w:val="clear" w:color="auto" w:fill="FFF3D6"/>
+        </w:rPr>
+        <w:t>(readily dissolving in fat)</w:t>
+      </w:r>
+      <w:r>
+        <w:t xml:space="preserve"> and why a drug that cannot cross, however promising in a test tube, simply cannot change a patient's thinking or mood.</w:t>
       </w:r>
     </w:p>
     <w:p>
@@ -2644,7 +2845,7 @@
         <w:rPr>
           <w:i/>
         </w:rPr>
-        <w:t>At rest a neuron holds a steady negative voltage inside, like a charged battery waiting to be used, and this baseline is worth mastering because psychoactive drugs, anaesthetics and ion imbalances all change behaviour by nudging this very voltage.</w:t>
+        <w:t>At rest a neuron holds a steady negative voltage inside, like a charged battery waiting to be used; the story moves from what this resting voltage is, through how ion gradients and pumps build and hold it, to why it is the launch pad for every signal, and it is worth mastering because psychoactive drugs, anaesthetics, mood stabilisers and ordinary salt (ion) imbalances all change behaviour by nudging this one baseline voltage up or down.</w:t>
       </w:r>
     </w:p>
     <w:p>
@@ -3043,273 +3244,35 @@
     </w:p>
     <w:p>
       <w:pPr>
-        <w:spacing w:after="80"/>
-      </w:pPr>
-      <w:r>
-        <w:rPr>
-          <w:b/>
-          <w:color w:val="5A6A7E"/>
-          <w:sz w:val="20"/>
-        </w:rPr>
-        <w:t>FLOWCHART · HOW THE RESTING POTENTIAL IS SET UP AND HELD</w:t>
+        <w:pStyle w:val="ListNumber"/>
+      </w:pPr>
+      <w:r>
+        <w:t xml:space="preserve">To make the idea concrete, think of the resting neuron as a </w:t>
+      </w:r>
+      <w:r>
+        <w:rPr>
+          <w:b/>
+          <w:color w:val="0F2744"/>
+        </w:rPr>
+        <w:t>charged phone battery kept plugged in</w:t>
+      </w:r>
+      <w:r>
+        <w:t>: the sodium-potassium pump is the charger constantly topping it up using energy, the stored voltage is ready to power a call (a nerve impulse) the instant it is needed, and if the charger fails the whole device becomes unreliable.</w:t>
       </w:r>
     </w:p>
     <w:p>
-      <w:r>
-        <w:rPr>
-          <w:b/>
-          <w:color w:val="1D5FA6"/>
-          <w:sz w:val="20"/>
-        </w:rPr>
-        <w:t>[ Na+ pumped out, K+ pumped in — Na/K pump ]</w:t>
-      </w:r>
-      <w:r>
-        <w:rPr>
-          <w:b/>
-          <w:color w:val="1D5FA6"/>
-        </w:rPr>
-        <w:t xml:space="preserve">  →  </w:t>
-      </w:r>
-      <w:r>
-        <w:rPr>
-          <w:b/>
-          <w:color w:val="1D5FA6"/>
-          <w:sz w:val="20"/>
-        </w:rPr>
-        <w:t>[ K+ leaks out through channels — membrane ]</w:t>
-      </w:r>
-      <w:r>
-        <w:rPr>
-          <w:b/>
-          <w:color w:val="1D5FA6"/>
-        </w:rPr>
-        <w:t xml:space="preserve">  →  </w:t>
-      </w:r>
-      <w:r>
-        <w:rPr>
-          <w:b/>
-          <w:color w:val="1D5FA6"/>
-          <w:sz w:val="20"/>
-        </w:rPr>
-        <w:t>[ Inside becomes negative — −70 mV ]</w:t>
-      </w:r>
-      <w:r>
-        <w:rPr>
-          <w:b/>
-          <w:color w:val="1D5FA6"/>
-        </w:rPr>
-        <w:t xml:space="preserve">  →  </w:t>
+      <w:pPr>
+        <w:pStyle w:val="ListNumber"/>
+      </w:pPr>
+      <w:r>
+        <w:t xml:space="preserve">This baseline is clinically important because the brain depends on a steady balance of salts, so a disturbed </w:t>
       </w:r>
       <w:r>
         <w:rPr>
           <w:b/>
           <w:color w:val="0F2744"/>
-          <w:sz w:val="20"/>
-        </w:rPr>
-        <w:t>[ Polarised cell ready to fire — stable baseline ]</w:t>
-      </w:r>
-    </w:p>
-    <w:p>
-      <w:pPr>
-        <w:spacing w:after="80"/>
-      </w:pPr>
-      <w:r>
-        <w:rPr>
-          <w:b/>
-          <w:color w:val="5A6A7E"/>
-          <w:sz w:val="20"/>
-        </w:rPr>
-        <w:t>MNEMONIC</w:t>
-      </w:r>
-    </w:p>
-    <w:p>
-      <w:r>
-        <w:rPr>
-          <w:b/>
-          <w:color w:val="0E7C6B"/>
-          <w:sz w:val="30"/>
-        </w:rPr>
-        <w:t>PRIME</w:t>
-      </w:r>
-    </w:p>
-    <w:p>
-      <w:r>
-        <w:rPr>
-          <w:i/>
-        </w:rPr>
-        <w:t>A resting neuron is PRIMEd and waiting.</w:t>
-      </w:r>
-    </w:p>
-    <w:p>
-      <w:pPr>
-        <w:pStyle w:val="ListBullet"/>
-      </w:pPr>
-      <w:r>
-        <w:rPr>
-          <w:b/>
-          <w:color w:val="0E7C6B"/>
-        </w:rPr>
-        <w:t xml:space="preserve">P: </w:t>
-      </w:r>
-      <w:r>
-        <w:rPr>
-          <w:b/>
-          <w:color w:val="0F2744"/>
-        </w:rPr>
-        <w:t>Polarised</w:t>
-      </w:r>
-      <w:r>
-        <w:t>, inside is negative at about −70 mV.</w:t>
-      </w:r>
-    </w:p>
-    <w:p>
-      <w:pPr>
-        <w:pStyle w:val="ListBullet"/>
-      </w:pPr>
-      <w:r>
-        <w:rPr>
-          <w:b/>
-          <w:color w:val="0E7C6B"/>
-        </w:rPr>
-        <w:t xml:space="preserve">R: </w:t>
-      </w:r>
-      <w:r>
-        <w:rPr>
-          <w:b/>
-          <w:color w:val="0F2744"/>
-        </w:rPr>
-        <w:t>Resting</w:t>
-      </w:r>
-      <w:r>
-        <w:t>, no signal is being sent.</w:t>
-      </w:r>
-    </w:p>
-    <w:p>
-      <w:pPr>
-        <w:pStyle w:val="ListBullet"/>
-      </w:pPr>
-      <w:r>
-        <w:rPr>
-          <w:b/>
-          <w:color w:val="0E7C6B"/>
-        </w:rPr>
-        <w:t xml:space="preserve">I: </w:t>
-      </w:r>
-      <w:r>
-        <w:rPr>
-          <w:b/>
-          <w:color w:val="0F2744"/>
-        </w:rPr>
-        <w:t>Ions</w:t>
-      </w:r>
-      <w:r>
-        <w:t xml:space="preserve"> sodium and potassium are unevenly spread.</w:t>
-      </w:r>
-    </w:p>
-    <w:p>
-      <w:pPr>
-        <w:pStyle w:val="ListBullet"/>
-      </w:pPr>
-      <w:r>
-        <w:rPr>
-          <w:b/>
-          <w:color w:val="0E7C6B"/>
-        </w:rPr>
-        <w:t xml:space="preserve">M: </w:t>
-      </w:r>
-      <w:r>
-        <w:rPr>
-          <w:b/>
-          <w:color w:val="0F2744"/>
-        </w:rPr>
-        <w:t>Maintained</w:t>
-      </w:r>
-      <w:r>
-        <w:t xml:space="preserve"> by the sodium-potassium pump using ATP.</w:t>
-      </w:r>
-    </w:p>
-    <w:p>
-      <w:pPr>
-        <w:pStyle w:val="ListBullet"/>
-      </w:pPr>
-      <w:r>
-        <w:rPr>
-          <w:b/>
-          <w:color w:val="0E7C6B"/>
-        </w:rPr>
-        <w:t xml:space="preserve">E: </w:t>
-      </w:r>
-      <w:r>
-        <w:rPr>
-          <w:b/>
-          <w:color w:val="0F2744"/>
-        </w:rPr>
-        <w:t>Excitable</w:t>
-      </w:r>
-      <w:r>
-        <w:t>, ready to fire once threshold (−55 mV) is reached.</w:t>
-      </w:r>
-    </w:p>
-    <w:p>
-      <w:r>
-        <w:br w:type="page"/>
-      </w:r>
-    </w:p>
-    <w:p>
-      <w:pPr>
-        <w:pStyle w:val="Heading1"/>
-      </w:pPr>
-      <w:r>
-        <w:rPr>
-          <w:color w:val="0F2744"/>
-        </w:rPr>
-        <w:t>5. Communication Within a Neuron — The Action Potential</w:t>
-      </w:r>
-    </w:p>
-    <w:p>
-      <w:r>
-        <w:rPr>
-          <w:i/>
-        </w:rPr>
-        <w:t>The action potential is the brief, all-or-none electrical spike that carries the nerve impulse along the axon, and following its exact sequence of ion movements shows a clinical psychologist precisely where local anaesthetics, toxins and some drugs act to switch signalling on or off.</w:t>
-      </w:r>
-    </w:p>
-    <w:p>
-      <w:pPr>
-        <w:spacing w:after="80"/>
-      </w:pPr>
-      <w:r>
-        <w:rPr>
-          <w:b/>
-          <w:color w:val="5A6A7E"/>
-          <w:sz w:val="20"/>
-        </w:rPr>
-        <w:t>KEY POINTS (EXAM-READY, ONE FULL SENTENCE EACH)</w:t>
-      </w:r>
-    </w:p>
-    <w:p>
-      <w:pPr>
-        <w:pStyle w:val="ListNumber"/>
-      </w:pPr>
-      <w:r>
-        <w:t xml:space="preserve">When the nervous system transmits information, a resting neuron produces an </w:t>
-      </w:r>
-      <w:r>
-        <w:rPr>
-          <w:b/>
-          <w:color w:val="0F2744"/>
-        </w:rPr>
-        <w:t>action potential</w:t>
-      </w:r>
-      <w:r>
-        <w:t xml:space="preserve">, a short-lived event in which the membrane voltage rapidly rises and then falls, also called the </w:t>
-      </w:r>
-      <w:r>
-        <w:rPr>
-          <w:b/>
-          <w:color w:val="0F2744"/>
-        </w:rPr>
-        <w:t>nerve impulse</w:t>
+        </w:rPr>
+        <w:t>electrolyte</w:t>
       </w:r>
       <w:r>
         <w:t xml:space="preserve"> </w:t>
@@ -3320,45 +3283,281 @@
           <w:color w:val="6B4E00"/>
           <w:shd w:val="clear" w:color="auto" w:fill="FFF3D6"/>
         </w:rPr>
-        <w:t>(the travelling electrical signal)</w:t>
-      </w:r>
-      <w:r>
-        <w:t>.</w:t>
+        <w:t>(the dissolved salts such as sodium and potassium that carry electrical charge in body fluids)</w:t>
+      </w:r>
+      <w:r>
+        <w:t xml:space="preserve"> level, as can happen with some medications or physical illness, shifts the resting potential and can present as confusion, agitation or altered consciousness that a clinician must not mistake for a purely psychological disturbance.</w:t>
       </w:r>
     </w:p>
     <w:p>
       <w:pPr>
+        <w:spacing w:after="80"/>
+      </w:pPr>
+      <w:r>
+        <w:rPr>
+          <w:b/>
+          <w:color w:val="5A6A7E"/>
+          <w:sz w:val="20"/>
+        </w:rPr>
+        <w:t>FLOWCHART · HOW THE RESTING POTENTIAL IS SET UP AND HELD</w:t>
+      </w:r>
+    </w:p>
+    <w:p>
+      <w:r>
+        <w:rPr>
+          <w:b/>
+          <w:color w:val="1D5FA6"/>
+          <w:sz w:val="20"/>
+        </w:rPr>
+        <w:t>[ Na+ pumped out, K+ pumped in — Na/K pump ]</w:t>
+      </w:r>
+      <w:r>
+        <w:rPr>
+          <w:b/>
+          <w:color w:val="1D5FA6"/>
+        </w:rPr>
+        <w:t xml:space="preserve">  →  </w:t>
+      </w:r>
+      <w:r>
+        <w:rPr>
+          <w:b/>
+          <w:color w:val="1D5FA6"/>
+          <w:sz w:val="20"/>
+        </w:rPr>
+        <w:t>[ K+ leaks out through channels — membrane ]</w:t>
+      </w:r>
+      <w:r>
+        <w:rPr>
+          <w:b/>
+          <w:color w:val="1D5FA6"/>
+        </w:rPr>
+        <w:t xml:space="preserve">  →  </w:t>
+      </w:r>
+      <w:r>
+        <w:rPr>
+          <w:b/>
+          <w:color w:val="1D5FA6"/>
+          <w:sz w:val="20"/>
+        </w:rPr>
+        <w:t>[ Inside becomes negative — −70 mV ]</w:t>
+      </w:r>
+      <w:r>
+        <w:rPr>
+          <w:b/>
+          <w:color w:val="1D5FA6"/>
+        </w:rPr>
+        <w:t xml:space="preserve">  →  </w:t>
+      </w:r>
+      <w:r>
+        <w:rPr>
+          <w:b/>
+          <w:color w:val="0F2744"/>
+          <w:sz w:val="20"/>
+        </w:rPr>
+        <w:t>[ Polarised cell ready to fire — stable baseline ]</w:t>
+      </w:r>
+    </w:p>
+    <w:p>
+      <w:pPr>
+        <w:spacing w:after="80"/>
+      </w:pPr>
+      <w:r>
+        <w:rPr>
+          <w:b/>
+          <w:color w:val="5A6A7E"/>
+          <w:sz w:val="20"/>
+        </w:rPr>
+        <w:t>MNEMONIC</w:t>
+      </w:r>
+    </w:p>
+    <w:p>
+      <w:r>
+        <w:rPr>
+          <w:b/>
+          <w:color w:val="0E7C6B"/>
+          <w:sz w:val="30"/>
+        </w:rPr>
+        <w:t>PRIME</w:t>
+      </w:r>
+    </w:p>
+    <w:p>
+      <w:r>
+        <w:rPr>
+          <w:i/>
+        </w:rPr>
+        <w:t>A resting neuron is PRIMEd and waiting.</w:t>
+      </w:r>
+    </w:p>
+    <w:p>
+      <w:pPr>
+        <w:pStyle w:val="ListBullet"/>
+      </w:pPr>
+      <w:r>
+        <w:rPr>
+          <w:b/>
+          <w:color w:val="0E7C6B"/>
+        </w:rPr>
+        <w:t xml:space="preserve">P: </w:t>
+      </w:r>
+      <w:r>
+        <w:rPr>
+          <w:b/>
+          <w:color w:val="0F2744"/>
+        </w:rPr>
+        <w:t>Polarised</w:t>
+      </w:r>
+      <w:r>
+        <w:t>, inside is negative at about −70 mV.</w:t>
+      </w:r>
+    </w:p>
+    <w:p>
+      <w:pPr>
+        <w:pStyle w:val="ListBullet"/>
+      </w:pPr>
+      <w:r>
+        <w:rPr>
+          <w:b/>
+          <w:color w:val="0E7C6B"/>
+        </w:rPr>
+        <w:t xml:space="preserve">R: </w:t>
+      </w:r>
+      <w:r>
+        <w:rPr>
+          <w:b/>
+          <w:color w:val="0F2744"/>
+        </w:rPr>
+        <w:t>Resting</w:t>
+      </w:r>
+      <w:r>
+        <w:t>, no signal is being sent.</w:t>
+      </w:r>
+    </w:p>
+    <w:p>
+      <w:pPr>
+        <w:pStyle w:val="ListBullet"/>
+      </w:pPr>
+      <w:r>
+        <w:rPr>
+          <w:b/>
+          <w:color w:val="0E7C6B"/>
+        </w:rPr>
+        <w:t xml:space="preserve">I: </w:t>
+      </w:r>
+      <w:r>
+        <w:rPr>
+          <w:b/>
+          <w:color w:val="0F2744"/>
+        </w:rPr>
+        <w:t>Ions</w:t>
+      </w:r>
+      <w:r>
+        <w:t xml:space="preserve"> sodium and potassium are unevenly spread.</w:t>
+      </w:r>
+    </w:p>
+    <w:p>
+      <w:pPr>
+        <w:pStyle w:val="ListBullet"/>
+      </w:pPr>
+      <w:r>
+        <w:rPr>
+          <w:b/>
+          <w:color w:val="0E7C6B"/>
+        </w:rPr>
+        <w:t xml:space="preserve">M: </w:t>
+      </w:r>
+      <w:r>
+        <w:rPr>
+          <w:b/>
+          <w:color w:val="0F2744"/>
+        </w:rPr>
+        <w:t>Maintained</w:t>
+      </w:r>
+      <w:r>
+        <w:t xml:space="preserve"> by the sodium-potassium pump using ATP.</w:t>
+      </w:r>
+    </w:p>
+    <w:p>
+      <w:pPr>
+        <w:pStyle w:val="ListBullet"/>
+      </w:pPr>
+      <w:r>
+        <w:rPr>
+          <w:b/>
+          <w:color w:val="0E7C6B"/>
+        </w:rPr>
+        <w:t xml:space="preserve">E: </w:t>
+      </w:r>
+      <w:r>
+        <w:rPr>
+          <w:b/>
+          <w:color w:val="0F2744"/>
+        </w:rPr>
+        <w:t>Excitable</w:t>
+      </w:r>
+      <w:r>
+        <w:t>, ready to fire once threshold (−55 mV) is reached.</w:t>
+      </w:r>
+    </w:p>
+    <w:p>
+      <w:r>
+        <w:br w:type="page"/>
+      </w:r>
+    </w:p>
+    <w:p>
+      <w:pPr>
+        <w:pStyle w:val="Heading1"/>
+      </w:pPr>
+      <w:r>
+        <w:rPr>
+          <w:color w:val="0F2744"/>
+        </w:rPr>
+        <w:t>5. Communication Within a Neuron — The Action Potential</w:t>
+      </w:r>
+    </w:p>
+    <w:p>
+      <w:r>
+        <w:rPr>
+          <w:i/>
+        </w:rPr>
+        <w:t>The action potential is the brief, all-or-none electrical spike that carries the nerve impulse along the axon; the story follows the voltage from rest, up through the sodium surge, down through the potassium recovery and back to baseline, and tracing that exact sequence shows a clinical psychologist precisely where local anaesthetics, anticonvulsants, toxins and some drugs step in to switch signalling on or off, which is why this spike is the physical event behind both normal communication and many treatments.</w:t>
+      </w:r>
+    </w:p>
+    <w:p>
+      <w:pPr>
+        <w:spacing w:after="80"/>
+      </w:pPr>
+      <w:r>
+        <w:rPr>
+          <w:b/>
+          <w:color w:val="5A6A7E"/>
+          <w:sz w:val="20"/>
+        </w:rPr>
+        <w:t>KEY POINTS (EXAM-READY, ONE FULL SENTENCE EACH)</w:t>
+      </w:r>
+    </w:p>
+    <w:p>
+      <w:pPr>
         <w:pStyle w:val="ListNumber"/>
       </w:pPr>
       <w:r>
-        <w:t xml:space="preserve">An action potential only fires once the voltage reaches the </w:t>
+        <w:t xml:space="preserve">When the nervous system transmits information, a resting neuron produces an </w:t>
       </w:r>
       <w:r>
         <w:rPr>
           <w:b/>
           <w:color w:val="0F2744"/>
         </w:rPr>
-        <w:t>threshold</w:t>
-      </w:r>
-      <w:r>
-        <w:t xml:space="preserve"> of about </w:t>
+        <w:t>action potential</w:t>
+      </w:r>
+      <w:r>
+        <w:t xml:space="preserve">, a short-lived event in which the membrane voltage rapidly rises and then falls, also called the </w:t>
       </w:r>
       <w:r>
         <w:rPr>
           <w:b/>
           <w:color w:val="0F2744"/>
         </w:rPr>
-        <w:t>−55 mV</w:t>
-      </w:r>
-      <w:r>
-        <w:t xml:space="preserve">, the tipping point; once this value is reached, the impulse is generated in a committed, </w:t>
-      </w:r>
-      <w:r>
-        <w:rPr>
-          <w:b/>
-          <w:color w:val="0F2744"/>
-        </w:rPr>
-        <w:t>all-or-none</w:t>
+        <w:t>nerve impulse</w:t>
       </w:r>
       <w:r>
         <w:t xml:space="preserve"> </w:t>
@@ -3369,10 +3568,10 @@
           <w:color w:val="6B4E00"/>
           <w:shd w:val="clear" w:color="auto" w:fill="FFF3D6"/>
         </w:rPr>
-        <w:t>(either a full signal fires or none at all, like a trigger that is pulled or not)</w:t>
-      </w:r>
-      <w:r>
-        <w:t xml:space="preserve"> way.</w:t>
+        <w:t>(the travelling electrical signal)</w:t>
+      </w:r>
+      <w:r>
+        <w:t>.</w:t>
       </w:r>
     </w:p>
     <w:p>
@@ -3380,11 +3579,34 @@
         <w:pStyle w:val="ListNumber"/>
       </w:pPr>
       <w:r>
+        <w:t xml:space="preserve">An action potential only fires once the voltage reaches the </w:t>
+      </w:r>
+      <w:r>
         <w:rPr>
           <w:b/>
           <w:color w:val="0F2744"/>
         </w:rPr>
-        <w:t>Depolarisation</w:t>
+        <w:t>threshold</w:t>
+      </w:r>
+      <w:r>
+        <w:t xml:space="preserve"> of about </w:t>
+      </w:r>
+      <w:r>
+        <w:rPr>
+          <w:b/>
+          <w:color w:val="0F2744"/>
+        </w:rPr>
+        <w:t>−55 mV</w:t>
+      </w:r>
+      <w:r>
+        <w:t xml:space="preserve">, the tipping point; once this value is reached, the impulse is generated in a committed, </w:t>
+      </w:r>
+      <w:r>
+        <w:rPr>
+          <w:b/>
+          <w:color w:val="0F2744"/>
+        </w:rPr>
+        <w:t>all-or-none</w:t>
       </w:r>
       <w:r>
         <w:t xml:space="preserve"> </w:t>
@@ -3395,20 +3617,10 @@
           <w:color w:val="6B4E00"/>
           <w:shd w:val="clear" w:color="auto" w:fill="FFF3D6"/>
         </w:rPr>
-        <w:t>(the inside becoming less negative)</w:t>
-      </w:r>
-      <w:r>
-        <w:t xml:space="preserve"> begins when a stimulus, for example at a touch receptor, opens </w:t>
-      </w:r>
-      <w:r>
-        <w:rPr>
-          <w:b/>
-          <w:color w:val="0F2744"/>
-        </w:rPr>
-        <w:t>sodium (Na+) channels</w:t>
-      </w:r>
-      <w:r>
-        <w:t xml:space="preserve"> and positive ions rush into the negatively charged neuron.</w:t>
+        <w:t>(either a full signal fires or none at all, like a trigger that is pulled or not)</w:t>
+      </w:r>
+      <w:r>
+        <w:t xml:space="preserve"> way.</w:t>
       </w:r>
     </w:p>
     <w:p>
@@ -3416,50 +3628,11 @@
         <w:pStyle w:val="ListNumber"/>
       </w:pPr>
       <w:r>
-        <w:t xml:space="preserve">As </w:t>
-      </w:r>
-      <w:r>
         <w:rPr>
           <w:b/>
           <w:color w:val="0F2744"/>
         </w:rPr>
-        <w:t>sodium floods in</w:t>
-      </w:r>
-      <w:r>
-        <w:t>, the inside of the neuron becomes positive and the membrane potential climbs steeply, which is the sharp upstroke seen on a recording of the action potential.</w:t>
-      </w:r>
-    </w:p>
-    <w:p>
-      <w:pPr>
-        <w:pStyle w:val="ListNumber"/>
-      </w:pPr>
-      <w:r>
-        <w:t xml:space="preserve">Next, </w:t>
-      </w:r>
-      <w:r>
-        <w:rPr>
-          <w:b/>
-          <w:color w:val="0F2744"/>
-        </w:rPr>
-        <w:t>potassium (K+) channels</w:t>
-      </w:r>
-      <w:r>
-        <w:t xml:space="preserve"> open and potassium ions move out of the cell, a flow that reverses the rising charge and begins to bring the membrane voltage back down.</w:t>
-      </w:r>
-    </w:p>
-    <w:p>
-      <w:pPr>
-        <w:pStyle w:val="ListNumber"/>
-      </w:pPr>
-      <w:r>
-        <w:t xml:space="preserve">The brief peak created as sodium enters and then potassium leaves is called the </w:t>
-      </w:r>
-      <w:r>
-        <w:rPr>
-          <w:b/>
-          <w:color w:val="0F2744"/>
-        </w:rPr>
-        <w:t>spike potential</w:t>
+        <w:t>Depolarisation</w:t>
       </w:r>
       <w:r>
         <w:t xml:space="preserve"> </w:t>
@@ -3470,10 +3643,20 @@
           <w:color w:val="6B4E00"/>
           <w:shd w:val="clear" w:color="auto" w:fill="FFF3D6"/>
         </w:rPr>
-        <w:t>(the tall, narrow burst of voltage)</w:t>
-      </w:r>
-      <w:r>
-        <w:t>, the characteristic shape of a single nerve impulse.</w:t>
+        <w:t>(the inside becoming less negative)</w:t>
+      </w:r>
+      <w:r>
+        <w:t xml:space="preserve"> begins when a stimulus, for example at a touch receptor, opens </w:t>
+      </w:r>
+      <w:r>
+        <w:rPr>
+          <w:b/>
+          <w:color w:val="0F2744"/>
+        </w:rPr>
+        <w:t>sodium (Na+) channels</w:t>
+      </w:r>
+      <w:r>
+        <w:t xml:space="preserve"> and positive ions rush into the negatively charged neuron.</w:t>
       </w:r>
     </w:p>
     <w:p>
@@ -3481,11 +3664,50 @@
         <w:pStyle w:val="ListNumber"/>
       </w:pPr>
       <w:r>
+        <w:t xml:space="preserve">As </w:t>
+      </w:r>
+      <w:r>
         <w:rPr>
           <w:b/>
           <w:color w:val="0F2744"/>
         </w:rPr>
-        <w:t>Repolarisation</w:t>
+        <w:t>sodium floods in</w:t>
+      </w:r>
+      <w:r>
+        <w:t>, the inside of the neuron becomes positive and the membrane potential climbs steeply, which is the sharp upstroke seen on a recording of the action potential.</w:t>
+      </w:r>
+    </w:p>
+    <w:p>
+      <w:pPr>
+        <w:pStyle w:val="ListNumber"/>
+      </w:pPr>
+      <w:r>
+        <w:t xml:space="preserve">Next, </w:t>
+      </w:r>
+      <w:r>
+        <w:rPr>
+          <w:b/>
+          <w:color w:val="0F2744"/>
+        </w:rPr>
+        <w:t>potassium (K+) channels</w:t>
+      </w:r>
+      <w:r>
+        <w:t xml:space="preserve"> open and potassium ions move out of the cell, a flow that reverses the rising charge and begins to bring the membrane voltage back down.</w:t>
+      </w:r>
+    </w:p>
+    <w:p>
+      <w:pPr>
+        <w:pStyle w:val="ListNumber"/>
+      </w:pPr>
+      <w:r>
+        <w:t xml:space="preserve">The brief peak created as sodium enters and then potassium leaves is called the </w:t>
+      </w:r>
+      <w:r>
+        <w:rPr>
+          <w:b/>
+          <w:color w:val="0F2744"/>
+        </w:rPr>
+        <w:t>spike potential</w:t>
       </w:r>
       <w:r>
         <w:t xml:space="preserve"> </w:t>
@@ -3496,10 +3718,10 @@
           <w:color w:val="6B4E00"/>
           <w:shd w:val="clear" w:color="auto" w:fill="FFF3D6"/>
         </w:rPr>
-        <w:t>(returning toward the negative resting value)</w:t>
-      </w:r>
-      <w:r>
-        <w:t xml:space="preserve"> happens as sodium channels close back to their resting state, driving the membrane potential back toward about −70 mV.</w:t>
+        <w:t>(the tall, narrow burst of voltage)</w:t>
+      </w:r>
+      <w:r>
+        <w:t>, the characteristic shape of a single nerve impulse.</w:t>
       </w:r>
     </w:p>
     <w:p>
@@ -3507,24 +3729,11 @@
         <w:pStyle w:val="ListNumber"/>
       </w:pPr>
       <w:r>
-        <w:t xml:space="preserve">Because the potassium channels stay open slightly too long, the voltage briefly overshoots past −70 mV to nearly </w:t>
-      </w:r>
-      <w:r>
         <w:rPr>
           <w:b/>
           <w:color w:val="0F2744"/>
         </w:rPr>
-        <w:t>−80 mV</w:t>
-      </w:r>
-      <w:r>
-        <w:t xml:space="preserve">, a dip called </w:t>
-      </w:r>
-      <w:r>
-        <w:rPr>
-          <w:b/>
-          <w:color w:val="0F2744"/>
-        </w:rPr>
-        <w:t>hyperpolarisation</w:t>
+        <w:t>Repolarisation</w:t>
       </w:r>
       <w:r>
         <w:t xml:space="preserve"> </w:t>
@@ -3535,10 +3744,10 @@
           <w:color w:val="6B4E00"/>
           <w:shd w:val="clear" w:color="auto" w:fill="FFF3D6"/>
         </w:rPr>
-        <w:t>(more negative than the normal resting level)</w:t>
-      </w:r>
-      <w:r>
-        <w:t>.</w:t>
+        <w:t>(returning toward the negative resting value)</w:t>
+      </w:r>
+      <w:r>
+        <w:t xml:space="preserve"> happens as sodium channels close back to their resting state, driving the membrane potential back toward about −70 mV.</w:t>
       </w:r>
     </w:p>
     <w:p>
@@ -3546,32 +3755,24 @@
         <w:pStyle w:val="ListNumber"/>
       </w:pPr>
       <w:r>
-        <w:t xml:space="preserve">Ion concentrations are then restored and the cell settles back to its </w:t>
+        <w:t xml:space="preserve">Because the potassium channels stay open slightly too long, the voltage briefly overshoots past −70 mV to nearly </w:t>
       </w:r>
       <w:r>
         <w:rPr>
           <w:b/>
           <w:color w:val="0F2744"/>
         </w:rPr>
-        <w:t>−70 mV</w:t>
-      </w:r>
-      <w:r>
-        <w:t xml:space="preserve"> resting membrane potential, ready to respond again once a new stimulus arrives.</w:t>
-      </w:r>
-    </w:p>
-    <w:p>
-      <w:pPr>
-        <w:pStyle w:val="ListNumber"/>
-      </w:pPr>
-      <w:r>
-        <w:t xml:space="preserve">Immediately after firing there is an </w:t>
+        <w:t>−80 mV</w:t>
+      </w:r>
+      <w:r>
+        <w:t xml:space="preserve">, a dip called </w:t>
       </w:r>
       <w:r>
         <w:rPr>
           <w:b/>
           <w:color w:val="0F2744"/>
         </w:rPr>
-        <w:t>absolute refractory period</w:t>
+        <w:t>hyperpolarisation</w:t>
       </w:r>
       <w:r>
         <w:t xml:space="preserve"> </w:t>
@@ -3582,10 +3783,10 @@
           <w:color w:val="6B4E00"/>
           <w:shd w:val="clear" w:color="auto" w:fill="FFF3D6"/>
         </w:rPr>
-        <w:t>(a short time when no new impulse is possible)</w:t>
-      </w:r>
-      <w:r>
-        <w:t>, during which the neuron cannot generate another action potential no matter how strong the stimulus.</w:t>
+        <w:t>(more negative than the normal resting level)</w:t>
+      </w:r>
+      <w:r>
+        <w:t>.</w:t>
       </w:r>
     </w:p>
     <w:p>
@@ -3593,27 +3794,17 @@
         <w:pStyle w:val="ListNumber"/>
       </w:pPr>
       <w:r>
-        <w:t xml:space="preserve">This is followed by a </w:t>
+        <w:t xml:space="preserve">Ion concentrations are then restored and the cell settles back to its </w:t>
       </w:r>
       <w:r>
         <w:rPr>
           <w:b/>
           <w:color w:val="0F2744"/>
         </w:rPr>
-        <w:t>relative refractory period</w:t>
-      </w:r>
-      <w:r>
-        <w:t xml:space="preserve"> during which a new action potential can occur, but only if the stimulus is </w:t>
-      </w:r>
-      <w:r>
-        <w:rPr>
-          <w:b/>
-          <w:color w:val="0F2744"/>
-        </w:rPr>
-        <w:t>stronger than usual</w:t>
-      </w:r>
-      <w:r>
-        <w:t xml:space="preserve"> to overcome the lingering hyperpolarisation.</w:t>
+        <w:t>−70 mV</w:t>
+      </w:r>
+      <w:r>
+        <w:t xml:space="preserve"> resting membrane potential, ready to respond again once a new stimulus arrives.</w:t>
       </w:r>
     </w:p>
     <w:p>
@@ -3621,14 +3812,14 @@
         <w:pStyle w:val="ListNumber"/>
       </w:pPr>
       <w:r>
-        <w:t xml:space="preserve">In myelinated axons the impulse jumps between </w:t>
+        <w:t xml:space="preserve">Immediately after firing there is an </w:t>
       </w:r>
       <w:r>
         <w:rPr>
           <w:b/>
           <w:color w:val="0F2744"/>
         </w:rPr>
-        <w:t>nodes of Ranvier</w:t>
+        <w:t>absolute refractory period</w:t>
       </w:r>
       <w:r>
         <w:t xml:space="preserve"> </w:t>
@@ -3639,10 +3830,10 @@
           <w:color w:val="6B4E00"/>
           <w:shd w:val="clear" w:color="auto" w:fill="FFF3D6"/>
         </w:rPr>
-        <w:t>(bare gaps in the insulation)</w:t>
-      </w:r>
-      <w:r>
-        <w:t>, a leaping conduction that makes signalling much faster than in unmyelinated fibres.</w:t>
+        <w:t>(a short time when no new impulse is possible)</w:t>
+      </w:r>
+      <w:r>
+        <w:t>, during which the neuron cannot generate another action potential no matter how strong the stimulus.</w:t>
       </w:r>
     </w:p>
     <w:p>
@@ -3650,17 +3841,27 @@
         <w:pStyle w:val="ListNumber"/>
       </w:pPr>
       <w:r>
-        <w:t xml:space="preserve">The action potential is essentially </w:t>
+        <w:t xml:space="preserve">This is followed by a </w:t>
       </w:r>
       <w:r>
         <w:rPr>
           <w:b/>
           <w:color w:val="0F2744"/>
         </w:rPr>
-        <w:t>self-regenerating</w:t>
-      </w:r>
-      <w:r>
-        <w:t>, being recharged at each node as it travels, so the signal keeps its full strength over long distances along the axon.</w:t>
+        <w:t>relative refractory period</w:t>
+      </w:r>
+      <w:r>
+        <w:t xml:space="preserve"> during which a new action potential can occur, but only if the stimulus is </w:t>
+      </w:r>
+      <w:r>
+        <w:rPr>
+          <w:b/>
+          <w:color w:val="0F2744"/>
+        </w:rPr>
+        <w:t>stronger than usual</w:t>
+      </w:r>
+      <w:r>
+        <w:t xml:space="preserve"> to overcome the lingering hyperpolarisation.</w:t>
       </w:r>
     </w:p>
     <w:p>
@@ -3668,50 +3869,14 @@
         <w:pStyle w:val="ListNumber"/>
       </w:pPr>
       <w:r>
-        <w:t xml:space="preserve">Because of the all-or-none rule, information is coded not by the size of each spike but by the </w:t>
+        <w:t xml:space="preserve">In myelinated axons the impulse jumps between </w:t>
       </w:r>
       <w:r>
         <w:rPr>
           <w:b/>
           <w:color w:val="0F2744"/>
         </w:rPr>
-        <w:t>frequency</w:t>
-      </w:r>
-      <w:r>
-        <w:t xml:space="preserve"> of impulses, so a stronger stimulus produces more action potentials per second rather than bigger ones.</w:t>
-      </w:r>
-    </w:p>
-    <w:p>
-      <w:pPr>
-        <w:pStyle w:val="ListNumber"/>
-      </w:pPr>
-      <w:r>
-        <w:t xml:space="preserve">The refractory periods also ensure the impulse travels in </w:t>
-      </w:r>
-      <w:r>
-        <w:rPr>
-          <w:b/>
-          <w:color w:val="0F2744"/>
-        </w:rPr>
-        <w:t>one direction</w:t>
-      </w:r>
-      <w:r>
-        <w:t xml:space="preserve"> only, from the cell body toward the axon terminal, preventing the signal from running backward along the fibre.</w:t>
-      </w:r>
-    </w:p>
-    <w:p>
-      <w:pPr>
-        <w:pStyle w:val="ListNumber"/>
-      </w:pPr>
-      <w:r>
-        <w:t xml:space="preserve">Clinically, anything that disturbs sodium or potassium channels, such as </w:t>
-      </w:r>
-      <w:r>
-        <w:rPr>
-          <w:b/>
-          <w:color w:val="0F2744"/>
-        </w:rPr>
-        <w:t>local anaesthetics</w:t>
+        <w:t>nodes of Ranvier</w:t>
       </w:r>
       <w:r>
         <w:t xml:space="preserve"> </w:t>
@@ -3722,20 +3887,10 @@
           <w:color w:val="6B4E00"/>
           <w:shd w:val="clear" w:color="auto" w:fill="FFF3D6"/>
         </w:rPr>
-        <w:t>(numbing drugs that block pain signals)</w:t>
-      </w:r>
-      <w:r>
-        <w:t xml:space="preserve"> or certain toxins, can </w:t>
-      </w:r>
-      <w:r>
-        <w:rPr>
-          <w:b/>
-          <w:color w:val="0F2744"/>
-        </w:rPr>
-        <w:t>block the action potential</w:t>
-      </w:r>
-      <w:r>
-        <w:t>, which is how nerve conduction and sensation can be switched off for medical purposes.</w:t>
+        <w:t>(bare gaps in the insulation)</w:t>
+      </w:r>
+      <w:r>
+        <w:t>, a leaping conduction that makes signalling much faster than in unmyelinated fibres.</w:t>
       </w:r>
     </w:p>
     <w:p>
@@ -3743,6 +3898,99 @@
         <w:pStyle w:val="ListNumber"/>
       </w:pPr>
       <w:r>
+        <w:t xml:space="preserve">The action potential is essentially </w:t>
+      </w:r>
+      <w:r>
+        <w:rPr>
+          <w:b/>
+          <w:color w:val="0F2744"/>
+        </w:rPr>
+        <w:t>self-regenerating</w:t>
+      </w:r>
+      <w:r>
+        <w:t>, being recharged at each node as it travels, so the signal keeps its full strength over long distances along the axon.</w:t>
+      </w:r>
+    </w:p>
+    <w:p>
+      <w:pPr>
+        <w:pStyle w:val="ListNumber"/>
+      </w:pPr>
+      <w:r>
+        <w:t xml:space="preserve">Because of the all-or-none rule, information is coded not by the size of each spike but by the </w:t>
+      </w:r>
+      <w:r>
+        <w:rPr>
+          <w:b/>
+          <w:color w:val="0F2744"/>
+        </w:rPr>
+        <w:t>frequency</w:t>
+      </w:r>
+      <w:r>
+        <w:t xml:space="preserve"> of impulses, so a stronger stimulus produces more action potentials per second rather than bigger ones.</w:t>
+      </w:r>
+    </w:p>
+    <w:p>
+      <w:pPr>
+        <w:pStyle w:val="ListNumber"/>
+      </w:pPr>
+      <w:r>
+        <w:t xml:space="preserve">The refractory periods also ensure the impulse travels in </w:t>
+      </w:r>
+      <w:r>
+        <w:rPr>
+          <w:b/>
+          <w:color w:val="0F2744"/>
+        </w:rPr>
+        <w:t>one direction</w:t>
+      </w:r>
+      <w:r>
+        <w:t xml:space="preserve"> only, from the cell body toward the axon terminal, preventing the signal from running backward along the fibre.</w:t>
+      </w:r>
+    </w:p>
+    <w:p>
+      <w:pPr>
+        <w:pStyle w:val="ListNumber"/>
+      </w:pPr>
+      <w:r>
+        <w:t xml:space="preserve">Clinically, anything that disturbs sodium or potassium channels, such as </w:t>
+      </w:r>
+      <w:r>
+        <w:rPr>
+          <w:b/>
+          <w:color w:val="0F2744"/>
+        </w:rPr>
+        <w:t>local anaesthetics</w:t>
+      </w:r>
+      <w:r>
+        <w:t xml:space="preserve"> </w:t>
+      </w:r>
+      <w:r>
+        <w:rPr>
+          <w:i/>
+          <w:color w:val="6B4E00"/>
+          <w:shd w:val="clear" w:color="auto" w:fill="FFF3D6"/>
+        </w:rPr>
+        <w:t>(numbing drugs that block pain signals)</w:t>
+      </w:r>
+      <w:r>
+        <w:t xml:space="preserve"> or certain toxins, can </w:t>
+      </w:r>
+      <w:r>
+        <w:rPr>
+          <w:b/>
+          <w:color w:val="0F2744"/>
+        </w:rPr>
+        <w:t>block the action potential</w:t>
+      </w:r>
+      <w:r>
+        <w:t>, which is how nerve conduction and sensation can be switched off for medical purposes.</w:t>
+      </w:r>
+    </w:p>
+    <w:p>
+      <w:pPr>
+        <w:pStyle w:val="ListNumber"/>
+      </w:pPr>
+      <w:r>
         <w:t xml:space="preserve">This same logic explains everyday clinical facts: an anaesthetic injected near a nerve stops its sodium channels so the signal never reaches the brain and no pain is felt, which makes the action potential not just a textbook spike but the exact event therapy can </w:t>
       </w:r>
       <w:r>
@@ -3754,6 +4002,53 @@
       </w:r>
       <w:r>
         <w:t>.</w:t>
+      </w:r>
+    </w:p>
+    <w:p>
+      <w:pPr>
+        <w:pStyle w:val="ListNumber"/>
+      </w:pPr>
+      <w:r>
+        <w:t xml:space="preserve">An intuitive analogy is a </w:t>
+      </w:r>
+      <w:r>
+        <w:rPr>
+          <w:b/>
+          <w:color w:val="0F2744"/>
+        </w:rPr>
+        <w:t>row of falling dominoes</w:t>
+      </w:r>
+      <w:r>
+        <w:t>: nothing happens until the first domino is pushed past its tipping point (threshold), but once it falls the whole line goes down at full size regardless of how hard you pushed (all-or-none), and each domino briefly cannot be knocked again until it is stood back up (the refractory period), which is why the impulse travels steadily in one direction.</w:t>
+      </w:r>
+    </w:p>
+    <w:p>
+      <w:pPr>
+        <w:pStyle w:val="ListNumber"/>
+      </w:pPr>
+      <w:r>
+        <w:t xml:space="preserve">This mechanism carries a direct psychiatric and neurological thread, because </w:t>
+      </w:r>
+      <w:r>
+        <w:rPr>
+          <w:b/>
+          <w:color w:val="0F2744"/>
+        </w:rPr>
+        <w:t>anticonvulsant medicines</w:t>
+      </w:r>
+      <w:r>
+        <w:t xml:space="preserve"> </w:t>
+      </w:r>
+      <w:r>
+        <w:rPr>
+          <w:i/>
+          <w:color w:val="6B4E00"/>
+          <w:shd w:val="clear" w:color="auto" w:fill="FFF3D6"/>
+        </w:rPr>
+        <w:t>(drugs used to prevent epileptic seizures, several of which are also used as mood stabilisers)</w:t>
+      </w:r>
+      <w:r>
+        <w:t xml:space="preserve"> calm over-firing circuits by damping the sodium channels that drive the spike, so the very same ion movements explained here are what these treatments deliberately restrain to control seizures and stabilise mood.</w:t>
       </w:r>
     </w:p>
     <w:p>
@@ -4059,7 +4354,7 @@
         <w:rPr>
           <w:i/>
         </w:rPr>
-        <w:t>At the synapse, chemical messengers carry the signal from one neuron across a tiny gap to the next, and because almost every psychiatric medication works here, the synapse is the single most important meeting point between the biology of behaviour and clinical practice.</w:t>
+        <w:t>At the synapse, chemical messengers carry the signal from one neuron across a tiny gap to the next; the story runs from what the synapse is, through how calcium triggers release and receptors read the message, to why each transmitter is tied to particular moods, movements and disorders, and because almost every psychiatric medication acts at exactly this junction, the synapse is the single most important meeting point between the biology of behaviour and everyday clinical practice.</w:t>
       </w:r>
     </w:p>
     <w:p>
@@ -4707,6 +5002,72 @@
       </w:r>
       <w:r>
         <w:t>: by changing how much transmitter is released, how long it lingers, or which receptors it reaches, antidepressants, antipsychotics and anti-anxiety agents all exert their effects exactly here, which is why mastering synaptic transmission underpins understanding psychopharmacology.</w:t>
+      </w:r>
+    </w:p>
+    <w:p>
+      <w:pPr>
+        <w:pStyle w:val="ListNumber"/>
+      </w:pPr>
+      <w:r>
+        <w:t xml:space="preserve">A clear way to picture the synapse is a </w:t>
+      </w:r>
+      <w:r>
+        <w:rPr>
+          <w:b/>
+          <w:color w:val="0F2744"/>
+        </w:rPr>
+        <w:t>staffed relay point at a river crossing</w:t>
+      </w:r>
+      <w:r>
+        <w:t>: the presynaptic neuron is a boatman who loads passengers (neurotransmitter) into boats (vesicles), calcium is the signal to cast off, the passengers row across the narrow cleft, and they are only allowed ashore if they fit the specific docks (receptors) waiting on the far postsynaptic bank, after which the boats are called back (reuptake) for the next trip.</w:t>
+      </w:r>
+    </w:p>
+    <w:p>
+      <w:pPr>
+        <w:pStyle w:val="ListNumber"/>
+      </w:pPr>
+      <w:r>
+        <w:t xml:space="preserve">Pulling the transmitters together gives a clinical map a trainee can reason from: too little </w:t>
+      </w:r>
+      <w:r>
+        <w:rPr>
+          <w:b/>
+          <w:color w:val="0F2744"/>
+        </w:rPr>
+        <w:t>dopamine</w:t>
+      </w:r>
+      <w:r>
+        <w:t xml:space="preserve"> in one pathway produces the tremor of Parkinson's disease while too much is linked to the hallucinations of </w:t>
+      </w:r>
+      <w:r>
+        <w:rPr>
+          <w:b/>
+          <w:color w:val="0F2744"/>
+        </w:rPr>
+        <w:t>schizophrenia</w:t>
+      </w:r>
+      <w:r>
+        <w:t xml:space="preserve">, low </w:t>
+      </w:r>
+      <w:r>
+        <w:rPr>
+          <w:b/>
+          <w:color w:val="0F2744"/>
+        </w:rPr>
+        <w:t>serotonin</w:t>
+      </w:r>
+      <w:r>
+        <w:t xml:space="preserve"> and noradrenaline activity is tied to depression and anxiety, and faltering </w:t>
+      </w:r>
+      <w:r>
+        <w:rPr>
+          <w:b/>
+          <w:color w:val="0F2744"/>
+        </w:rPr>
+        <w:t>acetylcholine</w:t>
+      </w:r>
+      <w:r>
+        <w:t xml:space="preserve"> tracks the memory loss of Alzheimer's disease, so naming the transmitter often points toward both the disorder and the class of medication used to treat it.</w:t>
       </w:r>
     </w:p>
     <w:p>
@@ -5078,7 +5439,7 @@
         <w:rPr>
           <w:i/>
         </w:rPr>
-        <w:t>Beyond fast synapses, neuromodulators and hormones tune behaviour more slowly and over wider reaches of the body, and this broader, slower chemistry is what links the nervous and endocrine systems to lasting states such as stress, mood, sleep and arousal that are central to clinical work.</w:t>
+        <w:t>Beyond fast synapses, neuromodulators and hormones tune behaviour more slowly and over wider reaches of the body; the story widens from the millisecond signalling of a single synapse, through neuromodulators that set the mood of whole circuits, to hormones that act over minutes to days across the entire body, and this broader, slower chemistry is what links the nervous and endocrine systems to the lasting states of stress, mood, sleep and arousal that sit at the heart of clinical work.</w:t>
       </w:r>
     </w:p>
     <w:p>
@@ -5606,6 +5967,63 @@
       </w:r>
       <w:r>
         <w:t>: neurotransmitters act in milliseconds at a single synapse, neuromodulators shade the mood of whole circuits, and hormones act over minutes to days across the body, so disorders of stress, sleep, appetite and sexual function often trace back to this slower chemistry rather than to one fast synapse.</w:t>
+      </w:r>
+    </w:p>
+    <w:p>
+      <w:pPr>
+        <w:pStyle w:val="ListNumber"/>
+      </w:pPr>
+      <w:r>
+        <w:t xml:space="preserve">A useful analogy is the difference between a </w:t>
+      </w:r>
+      <w:r>
+        <w:rPr>
+          <w:b/>
+          <w:color w:val="0F2744"/>
+        </w:rPr>
+        <w:t>phone call and a public broadcast</w:t>
+      </w:r>
+      <w:r>
+        <w:t>: a neurotransmitter is a private call to one listener at one synapse, a neuromodulator is like soft background music that changes the mood of a whole room, and a hormone is a national radio announcement carried in the blood that reaches every organ at once.</w:t>
+      </w:r>
+    </w:p>
+    <w:p>
+      <w:pPr>
+        <w:pStyle w:val="ListNumber"/>
+      </w:pPr>
+      <w:r>
+        <w:t xml:space="preserve">A central clinical thread here is the </w:t>
+      </w:r>
+      <w:r>
+        <w:rPr>
+          <w:b/>
+          <w:color w:val="0F2744"/>
+        </w:rPr>
+        <w:t>stress response</w:t>
+      </w:r>
+      <w:r>
+        <w:t xml:space="preserve">, where a brain pathway from the hypothalamus through the pituitary to the adrenal glands, often called the </w:t>
+      </w:r>
+      <w:r>
+        <w:rPr>
+          <w:b/>
+          <w:color w:val="0F2744"/>
+        </w:rPr>
+        <w:t>HPA axis</w:t>
+      </w:r>
+      <w:r>
+        <w:t xml:space="preserve"> </w:t>
+      </w:r>
+      <w:r>
+        <w:rPr>
+          <w:i/>
+          <w:color w:val="6B4E00"/>
+          <w:shd w:val="clear" w:color="auto" w:fill="FFF3D6"/>
+        </w:rPr>
+        <w:t>(the hypothalamic-pituitary-adrenal system that releases the stress hormone cortisol)</w:t>
+      </w:r>
+      <w:r>
+        <w:t>, drives fight-or-flight, and because this system stays switched on in chronic stress, anxiety and depression, understanding it helps a trainee link a patient's lasting tension, disturbed sleep and low mood back to this slow hormonal machinery.</w:t>
       </w:r>
     </w:p>
     <w:p>

</xml_diff>

<commit_message>
feat: add resting-potential and HPA-axis diagrams to Unit II notes
</commit_message>
<xml_diff>
--- a/Biological_Foundations_Unit2_Structure_and_Functions_of_Cells.docx
+++ b/Biological_Foundations_Unit2_Structure_and_Functions_of_Cells.docx
@@ -3291,6 +3291,71 @@
     </w:p>
     <w:p>
       <w:pPr>
+        <w:jc w:val="center"/>
+      </w:pPr>
+      <w:r>
+        <w:drawing>
+          <wp:inline xmlns:a="http://schemas.openxmlformats.org/drawingml/2006/main" xmlns:pic="http://schemas.openxmlformats.org/drawingml/2006/picture">
+            <wp:extent cx="5029200" cy="2257901"/>
+            <wp:docPr id="4" name="Picture 4"/>
+            <wp:cNvGraphicFramePr>
+              <a:graphicFrameLocks noChangeAspect="1"/>
+            </wp:cNvGraphicFramePr>
+            <a:graphic>
+              <a:graphicData uri="http://schemas.openxmlformats.org/drawingml/2006/picture">
+                <pic:pic>
+                  <pic:nvPicPr>
+                    <pic:cNvPr id="0" name="nak_pump.png"/>
+                    <pic:cNvPicPr/>
+                  </pic:nvPicPr>
+                  <pic:blipFill>
+                    <a:blip r:embed="rId13"/>
+                    <a:stretch>
+                      <a:fillRect/>
+                    </a:stretch>
+                  </pic:blipFill>
+                  <pic:spPr>
+                    <a:xfrm>
+                      <a:off x="0" y="0"/>
+                      <a:ext cx="5029200" cy="2257901"/>
+                    </a:xfrm>
+                    <a:prstGeom prst="rect"/>
+                  </pic:spPr>
+                </pic:pic>
+              </a:graphicData>
+            </a:graphic>
+          </wp:inline>
+        </w:drawing>
+      </w:r>
+    </w:p>
+    <w:p>
+      <w:pPr>
+        <w:jc w:val="center"/>
+      </w:pPr>
+      <w:r>
+        <w:rPr>
+          <w:i/>
+          <w:color w:val="5A6A7E"/>
+          <w:sz w:val="18"/>
+        </w:rPr>
+        <w:t>Figure 6. The sodium-potassium pump driving three sodium ions out and two potassium ions in for each ATP it spends — the active, energy-using mechanism that maintains the −70 mV resting potential in the PRIME mnemonic and the flowchart below.</w:t>
+      </w:r>
+    </w:p>
+    <w:p>
+      <w:pPr>
+        <w:jc w:val="center"/>
+      </w:pPr>
+      <w:r>
+        <w:rPr>
+          <w:i/>
+          <w:color w:val="5A6A7E"/>
+          <w:sz w:val="16"/>
+        </w:rPr>
+        <w:t>Source: Wikimedia Commons, “Scheme sodium-potassium pump-en” by LadyofHats (Mariana Ruiz Villarreal). License: Public domain.</w:t>
+      </w:r>
+    </w:p>
+    <w:p>
+      <w:pPr>
         <w:spacing w:after="80"/>
       </w:pPr>
       <w:r>
@@ -4059,7 +4124,7 @@
         <w:drawing>
           <wp:inline xmlns:a="http://schemas.openxmlformats.org/drawingml/2006/main" xmlns:pic="http://schemas.openxmlformats.org/drawingml/2006/picture">
             <wp:extent cx="5029200" cy="4971574"/>
-            <wp:docPr id="4" name="Picture 4"/>
+            <wp:docPr id="5" name="Picture 5"/>
             <wp:cNvGraphicFramePr>
               <a:graphicFrameLocks noChangeAspect="1"/>
             </wp:cNvGraphicFramePr>
@@ -4071,7 +4136,7 @@
                     <pic:cNvPicPr/>
                   </pic:nvPicPr>
                   <pic:blipFill>
-                    <a:blip r:embed="rId13"/>
+                    <a:blip r:embed="rId14"/>
                     <a:stretch>
                       <a:fillRect/>
                     </a:stretch>
@@ -5078,7 +5143,7 @@
         <w:drawing>
           <wp:inline xmlns:a="http://schemas.openxmlformats.org/drawingml/2006/main" xmlns:pic="http://schemas.openxmlformats.org/drawingml/2006/picture">
             <wp:extent cx="5029200" cy="6268010"/>
-            <wp:docPr id="5" name="Picture 5"/>
+            <wp:docPr id="6" name="Picture 6"/>
             <wp:cNvGraphicFramePr>
               <a:graphicFrameLocks noChangeAspect="1"/>
             </wp:cNvGraphicFramePr>
@@ -5090,7 +5155,7 @@
                     <pic:cNvPicPr/>
                   </pic:nvPicPr>
                   <pic:blipFill>
-                    <a:blip r:embed="rId14"/>
+                    <a:blip r:embed="rId15"/>
                     <a:stretch>
                       <a:fillRect/>
                     </a:stretch>
@@ -6028,6 +6093,71 @@
     </w:p>
     <w:p>
       <w:pPr>
+        <w:jc w:val="center"/>
+      </w:pPr>
+      <w:r>
+        <w:drawing>
+          <wp:inline xmlns:a="http://schemas.openxmlformats.org/drawingml/2006/main" xmlns:pic="http://schemas.openxmlformats.org/drawingml/2006/picture">
+            <wp:extent cx="5029200" cy="4615339"/>
+            <wp:docPr id="7" name="Picture 7"/>
+            <wp:cNvGraphicFramePr>
+              <a:graphicFrameLocks noChangeAspect="1"/>
+            </wp:cNvGraphicFramePr>
+            <a:graphic>
+              <a:graphicData uri="http://schemas.openxmlformats.org/drawingml/2006/picture">
+                <pic:pic>
+                  <pic:nvPicPr>
+                    <pic:cNvPr id="0" name="hpa_axis.png"/>
+                    <pic:cNvPicPr/>
+                  </pic:nvPicPr>
+                  <pic:blipFill>
+                    <a:blip r:embed="rId16"/>
+                    <a:stretch>
+                      <a:fillRect/>
+                    </a:stretch>
+                  </pic:blipFill>
+                  <pic:spPr>
+                    <a:xfrm>
+                      <a:off x="0" y="0"/>
+                      <a:ext cx="5029200" cy="4615339"/>
+                    </a:xfrm>
+                    <a:prstGeom prst="rect"/>
+                  </pic:spPr>
+                </pic:pic>
+              </a:graphicData>
+            </a:graphic>
+          </wp:inline>
+        </w:drawing>
+      </w:r>
+    </w:p>
+    <w:p>
+      <w:pPr>
+        <w:jc w:val="center"/>
+      </w:pPr>
+      <w:r>
+        <w:rPr>
+          <w:i/>
+          <w:color w:val="5A6A7E"/>
+          <w:sz w:val="18"/>
+        </w:rPr>
+        <w:t>Figure 7. The hypothalamic-pituitary-adrenal (HPA) axis — the hypothalamus signals the pituitary, which signals the adrenal cortex to release cortisol, and cortisol feeds back to shut the axis off; this is the slow stress-hormone machinery behind the clinical stress thread in the points above.</w:t>
+      </w:r>
+    </w:p>
+    <w:p>
+      <w:pPr>
+        <w:jc w:val="center"/>
+      </w:pPr>
+      <w:r>
+        <w:rPr>
+          <w:i/>
+          <w:color w:val="5A6A7E"/>
+          <w:sz w:val="16"/>
+        </w:rPr>
+        <w:t>Source: Wikimedia Commons, “HPA Axis Diagram (Brian M Sweis 2012)” by ShelleyAdams. License: CC BY-SA 3.0.</w:t>
+      </w:r>
+    </w:p>
+    <w:p>
+      <w:pPr>
         <w:spacing w:after="80"/>
       </w:pPr>
       <w:r>
@@ -6350,7 +6480,7 @@
         <w:pStyle w:val="ListBullet"/>
       </w:pPr>
       <w:r>
-        <w:t>Figure 4 — Wikimedia Commons, “Action potential” by Chris 73 / Diberri / tiZom. License: CC BY-SA 3.0. Via Wikimedia Commons.</w:t>
+        <w:t>Figure 6 — Wikimedia Commons, “Scheme sodium-potassium pump-en” by LadyofHats (Mariana Ruiz Villarreal). License: Public domain. Via Wikimedia Commons.</w:t>
       </w:r>
     </w:p>
     <w:p>
@@ -6358,7 +6488,23 @@
         <w:pStyle w:val="ListBullet"/>
       </w:pPr>
       <w:r>
+        <w:t>Figure 4 — Wikimedia Commons, “Action potential” by Chris 73 / Diberri / tiZom. License: CC BY-SA 3.0. Via Wikimedia Commons.</w:t>
+      </w:r>
+    </w:p>
+    <w:p>
+      <w:pPr>
+        <w:pStyle w:val="ListBullet"/>
+      </w:pPr>
+      <w:r>
         <w:t>Figure 5 — Wikimedia Commons, “Chemical synapse schema (cropped)” by User:Looie496, illustrated by Christy Krames for the US NIH / National Institute on Aging. License: Public domain. Via Wikimedia Commons.</w:t>
+      </w:r>
+    </w:p>
+    <w:p>
+      <w:pPr>
+        <w:pStyle w:val="ListBullet"/>
+      </w:pPr>
+      <w:r>
+        <w:t>Figure 7 — Wikimedia Commons, “HPA Axis Diagram (Brian M Sweis 2012)” by ShelleyAdams. License: CC BY-SA 3.0. Via Wikimedia Commons.</w:t>
       </w:r>
     </w:p>
     <w:p>

</xml_diff>